<commit_message>
more updates on 7.20 to fix overflow triggers and format birthdate on Word template
</commit_message>
<xml_diff>
--- a/docassemble/RFApackage/data/templates/RFAcomplaint_addendum.docx
+++ b/docassemble/RFApackage/data/templates/RFAcomplaint_addendum.docx
@@ -211,8 +211,18 @@
           <w:sz w:val="28"/>
           <w:szCs w:val="28"/>
         </w:rPr>
-        <w:t>[0] }}</w:t>
-      </w:r>
+        <w:t>[0</w:t>
+      </w:r>
+      <w:proofErr w:type="gramStart"/>
+      <w:r>
+        <w:rPr>
+          <w:rFonts w:ascii="Arial" w:hAnsi="Arial" w:cs="Arial"/>
+          <w:sz w:val="28"/>
+          <w:szCs w:val="28"/>
+        </w:rPr>
+        <w:t>] }}</w:t>
+      </w:r>
+      <w:proofErr w:type="gramEnd"/>
     </w:p>
     <w:p>
       <w:pPr>
@@ -466,11 +476,11 @@
       </w:tblPr>
       <w:tblGrid>
         <w:gridCol w:w="1795"/>
-        <w:gridCol w:w="900"/>
         <w:gridCol w:w="1260"/>
-        <w:gridCol w:w="1710"/>
-        <w:gridCol w:w="1710"/>
-        <w:gridCol w:w="1985"/>
+        <w:gridCol w:w="1260"/>
+        <w:gridCol w:w="1800"/>
+        <w:gridCol w:w="1890"/>
+        <w:gridCol w:w="1355"/>
       </w:tblGrid>
       <w:tr>
         <w:tc>
@@ -500,7 +510,7 @@
         </w:tc>
         <w:tc>
           <w:tcPr>
-            <w:tcW w:w="900" w:type="dxa"/>
+            <w:tcW w:w="1260" w:type="dxa"/>
           </w:tcPr>
           <w:p>
             <w:pPr>
@@ -550,7 +560,7 @@
         </w:tc>
         <w:tc>
           <w:tcPr>
-            <w:tcW w:w="1710" w:type="dxa"/>
+            <w:tcW w:w="1800" w:type="dxa"/>
           </w:tcPr>
           <w:p>
             <w:pPr>
@@ -575,7 +585,7 @@
         </w:tc>
         <w:tc>
           <w:tcPr>
-            <w:tcW w:w="1710" w:type="dxa"/>
+            <w:tcW w:w="1890" w:type="dxa"/>
           </w:tcPr>
           <w:p>
             <w:pPr>
@@ -600,7 +610,7 @@
         </w:tc>
         <w:tc>
           <w:tcPr>
-            <w:tcW w:w="1985" w:type="dxa"/>
+            <w:tcW w:w="1355" w:type="dxa"/>
           </w:tcPr>
           <w:p>
             <w:pPr>
@@ -619,7 +629,43 @@
                 <w:sz w:val="20"/>
                 <w:szCs w:val="20"/>
               </w:rPr>
-              <w:t>Plaintiff/petitioner wants custody?</w:t>
+              <w:t>Plaintiff</w:t>
+            </w:r>
+            <w:r>
+              <w:rPr>
+                <w:rFonts w:ascii="Arial" w:eastAsia="Calibri" w:hAnsi="Arial" w:cs="Arial"/>
+                <w:b/>
+                <w:sz w:val="20"/>
+                <w:szCs w:val="20"/>
+              </w:rPr>
+              <w:t xml:space="preserve"> </w:t>
+            </w:r>
+            <w:r>
+              <w:rPr>
+                <w:rFonts w:ascii="Arial" w:eastAsia="Calibri" w:hAnsi="Arial" w:cs="Arial"/>
+                <w:b/>
+                <w:sz w:val="20"/>
+                <w:szCs w:val="20"/>
+              </w:rPr>
+              <w:t>/</w:t>
+            </w:r>
+            <w:r>
+              <w:rPr>
+                <w:rFonts w:ascii="Arial" w:eastAsia="Calibri" w:hAnsi="Arial" w:cs="Arial"/>
+                <w:b/>
+                <w:sz w:val="20"/>
+                <w:szCs w:val="20"/>
+              </w:rPr>
+              <w:t xml:space="preserve"> </w:t>
+            </w:r>
+            <w:r>
+              <w:rPr>
+                <w:rFonts w:ascii="Arial" w:eastAsia="Calibri" w:hAnsi="Arial" w:cs="Arial"/>
+                <w:b/>
+                <w:sz w:val="20"/>
+                <w:szCs w:val="20"/>
+              </w:rPr>
+              <w:t>petitioner wants custody?</w:t>
             </w:r>
           </w:p>
         </w:tc>
@@ -667,7 +713,7 @@
         </w:tc>
         <w:tc>
           <w:tcPr>
-            <w:tcW w:w="900" w:type="dxa"/>
+            <w:tcW w:w="1260" w:type="dxa"/>
           </w:tcPr>
           <w:p>
             <w:pPr>
@@ -697,7 +743,7 @@
         </w:tc>
         <w:tc>
           <w:tcPr>
-            <w:tcW w:w="1710" w:type="dxa"/>
+            <w:tcW w:w="1800" w:type="dxa"/>
           </w:tcPr>
           <w:p>
             <w:pPr>
@@ -712,7 +758,7 @@
         </w:tc>
         <w:tc>
           <w:tcPr>
-            <w:tcW w:w="1710" w:type="dxa"/>
+            <w:tcW w:w="1890" w:type="dxa"/>
           </w:tcPr>
           <w:p>
             <w:pPr>
@@ -727,7 +773,7 @@
         </w:tc>
         <w:tc>
           <w:tcPr>
-            <w:tcW w:w="1985" w:type="dxa"/>
+            <w:tcW w:w="1355" w:type="dxa"/>
           </w:tcPr>
           <w:p>
             <w:pPr>
@@ -766,12 +812,155 @@
         </w:tc>
         <w:tc>
           <w:tcPr>
-            <w:tcW w:w="900" w:type="dxa"/>
+            <w:tcW w:w="1260" w:type="dxa"/>
           </w:tcPr>
           <w:p>
             <w:pPr>
               <w:widowControl w:val="0"/>
               <w:rPr>
+                <w:rFonts w:ascii="Arial" w:eastAsia="Calibri" w:hAnsi="Arial" w:cs="Arial"/>
+                <w:sz w:val="20"/>
+                <w:szCs w:val="20"/>
+              </w:rPr>
+            </w:pPr>
+            <w:r>
+              <w:rPr>
+                <w:rFonts w:ascii="Arial" w:eastAsia="Calibri" w:hAnsi="Arial" w:cs="Arial"/>
+                <w:sz w:val="20"/>
+                <w:szCs w:val="20"/>
+              </w:rPr>
+              <w:t>{{</w:t>
+            </w:r>
+            <w:proofErr w:type="spellStart"/>
+            <w:r>
+              <w:rPr>
+                <w:rFonts w:ascii="Arial" w:eastAsia="Calibri" w:hAnsi="Arial" w:cs="Arial"/>
+                <w:sz w:val="20"/>
+                <w:szCs w:val="20"/>
+              </w:rPr>
+              <w:t>row.birthdat</w:t>
+            </w:r>
+            <w:r>
+              <w:rPr>
+                <w:rFonts w:ascii="Arial" w:eastAsia="Calibri" w:hAnsi="Arial" w:cs="Arial"/>
+                <w:sz w:val="20"/>
+                <w:szCs w:val="20"/>
+              </w:rPr>
+              <w:t>e</w:t>
+            </w:r>
+            <w:proofErr w:type="spellEnd"/>
+            <w:r>
+              <w:rPr>
+                <w:rFonts w:ascii="Arial" w:eastAsia="Calibri" w:hAnsi="Arial" w:cs="Arial"/>
+                <w:sz w:val="20"/>
+                <w:szCs w:val="20"/>
+              </w:rPr>
+              <w:t>.</w:t>
+            </w:r>
+            <w:r>
+              <w:rPr>
+                <w:rFonts w:ascii="inherit" w:eastAsia="Times New Roman" w:hAnsi="inherit" w:cs="Courier New"/>
+                <w:color w:val="0C0D0E"/>
+                <w:sz w:val="20"/>
+                <w:szCs w:val="20"/>
+                <w:bdr w:val="none" w:sz="0" w:space="0" w:color="auto" w:frame="1"/>
+              </w:rPr>
+              <w:t xml:space="preserve"> </w:t>
+            </w:r>
+            <w:proofErr w:type="spellStart"/>
+            <w:r>
+              <w:rPr>
+                <w:rFonts w:ascii="Arial" w:eastAsia="Calibri" w:hAnsi="Arial" w:cs="Arial"/>
+                <w:sz w:val="20"/>
+                <w:szCs w:val="20"/>
+              </w:rPr>
+              <w:t>strftime</w:t>
+            </w:r>
+            <w:proofErr w:type="spellEnd"/>
+            <w:r>
+              <w:rPr>
+                <w:rFonts w:ascii="Arial" w:eastAsia="Calibri" w:hAnsi="Arial" w:cs="Arial"/>
+                <w:sz w:val="20"/>
+                <w:szCs w:val="20"/>
+              </w:rPr>
+              <w:t>('%</w:t>
+            </w:r>
+            <w:r>
+              <w:rPr>
+                <w:rFonts w:ascii="Arial" w:eastAsia="Calibri" w:hAnsi="Arial" w:cs="Arial"/>
+                <w:sz w:val="20"/>
+                <w:szCs w:val="20"/>
+              </w:rPr>
+              <w:t>m/</w:t>
+            </w:r>
+            <w:r>
+              <w:rPr>
+                <w:rFonts w:ascii="Arial" w:eastAsia="Calibri" w:hAnsi="Arial" w:cs="Arial"/>
+                <w:sz w:val="20"/>
+                <w:szCs w:val="20"/>
+              </w:rPr>
+              <w:t>%d</w:t>
+            </w:r>
+            <w:r>
+              <w:rPr>
+                <w:rFonts w:ascii="Arial" w:eastAsia="Calibri" w:hAnsi="Arial" w:cs="Arial"/>
+                <w:sz w:val="20"/>
+                <w:szCs w:val="20"/>
+              </w:rPr>
+              <w:t>/</w:t>
+            </w:r>
+            <w:r>
+              <w:rPr>
+                <w:rFonts w:ascii="Arial" w:eastAsia="Calibri" w:hAnsi="Arial" w:cs="Arial"/>
+                <w:sz w:val="20"/>
+                <w:szCs w:val="20"/>
+              </w:rPr>
+              <w:t>%</w:t>
+            </w:r>
+            <w:r>
+              <w:rPr>
+                <w:rFonts w:ascii="Arial" w:eastAsia="Calibri" w:hAnsi="Arial" w:cs="Arial"/>
+                <w:sz w:val="20"/>
+                <w:szCs w:val="20"/>
+              </w:rPr>
+              <w:t>Y</w:t>
+            </w:r>
+            <w:r>
+              <w:rPr>
+                <w:rFonts w:ascii="Arial" w:eastAsia="Calibri" w:hAnsi="Arial" w:cs="Arial"/>
+                <w:sz w:val="20"/>
+                <w:szCs w:val="20"/>
+              </w:rPr>
+              <w:t>')</w:t>
+            </w:r>
+          </w:p>
+          <w:p>
+            <w:pPr>
+              <w:widowControl w:val="0"/>
+              <w:rPr>
+                <w:rFonts w:ascii="Arial" w:hAnsi="Arial" w:cs="Arial"/>
+                <w:sz w:val="20"/>
+                <w:szCs w:val="20"/>
+              </w:rPr>
+            </w:pPr>
+            <w:r>
+              <w:rPr>
+                <w:rFonts w:ascii="Arial" w:eastAsia="Calibri" w:hAnsi="Arial" w:cs="Arial"/>
+                <w:sz w:val="20"/>
+                <w:szCs w:val="20"/>
+              </w:rPr>
+              <w:t>}}</w:t>
+            </w:r>
+          </w:p>
+        </w:tc>
+        <w:tc>
+          <w:tcPr>
+            <w:tcW w:w="1260" w:type="dxa"/>
+          </w:tcPr>
+          <w:p>
+            <w:pPr>
+              <w:widowControl w:val="0"/>
+              <w:rPr>
                 <w:rFonts w:ascii="Arial" w:hAnsi="Arial" w:cs="Arial"/>
                 <w:sz w:val="20"/>
                 <w:szCs w:val="20"/>
@@ -785,6 +974,14 @@
               </w:rPr>
               <w:t xml:space="preserve">{{ </w:t>
             </w:r>
+            <w:r>
+              <w:rPr>
+                <w:rFonts w:ascii="Arial" w:eastAsia="Calibri" w:hAnsi="Arial" w:cs="Arial"/>
+                <w:sz w:val="20"/>
+                <w:szCs w:val="20"/>
+              </w:rPr>
+              <w:t xml:space="preserve">“Yes” if </w:t>
+            </w:r>
             <w:proofErr w:type="spellStart"/>
             <w:r>
               <w:rPr>
@@ -792,7 +989,7 @@
                 <w:sz w:val="20"/>
                 <w:szCs w:val="20"/>
               </w:rPr>
-              <w:t>row.birthdate</w:t>
+              <w:t>row.in_danger</w:t>
             </w:r>
             <w:proofErr w:type="spellEnd"/>
             <w:r>
@@ -801,13 +998,29 @@
                 <w:sz w:val="20"/>
                 <w:szCs w:val="20"/>
               </w:rPr>
-              <w:t xml:space="preserve"> }}</w:t>
-            </w:r>
-          </w:p>
-        </w:tc>
-        <w:tc>
-          <w:tcPr>
-            <w:tcW w:w="1260" w:type="dxa"/>
+              <w:t xml:space="preserve"> </w:t>
+            </w:r>
+            <w:r>
+              <w:rPr>
+                <w:rFonts w:ascii="Arial" w:eastAsia="Calibri" w:hAnsi="Arial" w:cs="Arial"/>
+                <w:sz w:val="20"/>
+                <w:szCs w:val="20"/>
+              </w:rPr>
+              <w:t>else “No”</w:t>
+            </w:r>
+            <w:r>
+              <w:rPr>
+                <w:rFonts w:ascii="Arial" w:eastAsia="Calibri" w:hAnsi="Arial" w:cs="Arial"/>
+                <w:sz w:val="20"/>
+                <w:szCs w:val="20"/>
+              </w:rPr>
+              <w:t>}}</w:t>
+            </w:r>
+          </w:p>
+        </w:tc>
+        <w:tc>
+          <w:tcPr>
+            <w:tcW w:w="1800" w:type="dxa"/>
           </w:tcPr>
           <w:p>
             <w:pPr>
@@ -820,33 +1033,96 @@
             </w:pPr>
             <w:r>
               <w:rPr>
-                <w:rFonts w:ascii="Arial" w:eastAsia="Calibri" w:hAnsi="Arial" w:cs="Arial"/>
+                <w:rFonts w:ascii="Arial" w:hAnsi="Arial" w:cs="Arial"/>
+                <w:sz w:val="20"/>
+                <w:szCs w:val="20"/>
+              </w:rPr>
+              <w:t>{{ row.relationship_user</w:t>
+            </w:r>
+            <w:r>
+              <w:rPr>
+                <w:rFonts w:ascii="Arial" w:hAnsi="Arial" w:cs="Arial"/>
+                <w:sz w:val="20"/>
+                <w:szCs w:val="20"/>
+              </w:rPr>
+              <w:t>s</w:t>
+            </w:r>
+            <w:r>
+              <w:rPr>
+                <w:rFonts w:ascii="Arial" w:hAnsi="Arial" w:cs="Arial"/>
+                <w:sz w:val="20"/>
+                <w:szCs w:val="20"/>
+              </w:rPr>
+              <w:t>1</w:t>
+            </w:r>
+            <w:r>
+              <w:rPr>
+                <w:rFonts w:ascii="Arial" w:hAnsi="Arial" w:cs="Arial"/>
+                <w:sz w:val="20"/>
+                <w:szCs w:val="20"/>
+              </w:rPr>
+              <w:t xml:space="preserve"> </w:t>
+            </w:r>
+            <w:r>
+              <w:rPr>
+                <w:rFonts w:ascii="Arial" w:hAnsi="Arial" w:cs="Arial"/>
+                <w:sz w:val="20"/>
+                <w:szCs w:val="20"/>
+              </w:rPr>
+              <w:t>| capitalize</w:t>
+            </w:r>
+            <w:r>
+              <w:rPr>
+                <w:rFonts w:ascii="Arial" w:hAnsi="Arial" w:cs="Arial"/>
+                <w:sz w:val="20"/>
+                <w:szCs w:val="20"/>
+              </w:rPr>
+              <w:t>}}</w:t>
+            </w:r>
+          </w:p>
+        </w:tc>
+        <w:tc>
+          <w:tcPr>
+            <w:tcW w:w="1890" w:type="dxa"/>
+          </w:tcPr>
+          <w:p>
+            <w:pPr>
+              <w:widowControl w:val="0"/>
+              <w:rPr>
+                <w:rFonts w:ascii="Arial" w:eastAsia="Calibri" w:hAnsi="Arial" w:cs="Arial"/>
+                <w:sz w:val="20"/>
+                <w:szCs w:val="20"/>
+              </w:rPr>
+            </w:pPr>
+            <w:r>
+              <w:rPr>
+                <w:rFonts w:ascii="Arial" w:hAnsi="Arial" w:cs="Arial"/>
                 <w:sz w:val="20"/>
                 <w:szCs w:val="20"/>
               </w:rPr>
               <w:t xml:space="preserve">{{ </w:t>
             </w:r>
-            <w:r>
-              <w:rPr>
-                <w:rFonts w:ascii="Arial" w:eastAsia="Calibri" w:hAnsi="Arial" w:cs="Arial"/>
-                <w:sz w:val="20"/>
-                <w:szCs w:val="20"/>
-              </w:rPr>
-              <w:t xml:space="preserve">“Yes” if </w:t>
-            </w:r>
             <w:proofErr w:type="spellStart"/>
             <w:r>
               <w:rPr>
-                <w:rFonts w:ascii="Arial" w:eastAsia="Calibri" w:hAnsi="Arial" w:cs="Arial"/>
-                <w:sz w:val="20"/>
-                <w:szCs w:val="20"/>
-              </w:rPr>
-              <w:t>row.in_danger</w:t>
+                <w:rFonts w:ascii="Arial" w:hAnsi="Arial" w:cs="Arial"/>
+                <w:sz w:val="20"/>
+                <w:szCs w:val="20"/>
+              </w:rPr>
+              <w:t>row.relationship_</w:t>
+            </w:r>
+            <w:r>
+              <w:rPr>
+                <w:rFonts w:ascii="Arial" w:hAnsi="Arial" w:cs="Arial"/>
+                <w:sz w:val="20"/>
+                <w:szCs w:val="20"/>
+              </w:rPr>
+              <w:t>OP</w:t>
             </w:r>
             <w:proofErr w:type="spellEnd"/>
             <w:r>
               <w:rPr>
-                <w:rFonts w:ascii="Arial" w:eastAsia="Calibri" w:hAnsi="Arial" w:cs="Arial"/>
+                <w:rFonts w:ascii="Arial" w:hAnsi="Arial" w:cs="Arial"/>
                 <w:sz w:val="20"/>
                 <w:szCs w:val="20"/>
               </w:rPr>
@@ -854,15 +1130,15 @@
             </w:r>
             <w:r>
               <w:rPr>
-                <w:rFonts w:ascii="Arial" w:eastAsia="Calibri" w:hAnsi="Arial" w:cs="Arial"/>
-                <w:sz w:val="20"/>
-                <w:szCs w:val="20"/>
-              </w:rPr>
-              <w:t>else “No”</w:t>
-            </w:r>
-            <w:r>
-              <w:rPr>
-                <w:rFonts w:ascii="Arial" w:eastAsia="Calibri" w:hAnsi="Arial" w:cs="Arial"/>
+                <w:rFonts w:ascii="Arial" w:hAnsi="Arial" w:cs="Arial"/>
+                <w:sz w:val="20"/>
+                <w:szCs w:val="20"/>
+              </w:rPr>
+              <w:t>| capitalize</w:t>
+            </w:r>
+            <w:r>
+              <w:rPr>
+                <w:rFonts w:ascii="Arial" w:hAnsi="Arial" w:cs="Arial"/>
                 <w:sz w:val="20"/>
                 <w:szCs w:val="20"/>
               </w:rPr>
@@ -872,135 +1148,7 @@
         </w:tc>
         <w:tc>
           <w:tcPr>
-            <w:tcW w:w="1710" w:type="dxa"/>
-          </w:tcPr>
-          <w:p>
-            <w:pPr>
-              <w:widowControl w:val="0"/>
-              <w:rPr>
-                <w:rFonts w:ascii="Arial" w:hAnsi="Arial" w:cs="Arial"/>
-                <w:sz w:val="20"/>
-                <w:szCs w:val="20"/>
-              </w:rPr>
-            </w:pPr>
-            <w:r>
-              <w:rPr>
-                <w:rFonts w:ascii="Arial" w:hAnsi="Arial" w:cs="Arial"/>
-                <w:sz w:val="20"/>
-                <w:szCs w:val="20"/>
-              </w:rPr>
-              <w:t>{{ row.relationship_user</w:t>
-            </w:r>
-            <w:r>
-              <w:rPr>
-                <w:rFonts w:ascii="Arial" w:hAnsi="Arial" w:cs="Arial"/>
-                <w:sz w:val="20"/>
-                <w:szCs w:val="20"/>
-              </w:rPr>
-              <w:t>s</w:t>
-            </w:r>
-            <w:r>
-              <w:rPr>
-                <w:rFonts w:ascii="Arial" w:hAnsi="Arial" w:cs="Arial"/>
-                <w:sz w:val="20"/>
-                <w:szCs w:val="20"/>
-              </w:rPr>
-              <w:t>1</w:t>
-            </w:r>
-            <w:r>
-              <w:rPr>
-                <w:rFonts w:ascii="Arial" w:hAnsi="Arial" w:cs="Arial"/>
-                <w:sz w:val="20"/>
-                <w:szCs w:val="20"/>
-              </w:rPr>
-              <w:t xml:space="preserve"> </w:t>
-            </w:r>
-            <w:r>
-              <w:rPr>
-                <w:rFonts w:ascii="Arial" w:hAnsi="Arial" w:cs="Arial"/>
-                <w:sz w:val="20"/>
-                <w:szCs w:val="20"/>
-              </w:rPr>
-              <w:t>| capitalize</w:t>
-            </w:r>
-            <w:r>
-              <w:rPr>
-                <w:rFonts w:ascii="Arial" w:hAnsi="Arial" w:cs="Arial"/>
-                <w:sz w:val="20"/>
-                <w:szCs w:val="20"/>
-              </w:rPr>
-              <w:t>}}</w:t>
-            </w:r>
-          </w:p>
-        </w:tc>
-        <w:tc>
-          <w:tcPr>
-            <w:tcW w:w="1710" w:type="dxa"/>
-          </w:tcPr>
-          <w:p>
-            <w:pPr>
-              <w:widowControl w:val="0"/>
-              <w:rPr>
-                <w:rFonts w:ascii="Arial" w:eastAsia="Calibri" w:hAnsi="Arial" w:cs="Arial"/>
-                <w:sz w:val="20"/>
-                <w:szCs w:val="20"/>
-              </w:rPr>
-            </w:pPr>
-            <w:r>
-              <w:rPr>
-                <w:rFonts w:ascii="Arial" w:hAnsi="Arial" w:cs="Arial"/>
-                <w:sz w:val="20"/>
-                <w:szCs w:val="20"/>
-              </w:rPr>
-              <w:t xml:space="preserve">{{ </w:t>
-            </w:r>
-            <w:proofErr w:type="spellStart"/>
-            <w:r>
-              <w:rPr>
-                <w:rFonts w:ascii="Arial" w:hAnsi="Arial" w:cs="Arial"/>
-                <w:sz w:val="20"/>
-                <w:szCs w:val="20"/>
-              </w:rPr>
-              <w:t>row.relationship_</w:t>
-            </w:r>
-            <w:r>
-              <w:rPr>
-                <w:rFonts w:ascii="Arial" w:hAnsi="Arial" w:cs="Arial"/>
-                <w:sz w:val="20"/>
-                <w:szCs w:val="20"/>
-              </w:rPr>
-              <w:t>OP</w:t>
-            </w:r>
-            <w:proofErr w:type="spellEnd"/>
-            <w:r>
-              <w:rPr>
-                <w:rFonts w:ascii="Arial" w:hAnsi="Arial" w:cs="Arial"/>
-                <w:sz w:val="20"/>
-                <w:szCs w:val="20"/>
-              </w:rPr>
-              <w:t xml:space="preserve"> </w:t>
-            </w:r>
-            <w:r>
-              <w:rPr>
-                <w:rFonts w:ascii="Arial" w:hAnsi="Arial" w:cs="Arial"/>
-                <w:sz w:val="20"/>
-                <w:szCs w:val="20"/>
-              </w:rPr>
-              <w:t>| capitalize</w:t>
-            </w:r>
-            <w:r>
-              <w:rPr>
-                <w:rFonts w:ascii="Arial" w:hAnsi="Arial" w:cs="Arial"/>
-                <w:sz w:val="20"/>
-                <w:szCs w:val="20"/>
-              </w:rPr>
-              <w:t>}}</w:t>
-            </w:r>
-          </w:p>
-        </w:tc>
-        <w:tc>
-          <w:tcPr>
-            <w:tcW w:w="1985" w:type="dxa"/>
+            <w:tcW w:w="1355" w:type="dxa"/>
           </w:tcPr>
           <w:p>
             <w:pPr>
@@ -1099,7 +1247,7 @@
         </w:tc>
         <w:tc>
           <w:tcPr>
-            <w:tcW w:w="900" w:type="dxa"/>
+            <w:tcW w:w="1260" w:type="dxa"/>
           </w:tcPr>
           <w:p>
             <w:pPr>
@@ -1129,7 +1277,7 @@
         </w:tc>
         <w:tc>
           <w:tcPr>
-            <w:tcW w:w="1710" w:type="dxa"/>
+            <w:tcW w:w="1800" w:type="dxa"/>
           </w:tcPr>
           <w:p>
             <w:pPr>
@@ -1144,7 +1292,7 @@
         </w:tc>
         <w:tc>
           <w:tcPr>
-            <w:tcW w:w="1710" w:type="dxa"/>
+            <w:tcW w:w="1890" w:type="dxa"/>
           </w:tcPr>
           <w:p>
             <w:pPr>
@@ -1159,7 +1307,7 @@
         </w:tc>
         <w:tc>
           <w:tcPr>
-            <w:tcW w:w="1985" w:type="dxa"/>
+            <w:tcW w:w="1355" w:type="dxa"/>
           </w:tcPr>
           <w:p>
             <w:pPr>
@@ -1793,6 +1941,7 @@
           <w:sz w:val="24"/>
           <w:szCs w:val="24"/>
         </w:rPr>
+        <w:lastRenderedPageBreak/>
         <w:t xml:space="preserve">{%p </w:t>
       </w:r>
       <w:proofErr w:type="spellStart"/>
@@ -1856,7 +2005,6 @@
           <w:sz w:val="24"/>
           <w:szCs w:val="24"/>
         </w:rPr>
-        <w:lastRenderedPageBreak/>
         <w:t xml:space="preserve">{{ </w:t>
       </w:r>
       <w:proofErr w:type="spellStart"/>
@@ -2429,11 +2577,11 @@
       </w:tblPr>
       <w:tblGrid>
         <w:gridCol w:w="1795"/>
-        <w:gridCol w:w="900"/>
         <w:gridCol w:w="1260"/>
-        <w:gridCol w:w="1710"/>
-        <w:gridCol w:w="1710"/>
-        <w:gridCol w:w="1985"/>
+        <w:gridCol w:w="1260"/>
+        <w:gridCol w:w="1800"/>
+        <w:gridCol w:w="1890"/>
+        <w:gridCol w:w="1355"/>
       </w:tblGrid>
       <w:tr>
         <w:tc>
@@ -2463,7 +2611,7 @@
         </w:tc>
         <w:tc>
           <w:tcPr>
-            <w:tcW w:w="900" w:type="dxa"/>
+            <w:tcW w:w="1260" w:type="dxa"/>
           </w:tcPr>
           <w:p>
             <w:pPr>
@@ -2513,7 +2661,7 @@
         </w:tc>
         <w:tc>
           <w:tcPr>
-            <w:tcW w:w="1710" w:type="dxa"/>
+            <w:tcW w:w="1800" w:type="dxa"/>
           </w:tcPr>
           <w:p>
             <w:pPr>
@@ -2538,7 +2686,7 @@
         </w:tc>
         <w:tc>
           <w:tcPr>
-            <w:tcW w:w="1710" w:type="dxa"/>
+            <w:tcW w:w="1890" w:type="dxa"/>
           </w:tcPr>
           <w:p>
             <w:pPr>
@@ -2563,7 +2711,7 @@
         </w:tc>
         <w:tc>
           <w:tcPr>
-            <w:tcW w:w="1985" w:type="dxa"/>
+            <w:tcW w:w="1355" w:type="dxa"/>
           </w:tcPr>
           <w:p>
             <w:pPr>
@@ -2582,7 +2730,43 @@
                 <w:sz w:val="20"/>
                 <w:szCs w:val="20"/>
               </w:rPr>
-              <w:t>Plaintiff/petitioner wants custody?</w:t>
+              <w:t>Plaintiff</w:t>
+            </w:r>
+            <w:r>
+              <w:rPr>
+                <w:rFonts w:ascii="Arial" w:eastAsia="Calibri" w:hAnsi="Arial" w:cs="Arial"/>
+                <w:b/>
+                <w:sz w:val="20"/>
+                <w:szCs w:val="20"/>
+              </w:rPr>
+              <w:t xml:space="preserve"> </w:t>
+            </w:r>
+            <w:r>
+              <w:rPr>
+                <w:rFonts w:ascii="Arial" w:eastAsia="Calibri" w:hAnsi="Arial" w:cs="Arial"/>
+                <w:b/>
+                <w:sz w:val="20"/>
+                <w:szCs w:val="20"/>
+              </w:rPr>
+              <w:t>/</w:t>
+            </w:r>
+            <w:r>
+              <w:rPr>
+                <w:rFonts w:ascii="Arial" w:eastAsia="Calibri" w:hAnsi="Arial" w:cs="Arial"/>
+                <w:b/>
+                <w:sz w:val="20"/>
+                <w:szCs w:val="20"/>
+              </w:rPr>
+              <w:t xml:space="preserve"> </w:t>
+            </w:r>
+            <w:r>
+              <w:rPr>
+                <w:rFonts w:ascii="Arial" w:eastAsia="Calibri" w:hAnsi="Arial" w:cs="Arial"/>
+                <w:b/>
+                <w:sz w:val="20"/>
+                <w:szCs w:val="20"/>
+              </w:rPr>
+              <w:t>petitioner wants custody?</w:t>
             </w:r>
           </w:p>
         </w:tc>
@@ -2630,7 +2814,7 @@
         </w:tc>
         <w:tc>
           <w:tcPr>
-            <w:tcW w:w="900" w:type="dxa"/>
+            <w:tcW w:w="1260" w:type="dxa"/>
           </w:tcPr>
           <w:p>
             <w:pPr>
@@ -2660,7 +2844,7 @@
         </w:tc>
         <w:tc>
           <w:tcPr>
-            <w:tcW w:w="1710" w:type="dxa"/>
+            <w:tcW w:w="1800" w:type="dxa"/>
           </w:tcPr>
           <w:p>
             <w:pPr>
@@ -2675,7 +2859,7 @@
         </w:tc>
         <w:tc>
           <w:tcPr>
-            <w:tcW w:w="1710" w:type="dxa"/>
+            <w:tcW w:w="1890" w:type="dxa"/>
           </w:tcPr>
           <w:p>
             <w:pPr>
@@ -2690,7 +2874,7 @@
         </w:tc>
         <w:tc>
           <w:tcPr>
-            <w:tcW w:w="1985" w:type="dxa"/>
+            <w:tcW w:w="1355" w:type="dxa"/>
           </w:tcPr>
           <w:p>
             <w:pPr>
@@ -2729,12 +2913,99 @@
         </w:tc>
         <w:tc>
           <w:tcPr>
-            <w:tcW w:w="900" w:type="dxa"/>
+            <w:tcW w:w="1260" w:type="dxa"/>
           </w:tcPr>
           <w:p>
             <w:pPr>
               <w:widowControl w:val="0"/>
               <w:rPr>
+                <w:rFonts w:ascii="Arial" w:eastAsia="Calibri" w:hAnsi="Arial" w:cs="Arial"/>
+                <w:sz w:val="20"/>
+                <w:szCs w:val="20"/>
+              </w:rPr>
+            </w:pPr>
+            <w:r>
+              <w:rPr>
+                <w:rFonts w:ascii="Arial" w:eastAsia="Calibri" w:hAnsi="Arial" w:cs="Arial"/>
+                <w:sz w:val="20"/>
+                <w:szCs w:val="20"/>
+              </w:rPr>
+              <w:t>{{</w:t>
+            </w:r>
+            <w:proofErr w:type="spellStart"/>
+            <w:r>
+              <w:rPr>
+                <w:rFonts w:ascii="Arial" w:eastAsia="Calibri" w:hAnsi="Arial" w:cs="Arial"/>
+                <w:sz w:val="20"/>
+                <w:szCs w:val="20"/>
+              </w:rPr>
+              <w:t>row.birthdate</w:t>
+            </w:r>
+            <w:proofErr w:type="spellEnd"/>
+            <w:r>
+              <w:rPr>
+                <w:rFonts w:ascii="Arial" w:eastAsia="Calibri" w:hAnsi="Arial" w:cs="Arial"/>
+                <w:sz w:val="20"/>
+                <w:szCs w:val="20"/>
+              </w:rPr>
+              <w:t>.</w:t>
+            </w:r>
+            <w:r>
+              <w:rPr>
+                <w:rFonts w:ascii="inherit" w:eastAsia="Times New Roman" w:hAnsi="inherit" w:cs="Courier New"/>
+                <w:color w:val="0C0D0E"/>
+                <w:sz w:val="20"/>
+                <w:szCs w:val="20"/>
+                <w:bdr w:val="none" w:sz="0" w:space="0" w:color="auto" w:frame="1"/>
+              </w:rPr>
+              <w:t xml:space="preserve"> </w:t>
+            </w:r>
+            <w:proofErr w:type="spellStart"/>
+            <w:r>
+              <w:rPr>
+                <w:rFonts w:ascii="Arial" w:eastAsia="Calibri" w:hAnsi="Arial" w:cs="Arial"/>
+                <w:sz w:val="20"/>
+                <w:szCs w:val="20"/>
+              </w:rPr>
+              <w:t>strftime</w:t>
+            </w:r>
+            <w:proofErr w:type="spellEnd"/>
+            <w:r>
+              <w:rPr>
+                <w:rFonts w:ascii="Arial" w:eastAsia="Calibri" w:hAnsi="Arial" w:cs="Arial"/>
+                <w:sz w:val="20"/>
+                <w:szCs w:val="20"/>
+              </w:rPr>
+              <w:t>('%m/%d/%Y')</w:t>
+            </w:r>
+          </w:p>
+          <w:p>
+            <w:pPr>
+              <w:widowControl w:val="0"/>
+              <w:rPr>
+                <w:rFonts w:ascii="Arial" w:hAnsi="Arial" w:cs="Arial"/>
+                <w:sz w:val="20"/>
+                <w:szCs w:val="20"/>
+              </w:rPr>
+            </w:pPr>
+            <w:r>
+              <w:rPr>
+                <w:rFonts w:ascii="Arial" w:eastAsia="Calibri" w:hAnsi="Arial" w:cs="Arial"/>
+                <w:sz w:val="20"/>
+                <w:szCs w:val="20"/>
+              </w:rPr>
+              <w:t>}}</w:t>
+            </w:r>
+          </w:p>
+        </w:tc>
+        <w:tc>
+          <w:tcPr>
+            <w:tcW w:w="1260" w:type="dxa"/>
+          </w:tcPr>
+          <w:p>
+            <w:pPr>
+              <w:widowControl w:val="0"/>
+              <w:rPr>
                 <w:rFonts w:ascii="Arial" w:hAnsi="Arial" w:cs="Arial"/>
                 <w:sz w:val="20"/>
                 <w:szCs w:val="20"/>
@@ -2748,6 +3019,14 @@
               </w:rPr>
               <w:t xml:space="preserve">{{ </w:t>
             </w:r>
+            <w:r>
+              <w:rPr>
+                <w:rFonts w:ascii="Arial" w:eastAsia="Calibri" w:hAnsi="Arial" w:cs="Arial"/>
+                <w:sz w:val="20"/>
+                <w:szCs w:val="20"/>
+              </w:rPr>
+              <w:t xml:space="preserve">“Yes” if </w:t>
+            </w:r>
             <w:proofErr w:type="spellStart"/>
             <w:r>
               <w:rPr>
@@ -2755,7 +3034,7 @@
                 <w:sz w:val="20"/>
                 <w:szCs w:val="20"/>
               </w:rPr>
-              <w:t>row.birthdate</w:t>
+              <w:t>row.in_danger</w:t>
             </w:r>
             <w:proofErr w:type="spellEnd"/>
             <w:r>
@@ -2764,13 +3043,29 @@
                 <w:sz w:val="20"/>
                 <w:szCs w:val="20"/>
               </w:rPr>
-              <w:t xml:space="preserve"> }}</w:t>
-            </w:r>
-          </w:p>
-        </w:tc>
-        <w:tc>
-          <w:tcPr>
-            <w:tcW w:w="1260" w:type="dxa"/>
+              <w:t xml:space="preserve"> </w:t>
+            </w:r>
+            <w:r>
+              <w:rPr>
+                <w:rFonts w:ascii="Arial" w:eastAsia="Calibri" w:hAnsi="Arial" w:cs="Arial"/>
+                <w:sz w:val="20"/>
+                <w:szCs w:val="20"/>
+              </w:rPr>
+              <w:t>else “No”</w:t>
+            </w:r>
+            <w:r>
+              <w:rPr>
+                <w:rFonts w:ascii="Arial" w:eastAsia="Calibri" w:hAnsi="Arial" w:cs="Arial"/>
+                <w:sz w:val="20"/>
+                <w:szCs w:val="20"/>
+              </w:rPr>
+              <w:t>}}</w:t>
+            </w:r>
+          </w:p>
+        </w:tc>
+        <w:tc>
+          <w:tcPr>
+            <w:tcW w:w="1800" w:type="dxa"/>
           </w:tcPr>
           <w:p>
             <w:pPr>
@@ -2783,33 +3078,96 @@
             </w:pPr>
             <w:r>
               <w:rPr>
-                <w:rFonts w:ascii="Arial" w:eastAsia="Calibri" w:hAnsi="Arial" w:cs="Arial"/>
+                <w:rFonts w:ascii="Arial" w:hAnsi="Arial" w:cs="Arial"/>
+                <w:sz w:val="20"/>
+                <w:szCs w:val="20"/>
+              </w:rPr>
+              <w:t>{{ row.relationship_user</w:t>
+            </w:r>
+            <w:r>
+              <w:rPr>
+                <w:rFonts w:ascii="Arial" w:hAnsi="Arial" w:cs="Arial"/>
+                <w:sz w:val="20"/>
+                <w:szCs w:val="20"/>
+              </w:rPr>
+              <w:t>s</w:t>
+            </w:r>
+            <w:r>
+              <w:rPr>
+                <w:rFonts w:ascii="Arial" w:hAnsi="Arial" w:cs="Arial"/>
+                <w:sz w:val="20"/>
+                <w:szCs w:val="20"/>
+              </w:rPr>
+              <w:t>1</w:t>
+            </w:r>
+            <w:r>
+              <w:rPr>
+                <w:rFonts w:ascii="Arial" w:hAnsi="Arial" w:cs="Arial"/>
+                <w:sz w:val="20"/>
+                <w:szCs w:val="20"/>
+              </w:rPr>
+              <w:t xml:space="preserve"> </w:t>
+            </w:r>
+            <w:r>
+              <w:rPr>
+                <w:rFonts w:ascii="Arial" w:hAnsi="Arial" w:cs="Arial"/>
+                <w:sz w:val="20"/>
+                <w:szCs w:val="20"/>
+              </w:rPr>
+              <w:t>| capitalize</w:t>
+            </w:r>
+            <w:r>
+              <w:rPr>
+                <w:rFonts w:ascii="Arial" w:hAnsi="Arial" w:cs="Arial"/>
+                <w:sz w:val="20"/>
+                <w:szCs w:val="20"/>
+              </w:rPr>
+              <w:t>}}</w:t>
+            </w:r>
+          </w:p>
+        </w:tc>
+        <w:tc>
+          <w:tcPr>
+            <w:tcW w:w="1890" w:type="dxa"/>
+          </w:tcPr>
+          <w:p>
+            <w:pPr>
+              <w:widowControl w:val="0"/>
+              <w:rPr>
+                <w:rFonts w:ascii="Arial" w:eastAsia="Calibri" w:hAnsi="Arial" w:cs="Arial"/>
+                <w:sz w:val="20"/>
+                <w:szCs w:val="20"/>
+              </w:rPr>
+            </w:pPr>
+            <w:r>
+              <w:rPr>
+                <w:rFonts w:ascii="Arial" w:hAnsi="Arial" w:cs="Arial"/>
                 <w:sz w:val="20"/>
                 <w:szCs w:val="20"/>
               </w:rPr>
               <w:t xml:space="preserve">{{ </w:t>
             </w:r>
-            <w:r>
-              <w:rPr>
-                <w:rFonts w:ascii="Arial" w:eastAsia="Calibri" w:hAnsi="Arial" w:cs="Arial"/>
-                <w:sz w:val="20"/>
-                <w:szCs w:val="20"/>
-              </w:rPr>
-              <w:t xml:space="preserve">“Yes” if </w:t>
-            </w:r>
             <w:proofErr w:type="spellStart"/>
             <w:r>
               <w:rPr>
-                <w:rFonts w:ascii="Arial" w:eastAsia="Calibri" w:hAnsi="Arial" w:cs="Arial"/>
-                <w:sz w:val="20"/>
-                <w:szCs w:val="20"/>
-              </w:rPr>
-              <w:t>row.in_danger</w:t>
+                <w:rFonts w:ascii="Arial" w:hAnsi="Arial" w:cs="Arial"/>
+                <w:sz w:val="20"/>
+                <w:szCs w:val="20"/>
+              </w:rPr>
+              <w:t>row.relationship_</w:t>
+            </w:r>
+            <w:r>
+              <w:rPr>
+                <w:rFonts w:ascii="Arial" w:hAnsi="Arial" w:cs="Arial"/>
+                <w:sz w:val="20"/>
+                <w:szCs w:val="20"/>
+              </w:rPr>
+              <w:t>OP</w:t>
             </w:r>
             <w:proofErr w:type="spellEnd"/>
             <w:r>
               <w:rPr>
-                <w:rFonts w:ascii="Arial" w:eastAsia="Calibri" w:hAnsi="Arial" w:cs="Arial"/>
+                <w:rFonts w:ascii="Arial" w:hAnsi="Arial" w:cs="Arial"/>
                 <w:sz w:val="20"/>
                 <w:szCs w:val="20"/>
               </w:rPr>
@@ -2817,15 +3175,15 @@
             </w:r>
             <w:r>
               <w:rPr>
-                <w:rFonts w:ascii="Arial" w:eastAsia="Calibri" w:hAnsi="Arial" w:cs="Arial"/>
-                <w:sz w:val="20"/>
-                <w:szCs w:val="20"/>
-              </w:rPr>
-              <w:t>else “No”</w:t>
-            </w:r>
-            <w:r>
-              <w:rPr>
-                <w:rFonts w:ascii="Arial" w:eastAsia="Calibri" w:hAnsi="Arial" w:cs="Arial"/>
+                <w:rFonts w:ascii="Arial" w:hAnsi="Arial" w:cs="Arial"/>
+                <w:sz w:val="20"/>
+                <w:szCs w:val="20"/>
+              </w:rPr>
+              <w:t>| capitalize</w:t>
+            </w:r>
+            <w:r>
+              <w:rPr>
+                <w:rFonts w:ascii="Arial" w:hAnsi="Arial" w:cs="Arial"/>
                 <w:sz w:val="20"/>
                 <w:szCs w:val="20"/>
               </w:rPr>
@@ -2835,135 +3193,7 @@
         </w:tc>
         <w:tc>
           <w:tcPr>
-            <w:tcW w:w="1710" w:type="dxa"/>
-          </w:tcPr>
-          <w:p>
-            <w:pPr>
-              <w:widowControl w:val="0"/>
-              <w:rPr>
-                <w:rFonts w:ascii="Arial" w:hAnsi="Arial" w:cs="Arial"/>
-                <w:sz w:val="20"/>
-                <w:szCs w:val="20"/>
-              </w:rPr>
-            </w:pPr>
-            <w:r>
-              <w:rPr>
-                <w:rFonts w:ascii="Arial" w:hAnsi="Arial" w:cs="Arial"/>
-                <w:sz w:val="20"/>
-                <w:szCs w:val="20"/>
-              </w:rPr>
-              <w:t>{{ row.relationship_user</w:t>
-            </w:r>
-            <w:r>
-              <w:rPr>
-                <w:rFonts w:ascii="Arial" w:hAnsi="Arial" w:cs="Arial"/>
-                <w:sz w:val="20"/>
-                <w:szCs w:val="20"/>
-              </w:rPr>
-              <w:t>s</w:t>
-            </w:r>
-            <w:r>
-              <w:rPr>
-                <w:rFonts w:ascii="Arial" w:hAnsi="Arial" w:cs="Arial"/>
-                <w:sz w:val="20"/>
-                <w:szCs w:val="20"/>
-              </w:rPr>
-              <w:t>1</w:t>
-            </w:r>
-            <w:r>
-              <w:rPr>
-                <w:rFonts w:ascii="Arial" w:hAnsi="Arial" w:cs="Arial"/>
-                <w:sz w:val="20"/>
-                <w:szCs w:val="20"/>
-              </w:rPr>
-              <w:t xml:space="preserve"> </w:t>
-            </w:r>
-            <w:r>
-              <w:rPr>
-                <w:rFonts w:ascii="Arial" w:hAnsi="Arial" w:cs="Arial"/>
-                <w:sz w:val="20"/>
-                <w:szCs w:val="20"/>
-              </w:rPr>
-              <w:t>| capitalize</w:t>
-            </w:r>
-            <w:r>
-              <w:rPr>
-                <w:rFonts w:ascii="Arial" w:hAnsi="Arial" w:cs="Arial"/>
-                <w:sz w:val="20"/>
-                <w:szCs w:val="20"/>
-              </w:rPr>
-              <w:t>}}</w:t>
-            </w:r>
-          </w:p>
-        </w:tc>
-        <w:tc>
-          <w:tcPr>
-            <w:tcW w:w="1710" w:type="dxa"/>
-          </w:tcPr>
-          <w:p>
-            <w:pPr>
-              <w:widowControl w:val="0"/>
-              <w:rPr>
-                <w:rFonts w:ascii="Arial" w:eastAsia="Calibri" w:hAnsi="Arial" w:cs="Arial"/>
-                <w:sz w:val="20"/>
-                <w:szCs w:val="20"/>
-              </w:rPr>
-            </w:pPr>
-            <w:r>
-              <w:rPr>
-                <w:rFonts w:ascii="Arial" w:hAnsi="Arial" w:cs="Arial"/>
-                <w:sz w:val="20"/>
-                <w:szCs w:val="20"/>
-              </w:rPr>
-              <w:t xml:space="preserve">{{ </w:t>
-            </w:r>
-            <w:proofErr w:type="spellStart"/>
-            <w:r>
-              <w:rPr>
-                <w:rFonts w:ascii="Arial" w:hAnsi="Arial" w:cs="Arial"/>
-                <w:sz w:val="20"/>
-                <w:szCs w:val="20"/>
-              </w:rPr>
-              <w:t>row.relationship_</w:t>
-            </w:r>
-            <w:r>
-              <w:rPr>
-                <w:rFonts w:ascii="Arial" w:hAnsi="Arial" w:cs="Arial"/>
-                <w:sz w:val="20"/>
-                <w:szCs w:val="20"/>
-              </w:rPr>
-              <w:t>OP</w:t>
-            </w:r>
-            <w:proofErr w:type="spellEnd"/>
-            <w:r>
-              <w:rPr>
-                <w:rFonts w:ascii="Arial" w:hAnsi="Arial" w:cs="Arial"/>
-                <w:sz w:val="20"/>
-                <w:szCs w:val="20"/>
-              </w:rPr>
-              <w:t xml:space="preserve"> </w:t>
-            </w:r>
-            <w:r>
-              <w:rPr>
-                <w:rFonts w:ascii="Arial" w:hAnsi="Arial" w:cs="Arial"/>
-                <w:sz w:val="20"/>
-                <w:szCs w:val="20"/>
-              </w:rPr>
-              <w:t>| capitalize</w:t>
-            </w:r>
-            <w:r>
-              <w:rPr>
-                <w:rFonts w:ascii="Arial" w:hAnsi="Arial" w:cs="Arial"/>
-                <w:sz w:val="20"/>
-                <w:szCs w:val="20"/>
-              </w:rPr>
-              <w:t>}}</w:t>
-            </w:r>
-          </w:p>
-        </w:tc>
-        <w:tc>
-          <w:tcPr>
-            <w:tcW w:w="1985" w:type="dxa"/>
+            <w:tcW w:w="1355" w:type="dxa"/>
           </w:tcPr>
           <w:p>
             <w:pPr>
@@ -3062,7 +3292,7 @@
         </w:tc>
         <w:tc>
           <w:tcPr>
-            <w:tcW w:w="900" w:type="dxa"/>
+            <w:tcW w:w="1260" w:type="dxa"/>
           </w:tcPr>
           <w:p>
             <w:pPr>
@@ -3092,7 +3322,7 @@
         </w:tc>
         <w:tc>
           <w:tcPr>
-            <w:tcW w:w="1710" w:type="dxa"/>
+            <w:tcW w:w="1800" w:type="dxa"/>
           </w:tcPr>
           <w:p>
             <w:pPr>
@@ -3107,7 +3337,7 @@
         </w:tc>
         <w:tc>
           <w:tcPr>
-            <w:tcW w:w="1710" w:type="dxa"/>
+            <w:tcW w:w="1890" w:type="dxa"/>
           </w:tcPr>
           <w:p>
             <w:pPr>
@@ -3122,7 +3352,7 @@
         </w:tc>
         <w:tc>
           <w:tcPr>
-            <w:tcW w:w="1985" w:type="dxa"/>
+            <w:tcW w:w="1355" w:type="dxa"/>
           </w:tcPr>
           <w:p>
             <w:pPr>
@@ -3222,6 +3452,7 @@
           <w:sz w:val="24"/>
           <w:szCs w:val="24"/>
         </w:rPr>
+        <w:lastRenderedPageBreak/>
         <w:t xml:space="preserve">{{ </w:t>
       </w:r>
       <w:proofErr w:type="spellStart"/>
@@ -5028,6 +5259,36 @@
       <w:contextualSpacing/>
     </w:pPr>
   </w:style>
+  <w:style w:type="paragraph" w:styleId="HTMLPreformatted">
+    <w:name w:val="HTML Preformatted"/>
+    <w:basedOn w:val="Normal"/>
+    <w:link w:val="HTMLPreformattedChar"/>
+    <w:uiPriority w:val="99"/>
+    <w:semiHidden/>
+    <w:unhideWhenUsed/>
+    <w:rsid w:val="00D2037F"/>
+    <w:pPr>
+      <w:spacing w:after="0" w:line="240" w:lineRule="auto"/>
+    </w:pPr>
+    <w:rPr>
+      <w:rFonts w:ascii="Consolas" w:hAnsi="Consolas"/>
+      <w:sz w:val="20"/>
+      <w:szCs w:val="20"/>
+    </w:rPr>
+  </w:style>
+  <w:style w:type="character" w:customStyle="1" w:styleId="HTMLPreformattedChar">
+    <w:name w:val="HTML Preformatted Char"/>
+    <w:basedOn w:val="DefaultParagraphFont"/>
+    <w:link w:val="HTMLPreformatted"/>
+    <w:uiPriority w:val="99"/>
+    <w:semiHidden/>
+    <w:rsid w:val="00D2037F"/>
+    <w:rPr>
+      <w:rFonts w:ascii="Consolas" w:hAnsi="Consolas"/>
+      <w:sz w:val="20"/>
+      <w:szCs w:val="20"/>
+    </w:rPr>
+  </w:style>
 </w:styles>
 </file>
 

</xml_diff>

<commit_message>
trying to fix issue that I found; we were missing a child name in addendum when custody wanted
</commit_message>
<xml_diff>
--- a/docassemble/RFApackage/data/templates/RFAcomplaint_addendum.docx
+++ b/docassemble/RFApackage/data/templates/RFAcomplaint_addendum.docx
@@ -1,27 +1,12 @@
 
 <file path=word/document.xml><?xml version="1.0" encoding="utf-8"?>
-<w:document xmlns:wpc="http://schemas.microsoft.com/office/word/2010/wordprocessingCanvas" xmlns:cx="http://schemas.microsoft.com/office/drawing/2014/chartex" xmlns:cx1="http://schemas.microsoft.com/office/drawing/2015/9/8/chartex" xmlns:cx2="http://schemas.microsoft.com/office/drawing/2015/10/21/chartex" xmlns:cx3="http://schemas.microsoft.com/office/drawing/2016/5/9/chartex" xmlns:cx4="http://schemas.microsoft.com/office/drawing/2016/5/10/chartex" xmlns:cx5="http://schemas.microsoft.com/office/drawing/2016/5/11/chartex" xmlns:cx6="http://schemas.microsoft.com/office/drawing/2016/5/12/chartex" xmlns:cx7="http://schemas.microsoft.com/office/drawing/2016/5/13/chartex" xmlns:cx8="http://schemas.microsoft.com/office/drawing/2016/5/14/chartex" xmlns:mc="http://schemas.openxmlformats.org/markup-compatibility/2006" xmlns:aink="http://schemas.microsoft.com/office/drawing/2016/ink" xmlns:am3d="http://schemas.microsoft.com/office/drawing/2017/model3d" xmlns:o="urn:schemas-microsoft-com:office:office" xmlns:oel="http://schemas.microsoft.com/office/2019/extlst" xmlns:r="http://schemas.openxmlformats.org/officeDocument/2006/relationships" xmlns:m="http://schemas.openxmlformats.org/officeDocument/2006/math" xmlns:v="urn:schemas-microsoft-com:vml" xmlns:wp14="http://schemas.microsoft.com/office/word/2010/wordprocessingDrawing" xmlns:wp="http://schemas.openxmlformats.org/drawingml/2006/wordprocessingDrawing" xmlns:w10="urn:schemas-microsoft-com:office:word" xmlns:w="http://schemas.openxmlformats.org/wordprocessingml/2006/main" xmlns:w14="http://schemas.microsoft.com/office/word/2010/wordml" xmlns:w15="http://schemas.microsoft.com/office/word/2012/wordml" xmlns:w16cex="http://schemas.microsoft.com/office/word/2018/wordml/cex" xmlns:w16cid="http://schemas.microsoft.com/office/word/2016/wordml/cid" xmlns:w16="http://schemas.microsoft.com/office/word/2018/wordml" xmlns:w16du="http://schemas.microsoft.com/office/word/2023/wordml/word16du" xmlns:w16sdtdh="http://schemas.microsoft.com/office/word/2020/wordml/sdtdatahash" xmlns:w16sdtfl="http://schemas.microsoft.com/office/word/2024/wordml/sdtformatlock" xmlns:w16se="http://schemas.microsoft.com/office/word/2015/wordml/symex" xmlns:wpg="http://schemas.microsoft.com/office/word/2010/wordprocessingGroup" xmlns:wpi="http://schemas.microsoft.com/office/word/2010/wordprocessingInk" xmlns:wne="http://schemas.microsoft.com/office/word/2006/wordml" xmlns:wps="http://schemas.microsoft.com/office/word/2010/wordprocessingShape" mc:Ignorable="w14 w15 w16se w16cid w16 w16cex w16sdtdh w16sdtfl w16du wp14">
+<w:document xmlns:wpc="http://schemas.microsoft.com/office/word/2010/wordprocessingCanvas" xmlns:cx="http://schemas.microsoft.com/office/drawing/2014/chartex" xmlns:cx1="http://schemas.microsoft.com/office/drawing/2015/9/8/chartex" xmlns:cx2="http://schemas.microsoft.com/office/drawing/2015/10/21/chartex" xmlns:cx3="http://schemas.microsoft.com/office/drawing/2016/5/9/chartex" xmlns:cx4="http://schemas.microsoft.com/office/drawing/2016/5/10/chartex" xmlns:cx5="http://schemas.microsoft.com/office/drawing/2016/5/11/chartex" xmlns:cx6="http://schemas.microsoft.com/office/drawing/2016/5/12/chartex" xmlns:cx7="http://schemas.microsoft.com/office/drawing/2016/5/13/chartex" xmlns:cx8="http://schemas.microsoft.com/office/drawing/2016/5/14/chartex" xmlns:mc="http://schemas.openxmlformats.org/markup-compatibility/2006" xmlns:aink="http://schemas.microsoft.com/office/drawing/2016/ink" xmlns:am3d="http://schemas.microsoft.com/office/drawing/2017/model3d" xmlns:o="urn:schemas-microsoft-com:office:office" xmlns:oel="http://schemas.microsoft.com/office/2019/extlst" xmlns:r="http://schemas.openxmlformats.org/officeDocument/2006/relationships" xmlns:m="http://schemas.openxmlformats.org/officeDocument/2006/math" xmlns:v="urn:schemas-microsoft-com:vml" xmlns:wp14="http://schemas.microsoft.com/office/word/2010/wordprocessingDrawing" xmlns:wp="http://schemas.openxmlformats.org/drawingml/2006/wordprocessingDrawing" xmlns:w10="urn:schemas-microsoft-com:office:word" xmlns:w="http://schemas.openxmlformats.org/wordprocessingml/2006/main" xmlns:w14="http://schemas.microsoft.com/office/word/2010/wordml" xmlns:w15="http://schemas.microsoft.com/office/word/2012/wordml" xmlns:w16cei="http://schemas.microsoft.com/office/word/2026/wordml/cei" xmlns:w16cex="http://schemas.microsoft.com/office/word/2018/wordml/cex" xmlns:w16cid="http://schemas.microsoft.com/office/word/2016/wordml/cid" xmlns:w16="http://schemas.microsoft.com/office/word/2018/wordml" xmlns:w16du="http://schemas.microsoft.com/office/word/2023/wordml/word16du" xmlns:w16sdtdh="http://schemas.microsoft.com/office/word/2020/wordml/sdtdatahash" xmlns:w16sdtfl="http://schemas.microsoft.com/office/word/2024/wordml/sdtformatlock" xmlns:w16se="http://schemas.microsoft.com/office/word/2015/wordml/symex" xmlns:wpg="http://schemas.microsoft.com/office/word/2010/wordprocessingGroup" xmlns:wpi="http://schemas.microsoft.com/office/word/2010/wordprocessingInk" xmlns:wne="http://schemas.microsoft.com/office/word/2006/wordml" xmlns:wps="http://schemas.microsoft.com/office/word/2010/wordprocessingShape" mc:Ignorable="w14 w15 w16se w16cid w16 w16cex w16sdtdh w16sdtfl w16du wp14">
   <w:body>
     <w:p>
       <w:pPr>
         <w:pStyle w:val="Heading1"/>
-        <w:numPr>
-          <w:ilvl w:val="0"/>
-          <w:numId w:val="2"/>
-        </w:numPr>
-        <w:jc w:val="center"/>
-        <w:rPr>
-          <w:rFonts w:ascii="Arial" w:hAnsi="Arial" w:cs="Arial"/>
-          <w:sz w:val="32"/>
-          <w:szCs w:val="32"/>
-        </w:rPr>
-      </w:pPr>
-      <w:r>
-        <w:rPr>
-          <w:rFonts w:ascii="Arial" w:hAnsi="Arial" w:cs="Arial"/>
-          <w:sz w:val="32"/>
-          <w:szCs w:val="32"/>
-        </w:rPr>
+      </w:pPr>
+      <w:r>
         <w:t>ADDENDUM</w:t>
       </w:r>
     </w:p>
@@ -72,6 +57,7 @@
         </w:rPr>
         <w:t xml:space="preserve">Family Division, {{ </w:t>
       </w:r>
+      <w:proofErr w:type="spellStart"/>
       <w:r>
         <w:rPr>
           <w:rFonts w:ascii="Arial" w:hAnsi="Arial" w:cs="Arial"/>
@@ -80,6 +66,7 @@
         </w:rPr>
         <w:t>user_selected_county</w:t>
       </w:r>
+      <w:proofErr w:type="spellEnd"/>
       <w:r>
         <w:rPr>
           <w:rFonts w:ascii="Arial" w:hAnsi="Arial" w:cs="Arial"/>
@@ -105,13 +92,41 @@
         </w:rPr>
         <w:t xml:space="preserve">{%p if </w:t>
       </w:r>
-      <w:r>
-        <w:rPr>
-          <w:rFonts w:ascii="Arial" w:hAnsi="Arial" w:cs="Arial"/>
-          <w:sz w:val="24"/>
-          <w:szCs w:val="24"/>
-        </w:rPr>
-        <w:t>who_needs_protection == 'order_obo_child'</w:t>
+      <w:proofErr w:type="spellStart"/>
+      <w:r>
+        <w:rPr>
+          <w:rFonts w:ascii="Arial" w:hAnsi="Arial" w:cs="Arial"/>
+          <w:sz w:val="24"/>
+          <w:szCs w:val="24"/>
+        </w:rPr>
+        <w:t>who_needs_protection</w:t>
+      </w:r>
+      <w:proofErr w:type="spellEnd"/>
+      <w:r>
+        <w:rPr>
+          <w:rFonts w:ascii="Arial" w:hAnsi="Arial" w:cs="Arial"/>
+          <w:sz w:val="24"/>
+          <w:szCs w:val="24"/>
+        </w:rPr>
+        <w:t xml:space="preserve"> == '</w:t>
+      </w:r>
+      <w:proofErr w:type="spellStart"/>
+      <w:r>
+        <w:rPr>
+          <w:rFonts w:ascii="Arial" w:hAnsi="Arial" w:cs="Arial"/>
+          <w:sz w:val="24"/>
+          <w:szCs w:val="24"/>
+        </w:rPr>
+        <w:t>order_obo_child</w:t>
+      </w:r>
+      <w:proofErr w:type="spellEnd"/>
+      <w:r>
+        <w:rPr>
+          <w:rFonts w:ascii="Arial" w:hAnsi="Arial" w:cs="Arial"/>
+          <w:sz w:val="24"/>
+          <w:szCs w:val="24"/>
+        </w:rPr>
+        <w:t>'</w:t>
       </w:r>
       <w:r>
         <w:rPr>
@@ -163,7 +178,25 @@
           <w:sz w:val="28"/>
           <w:szCs w:val="28"/>
         </w:rPr>
-        <w:t>[0] }} v. {{ other_parties[0] }}</w:t>
+        <w:t xml:space="preserve">[0] }} v. {{ </w:t>
+      </w:r>
+      <w:proofErr w:type="spellStart"/>
+      <w:r>
+        <w:rPr>
+          <w:rFonts w:ascii="Arial" w:hAnsi="Arial" w:cs="Arial"/>
+          <w:sz w:val="28"/>
+          <w:szCs w:val="28"/>
+        </w:rPr>
+        <w:t>other_parties</w:t>
+      </w:r>
+      <w:proofErr w:type="spellEnd"/>
+      <w:r>
+        <w:rPr>
+          <w:rFonts w:ascii="Arial" w:hAnsi="Arial" w:cs="Arial"/>
+          <w:sz w:val="28"/>
+          <w:szCs w:val="28"/>
+        </w:rPr>
+        <w:t>[0] }}</w:t>
       </w:r>
     </w:p>
     <w:p>
@@ -208,7 +241,25 @@
           <w:sz w:val="28"/>
           <w:szCs w:val="28"/>
         </w:rPr>
-        <w:t>{{ users[0] }} v. {{ other_parties[0] }}</w:t>
+        <w:t xml:space="preserve">{{ users[0] }} v. {{ </w:t>
+      </w:r>
+      <w:proofErr w:type="spellStart"/>
+      <w:r>
+        <w:rPr>
+          <w:rFonts w:ascii="Arial" w:hAnsi="Arial" w:cs="Arial"/>
+          <w:sz w:val="28"/>
+          <w:szCs w:val="28"/>
+        </w:rPr>
+        <w:t>other_parties</w:t>
+      </w:r>
+      <w:proofErr w:type="spellEnd"/>
+      <w:r>
+        <w:rPr>
+          <w:rFonts w:ascii="Arial" w:hAnsi="Arial" w:cs="Arial"/>
+          <w:sz w:val="28"/>
+          <w:szCs w:val="28"/>
+        </w:rPr>
+        <w:t>[0] }}</w:t>
       </w:r>
     </w:p>
     <w:p>
@@ -244,6 +295,7 @@
         </w:rPr>
         <w:t xml:space="preserve">{%p if </w:t>
       </w:r>
+      <w:proofErr w:type="spellStart"/>
       <w:r>
         <w:rPr>
           <w:rFonts w:ascii="Arial" w:hAnsi="Arial" w:cs="Arial"/>
@@ -258,7 +310,16 @@
           <w:sz w:val="24"/>
           <w:szCs w:val="24"/>
         </w:rPr>
-        <w:t>complaint.enabled %}</w:t>
+        <w:t>complaint.enabled</w:t>
+      </w:r>
+      <w:proofErr w:type="spellEnd"/>
+      <w:r>
+        <w:rPr>
+          <w:rFonts w:ascii="Arial" w:hAnsi="Arial" w:cs="Arial"/>
+          <w:sz w:val="24"/>
+          <w:szCs w:val="24"/>
+        </w:rPr>
+        <w:t xml:space="preserve"> %}</w:t>
       </w:r>
     </w:p>
     <w:p>
@@ -277,6 +338,7 @@
         </w:rPr>
         <w:t xml:space="preserve">{%p for field in </w:t>
       </w:r>
+      <w:proofErr w:type="spellStart"/>
       <w:r>
         <w:rPr>
           <w:rFonts w:ascii="Arial" w:hAnsi="Arial" w:cs="Arial"/>
@@ -299,7 +361,16 @@
           <w:sz w:val="24"/>
           <w:szCs w:val="24"/>
         </w:rPr>
-        <w:t>.overflow()</w:t>
+        <w:t>.overflow</w:t>
+      </w:r>
+      <w:proofErr w:type="spellEnd"/>
+      <w:r>
+        <w:rPr>
+          <w:rFonts w:ascii="Arial" w:hAnsi="Arial" w:cs="Arial"/>
+          <w:sz w:val="24"/>
+          <w:szCs w:val="24"/>
+        </w:rPr>
+        <w:t>()</w:t>
       </w:r>
       <w:r>
         <w:rPr>
@@ -332,11 +403,144 @@
           <w:sz w:val="24"/>
           <w:szCs w:val="24"/>
         </w:rPr>
-        <w:t>{%p if field.field_name == "children" %}</w:t>
+        <w:t xml:space="preserve">{%p if </w:t>
+      </w:r>
+      <w:proofErr w:type="spellStart"/>
+      <w:r>
+        <w:rPr>
+          <w:rFonts w:ascii="Arial" w:hAnsi="Arial" w:cs="Arial"/>
+          <w:sz w:val="24"/>
+          <w:szCs w:val="24"/>
+        </w:rPr>
+        <w:t>field.field_name</w:t>
+      </w:r>
+      <w:proofErr w:type="spellEnd"/>
+      <w:r>
+        <w:rPr>
+          <w:rFonts w:ascii="Arial" w:hAnsi="Arial" w:cs="Arial"/>
+          <w:sz w:val="24"/>
+          <w:szCs w:val="24"/>
+        </w:rPr>
+        <w:t xml:space="preserve"> == "children" %}</w:t>
       </w:r>
     </w:p>
     <w:p>
       <w:pPr>
+        <w:rPr>
+          <w:rFonts w:ascii="Arial" w:hAnsi="Arial" w:cs="Arial"/>
+          <w:sz w:val="24"/>
+          <w:szCs w:val="24"/>
+        </w:rPr>
+      </w:pPr>
+      <w:r>
+        <w:rPr>
+          <w:rFonts w:ascii="Arial" w:hAnsi="Arial" w:cs="Arial"/>
+          <w:sz w:val="24"/>
+          <w:szCs w:val="24"/>
+        </w:rPr>
+        <w:t>{%p</w:t>
+      </w:r>
+      <w:r>
+        <w:rPr>
+          <w:rFonts w:ascii="Arial" w:hAnsi="Arial" w:cs="Arial"/>
+          <w:sz w:val="24"/>
+          <w:szCs w:val="24"/>
+        </w:rPr>
+        <w:t xml:space="preserve"> </w:t>
+      </w:r>
+      <w:r>
+        <w:rPr>
+          <w:rFonts w:ascii="Arial" w:hAnsi="Arial" w:cs="Arial"/>
+          <w:sz w:val="24"/>
+          <w:szCs w:val="24"/>
+        </w:rPr>
+        <w:t xml:space="preserve">if </w:t>
+      </w:r>
+      <w:r>
+        <w:rPr>
+          <w:rFonts w:ascii="Arial" w:hAnsi="Arial" w:cs="Arial"/>
+          <w:sz w:val="24"/>
+          <w:szCs w:val="24"/>
+        </w:rPr>
+        <w:t xml:space="preserve">children | </w:t>
+      </w:r>
+      <w:r>
+        <w:rPr>
+          <w:rFonts w:ascii="Arial" w:hAnsi="Arial" w:cs="Arial"/>
+          <w:sz w:val="24"/>
+          <w:szCs w:val="24"/>
+        </w:rPr>
+        <w:t xml:space="preserve">length &gt; </w:t>
+      </w:r>
+      <w:r>
+        <w:rPr>
+          <w:rFonts w:ascii="Arial" w:hAnsi="Arial" w:cs="Arial"/>
+          <w:sz w:val="24"/>
+          <w:szCs w:val="24"/>
+        </w:rPr>
+        <w:t>3</w:t>
+      </w:r>
+      <w:r>
+        <w:rPr>
+          <w:rFonts w:ascii="Arial" w:hAnsi="Arial" w:cs="Arial"/>
+          <w:sz w:val="24"/>
+          <w:szCs w:val="24"/>
+        </w:rPr>
+        <w:t xml:space="preserve"> </w:t>
+      </w:r>
+      <w:r>
+        <w:rPr>
+          <w:rFonts w:ascii="Arial" w:hAnsi="Arial" w:cs="Arial"/>
+          <w:sz w:val="24"/>
+          <w:szCs w:val="24"/>
+        </w:rPr>
+        <w:t>and</w:t>
+      </w:r>
+      <w:r>
+        <w:rPr>
+          <w:rFonts w:ascii="Arial" w:hAnsi="Arial" w:cs="Arial"/>
+          <w:sz w:val="24"/>
+          <w:szCs w:val="24"/>
+        </w:rPr>
+        <w:t xml:space="preserve"> </w:t>
+      </w:r>
+      <w:proofErr w:type="spellStart"/>
+      <w:r>
+        <w:rPr>
+          <w:rFonts w:ascii="Arial" w:hAnsi="Arial" w:cs="Arial"/>
+          <w:sz w:val="24"/>
+          <w:szCs w:val="24"/>
+        </w:rPr>
+        <w:t>custody_wanted_true_</w:t>
+      </w:r>
+      <w:r>
+        <w:rPr>
+          <w:rFonts w:ascii="Arial" w:hAnsi="Arial" w:cs="Arial"/>
+          <w:sz w:val="24"/>
+          <w:szCs w:val="24"/>
+        </w:rPr>
+        <w:t>overflow</w:t>
+      </w:r>
+      <w:proofErr w:type="spellEnd"/>
+      <w:r>
+        <w:rPr>
+          <w:rFonts w:ascii="Arial" w:hAnsi="Arial" w:cs="Arial"/>
+          <w:sz w:val="24"/>
+          <w:szCs w:val="24"/>
+        </w:rPr>
+        <w:t xml:space="preserve"> </w:t>
+      </w:r>
+      <w:r>
+        <w:rPr>
+          <w:rFonts w:ascii="Arial" w:hAnsi="Arial" w:cs="Arial"/>
+          <w:sz w:val="24"/>
+          <w:szCs w:val="24"/>
+        </w:rPr>
+        <w:t>%}</w:t>
+      </w:r>
+    </w:p>
+    <w:p>
+      <w:pPr>
         <w:pStyle w:val="Heading2"/>
         <w:rPr>
           <w:rFonts w:ascii="Arial" w:hAnsi="Arial" w:cs="Arial"/>
@@ -350,7 +554,47 @@
           <w:sz w:val="24"/>
           <w:szCs w:val="24"/>
         </w:rPr>
-        <w:t>Additional children</w:t>
+        <w:t xml:space="preserve">Additional </w:t>
+      </w:r>
+      <w:r>
+        <w:rPr>
+          <w:rFonts w:ascii="Arial" w:hAnsi="Arial" w:cs="Arial"/>
+          <w:sz w:val="24"/>
+          <w:szCs w:val="24"/>
+        </w:rPr>
+        <w:t>children</w:t>
+      </w:r>
+      <w:r>
+        <w:rPr>
+          <w:rFonts w:ascii="Arial" w:hAnsi="Arial" w:cs="Arial"/>
+          <w:sz w:val="24"/>
+          <w:szCs w:val="24"/>
+        </w:rPr>
+        <w:t xml:space="preserve"> </w:t>
+      </w:r>
+      <w:r>
+        <w:rPr>
+          <w:rFonts w:ascii="Arial" w:hAnsi="Arial" w:cs="Arial"/>
+          <w:sz w:val="24"/>
+          <w:szCs w:val="24"/>
+        </w:rPr>
+        <w:t>and</w:t>
+      </w:r>
+      <w:r>
+        <w:rPr>
+          <w:rFonts w:ascii="Arial" w:hAnsi="Arial" w:cs="Arial"/>
+          <w:sz w:val="24"/>
+          <w:szCs w:val="24"/>
+        </w:rPr>
+        <w:t xml:space="preserve"> </w:t>
+      </w:r>
+      <w:r>
+        <w:rPr>
+          <w:rFonts w:ascii="Arial" w:hAnsi="Arial" w:cs="Arial"/>
+          <w:sz w:val="24"/>
+          <w:szCs w:val="24"/>
+        </w:rPr>
+        <w:t>custody</w:t>
       </w:r>
     </w:p>
     <w:tbl>
@@ -465,7 +709,16 @@
                 <w:sz w:val="20"/>
                 <w:szCs w:val="20"/>
               </w:rPr>
-              <w:t>Relationship to petitioner</w:t>
+              <w:t xml:space="preserve">Relationship to </w:t>
+            </w:r>
+            <w:r>
+              <w:rPr>
+                <w:rFonts w:ascii="Arial" w:eastAsia="Calibri" w:hAnsi="Arial" w:cs="Arial"/>
+                <w:b/>
+                <w:sz w:val="20"/>
+                <w:szCs w:val="20"/>
+              </w:rPr>
+              <w:t>plaintiff</w:t>
             </w:r>
           </w:p>
         </w:tc>
@@ -533,25 +786,7 @@
                 <w:sz w:val="20"/>
                 <w:szCs w:val="20"/>
               </w:rPr>
-              <w:t>/</w:t>
-            </w:r>
-            <w:r>
-              <w:rPr>
-                <w:rFonts w:ascii="Arial" w:eastAsia="Calibri" w:hAnsi="Arial" w:cs="Arial"/>
-                <w:b/>
-                <w:sz w:val="20"/>
-                <w:szCs w:val="20"/>
-              </w:rPr>
-              <w:t xml:space="preserve"> </w:t>
-            </w:r>
-            <w:r>
-              <w:rPr>
-                <w:rFonts w:ascii="Arial" w:eastAsia="Calibri" w:hAnsi="Arial" w:cs="Arial"/>
-                <w:b/>
-                <w:sz w:val="20"/>
-                <w:szCs w:val="20"/>
-              </w:rPr>
-              <w:t>petitioner wants custody?</w:t>
+              <w:t>wants custody?</w:t>
             </w:r>
           </w:p>
         </w:tc>
@@ -575,7 +810,25 @@
                 <w:sz w:val="20"/>
                 <w:szCs w:val="20"/>
               </w:rPr>
-              <w:t>{%tr for row in field.overflow_value() %}</w:t>
+              <w:t xml:space="preserve">{%tr for row in </w:t>
+            </w:r>
+            <w:proofErr w:type="spellStart"/>
+            <w:r>
+              <w:rPr>
+                <w:rFonts w:ascii="Arial" w:eastAsia="Calibri" w:hAnsi="Arial" w:cs="Arial"/>
+                <w:sz w:val="20"/>
+                <w:szCs w:val="20"/>
+              </w:rPr>
+              <w:t>field.overflow_value</w:t>
+            </w:r>
+            <w:proofErr w:type="spellEnd"/>
+            <w:r>
+              <w:rPr>
+                <w:rFonts w:ascii="Arial" w:eastAsia="Calibri" w:hAnsi="Arial" w:cs="Arial"/>
+                <w:sz w:val="20"/>
+                <w:szCs w:val="20"/>
+              </w:rPr>
+              <w:t>() %}</w:t>
             </w:r>
           </w:p>
         </w:tc>
@@ -699,6 +952,7 @@
               </w:rPr>
               <w:t>{{</w:t>
             </w:r>
+            <w:proofErr w:type="spellStart"/>
             <w:r>
               <w:rPr>
                 <w:rFonts w:ascii="Arial" w:eastAsia="Calibri" w:hAnsi="Arial" w:cs="Arial"/>
@@ -713,7 +967,16 @@
                 <w:sz w:val="20"/>
                 <w:szCs w:val="20"/>
               </w:rPr>
-              <w:t>e.</w:t>
+              <w:t>e</w:t>
+            </w:r>
+            <w:proofErr w:type="spellEnd"/>
+            <w:r>
+              <w:rPr>
+                <w:rFonts w:ascii="Arial" w:eastAsia="Calibri" w:hAnsi="Arial" w:cs="Arial"/>
+                <w:sz w:val="20"/>
+                <w:szCs w:val="20"/>
+              </w:rPr>
+              <w:t>.</w:t>
             </w:r>
             <w:r>
               <w:rPr>
@@ -725,13 +988,23 @@
               </w:rPr>
               <w:t xml:space="preserve"> </w:t>
             </w:r>
-            <w:r>
-              <w:rPr>
-                <w:rFonts w:ascii="Arial" w:eastAsia="Calibri" w:hAnsi="Arial" w:cs="Arial"/>
-                <w:sz w:val="20"/>
-                <w:szCs w:val="20"/>
-              </w:rPr>
-              <w:t>strftime('%</w:t>
+            <w:proofErr w:type="spellStart"/>
+            <w:r>
+              <w:rPr>
+                <w:rFonts w:ascii="Arial" w:eastAsia="Calibri" w:hAnsi="Arial" w:cs="Arial"/>
+                <w:sz w:val="20"/>
+                <w:szCs w:val="20"/>
+              </w:rPr>
+              <w:t>strftime</w:t>
+            </w:r>
+            <w:proofErr w:type="spellEnd"/>
+            <w:r>
+              <w:rPr>
+                <w:rFonts w:ascii="Arial" w:eastAsia="Calibri" w:hAnsi="Arial" w:cs="Arial"/>
+                <w:sz w:val="20"/>
+                <w:szCs w:val="20"/>
+              </w:rPr>
+              <w:t>('%</w:t>
             </w:r>
             <w:r>
               <w:rPr>
@@ -830,13 +1103,23 @@
               </w:rPr>
               <w:t xml:space="preserve">“Yes” if </w:t>
             </w:r>
-            <w:r>
-              <w:rPr>
-                <w:rFonts w:ascii="Arial" w:eastAsia="Calibri" w:hAnsi="Arial" w:cs="Arial"/>
-                <w:sz w:val="20"/>
-                <w:szCs w:val="20"/>
-              </w:rPr>
-              <w:t xml:space="preserve">row.in_danger </w:t>
+            <w:proofErr w:type="spellStart"/>
+            <w:r>
+              <w:rPr>
+                <w:rFonts w:ascii="Arial" w:eastAsia="Calibri" w:hAnsi="Arial" w:cs="Arial"/>
+                <w:sz w:val="20"/>
+                <w:szCs w:val="20"/>
+              </w:rPr>
+              <w:t>row.in_danger</w:t>
+            </w:r>
+            <w:proofErr w:type="spellEnd"/>
+            <w:r>
+              <w:rPr>
+                <w:rFonts w:ascii="Arial" w:eastAsia="Calibri" w:hAnsi="Arial" w:cs="Arial"/>
+                <w:sz w:val="20"/>
+                <w:szCs w:val="20"/>
+              </w:rPr>
+              <w:t xml:space="preserve"> </w:t>
             </w:r>
             <w:r>
               <w:rPr>
@@ -938,7 +1221,16 @@
                 <w:sz w:val="20"/>
                 <w:szCs w:val="20"/>
               </w:rPr>
-              <w:t>{{ row.relationship_</w:t>
+              <w:t xml:space="preserve">{{ </w:t>
+            </w:r>
+            <w:proofErr w:type="spellStart"/>
+            <w:r>
+              <w:rPr>
+                <w:rFonts w:ascii="Arial" w:hAnsi="Arial" w:cs="Arial"/>
+                <w:sz w:val="20"/>
+                <w:szCs w:val="20"/>
+              </w:rPr>
+              <w:t>row.relationship_</w:t>
             </w:r>
             <w:r>
               <w:rPr>
@@ -948,6 +1240,7 @@
               </w:rPr>
               <w:t>OP</w:t>
             </w:r>
+            <w:proofErr w:type="spellEnd"/>
             <w:r>
               <w:rPr>
                 <w:rFonts w:ascii="Arial" w:hAnsi="Arial" w:cs="Arial"/>
@@ -1003,6 +1296,7 @@
               </w:rPr>
               <w:t xml:space="preserve">“Yes” if </w:t>
             </w:r>
+            <w:proofErr w:type="spellStart"/>
             <w:r>
               <w:rPr>
                 <w:rFonts w:ascii="Arial" w:hAnsi="Arial" w:cs="Arial"/>
@@ -1011,6 +1305,7 @@
               </w:rPr>
               <w:t>row.custody_wanted</w:t>
             </w:r>
+            <w:proofErr w:type="spellEnd"/>
             <w:r>
               <w:rPr>
                 <w:rFonts w:ascii="Arial" w:eastAsia="Calibri" w:hAnsi="Arial" w:cs="Arial"/>
@@ -1049,7 +1344,25 @@
                 <w:sz w:val="20"/>
                 <w:szCs w:val="20"/>
               </w:rPr>
-              <w:t>{%tr endfor %}</w:t>
+              <w:t xml:space="preserve">{%tr </w:t>
+            </w:r>
+            <w:proofErr w:type="spellStart"/>
+            <w:r>
+              <w:rPr>
+                <w:rFonts w:ascii="Arial" w:eastAsia="Calibri" w:hAnsi="Arial" w:cs="Arial"/>
+                <w:sz w:val="20"/>
+                <w:szCs w:val="20"/>
+              </w:rPr>
+              <w:t>endfor</w:t>
+            </w:r>
+            <w:proofErr w:type="spellEnd"/>
+            <w:r>
+              <w:rPr>
+                <w:rFonts w:ascii="Arial" w:eastAsia="Calibri" w:hAnsi="Arial" w:cs="Arial"/>
+                <w:sz w:val="20"/>
+                <w:szCs w:val="20"/>
+              </w:rPr>
+              <w:t xml:space="preserve"> %}</w:t>
             </w:r>
           </w:p>
         </w:tc>
@@ -1155,6 +1468,7 @@
         </w:rPr>
         <w:t xml:space="preserve">{%p </w:t>
       </w:r>
+      <w:proofErr w:type="spellStart"/>
       <w:r>
         <w:rPr>
           <w:rFonts w:ascii="Arial" w:hAnsi="Arial" w:cs="Arial"/>
@@ -1169,7 +1483,32 @@
           <w:sz w:val="24"/>
           <w:szCs w:val="24"/>
         </w:rPr>
-        <w:t xml:space="preserve">if field.is_object_list() %} </w:t>
+        <w:t>if</w:t>
+      </w:r>
+      <w:proofErr w:type="spellEnd"/>
+      <w:r>
+        <w:rPr>
+          <w:rFonts w:ascii="Arial" w:hAnsi="Arial" w:cs="Arial"/>
+          <w:sz w:val="24"/>
+          <w:szCs w:val="24"/>
+        </w:rPr>
+        <w:t xml:space="preserve"> </w:t>
+      </w:r>
+      <w:r>
+        <w:rPr>
+          <w:rFonts w:ascii="Arial" w:hAnsi="Arial" w:cs="Arial"/>
+          <w:sz w:val="24"/>
+          <w:szCs w:val="24"/>
+        </w:rPr>
+        <w:t xml:space="preserve">children | length &gt; 4 </w:t>
+      </w:r>
+      <w:r>
+        <w:rPr>
+          <w:rFonts w:ascii="Arial" w:hAnsi="Arial" w:cs="Arial"/>
+          <w:sz w:val="24"/>
+          <w:szCs w:val="24"/>
+        </w:rPr>
+        <w:t>%}</w:t>
       </w:r>
     </w:p>
     <w:p>
@@ -1187,7 +1526,781 @@
           <w:sz w:val="24"/>
           <w:szCs w:val="24"/>
         </w:rPr>
-        <w:t>{{ field.</w:t>
+        <w:t>Additional children</w:t>
+      </w:r>
+    </w:p>
+    <w:tbl>
+      <w:tblPr>
+        <w:tblStyle w:val="TableGrid"/>
+        <w:tblW w:w="8005" w:type="dxa"/>
+        <w:tblLayout w:type="fixed"/>
+        <w:tblLook w:val="04A0" w:firstRow="1" w:lastRow="0" w:firstColumn="1" w:lastColumn="0" w:noHBand="0" w:noVBand="1"/>
+      </w:tblPr>
+      <w:tblGrid>
+        <w:gridCol w:w="1795"/>
+        <w:gridCol w:w="1260"/>
+        <w:gridCol w:w="1260"/>
+        <w:gridCol w:w="1800"/>
+        <w:gridCol w:w="1890"/>
+      </w:tblGrid>
+      <w:tr>
+        <w:tc>
+          <w:tcPr>
+            <w:tcW w:w="1795" w:type="dxa"/>
+          </w:tcPr>
+          <w:p>
+            <w:pPr>
+              <w:widowControl w:val="0"/>
+              <w:rPr>
+                <w:rFonts w:ascii="Arial" w:hAnsi="Arial" w:cs="Arial"/>
+                <w:b/>
+                <w:sz w:val="20"/>
+                <w:szCs w:val="20"/>
+              </w:rPr>
+            </w:pPr>
+            <w:r>
+              <w:rPr>
+                <w:rFonts w:ascii="Arial" w:eastAsia="Calibri" w:hAnsi="Arial" w:cs="Arial"/>
+                <w:b/>
+                <w:sz w:val="20"/>
+                <w:szCs w:val="20"/>
+              </w:rPr>
+              <w:t>Name</w:t>
+            </w:r>
+          </w:p>
+        </w:tc>
+        <w:tc>
+          <w:tcPr>
+            <w:tcW w:w="1260" w:type="dxa"/>
+          </w:tcPr>
+          <w:p>
+            <w:pPr>
+              <w:widowControl w:val="0"/>
+              <w:rPr>
+                <w:rFonts w:ascii="Arial" w:eastAsia="Calibri" w:hAnsi="Arial" w:cs="Arial"/>
+                <w:b/>
+                <w:sz w:val="20"/>
+                <w:szCs w:val="20"/>
+              </w:rPr>
+            </w:pPr>
+            <w:r>
+              <w:rPr>
+                <w:rFonts w:ascii="Arial" w:eastAsia="Calibri" w:hAnsi="Arial" w:cs="Arial"/>
+                <w:b/>
+                <w:sz w:val="20"/>
+                <w:szCs w:val="20"/>
+              </w:rPr>
+              <w:t>Born</w:t>
+            </w:r>
+          </w:p>
+        </w:tc>
+        <w:tc>
+          <w:tcPr>
+            <w:tcW w:w="1260" w:type="dxa"/>
+          </w:tcPr>
+          <w:p>
+            <w:pPr>
+              <w:widowControl w:val="0"/>
+              <w:rPr>
+                <w:rFonts w:ascii="Arial" w:eastAsia="Calibri" w:hAnsi="Arial" w:cs="Arial"/>
+                <w:b/>
+                <w:sz w:val="20"/>
+                <w:szCs w:val="20"/>
+              </w:rPr>
+            </w:pPr>
+            <w:r>
+              <w:rPr>
+                <w:rFonts w:ascii="Arial" w:eastAsia="Calibri" w:hAnsi="Arial" w:cs="Arial"/>
+                <w:b/>
+                <w:sz w:val="20"/>
+                <w:szCs w:val="20"/>
+              </w:rPr>
+              <w:t>In danger?</w:t>
+            </w:r>
+          </w:p>
+        </w:tc>
+        <w:tc>
+          <w:tcPr>
+            <w:tcW w:w="1800" w:type="dxa"/>
+          </w:tcPr>
+          <w:p>
+            <w:pPr>
+              <w:widowControl w:val="0"/>
+              <w:rPr>
+                <w:rFonts w:ascii="Arial" w:eastAsia="Calibri" w:hAnsi="Arial" w:cs="Arial"/>
+                <w:b/>
+                <w:sz w:val="20"/>
+                <w:szCs w:val="20"/>
+              </w:rPr>
+            </w:pPr>
+            <w:r>
+              <w:rPr>
+                <w:rFonts w:ascii="Arial" w:eastAsia="Calibri" w:hAnsi="Arial" w:cs="Arial"/>
+                <w:b/>
+                <w:sz w:val="20"/>
+                <w:szCs w:val="20"/>
+              </w:rPr>
+              <w:t xml:space="preserve">Relationship to </w:t>
+            </w:r>
+            <w:r>
+              <w:rPr>
+                <w:rFonts w:ascii="Arial" w:eastAsia="Calibri" w:hAnsi="Arial" w:cs="Arial"/>
+                <w:b/>
+                <w:sz w:val="20"/>
+                <w:szCs w:val="20"/>
+              </w:rPr>
+              <w:t>plaintiff</w:t>
+            </w:r>
+          </w:p>
+        </w:tc>
+        <w:tc>
+          <w:tcPr>
+            <w:tcW w:w="1890" w:type="dxa"/>
+          </w:tcPr>
+          <w:p>
+            <w:pPr>
+              <w:widowControl w:val="0"/>
+              <w:rPr>
+                <w:rFonts w:ascii="Arial" w:eastAsia="Calibri" w:hAnsi="Arial" w:cs="Arial"/>
+                <w:b/>
+                <w:sz w:val="20"/>
+                <w:szCs w:val="20"/>
+              </w:rPr>
+            </w:pPr>
+            <w:r>
+              <w:rPr>
+                <w:rFonts w:ascii="Arial" w:eastAsia="Calibri" w:hAnsi="Arial" w:cs="Arial"/>
+                <w:b/>
+                <w:sz w:val="20"/>
+                <w:szCs w:val="20"/>
+              </w:rPr>
+              <w:t>Relationship to defendant</w:t>
+            </w:r>
+          </w:p>
+        </w:tc>
+      </w:tr>
+      <w:tr>
+        <w:tc>
+          <w:tcPr>
+            <w:tcW w:w="1795" w:type="dxa"/>
+          </w:tcPr>
+          <w:p>
+            <w:pPr>
+              <w:rPr>
+                <w:rFonts w:ascii="Arial" w:hAnsi="Arial" w:cs="Arial"/>
+                <w:sz w:val="20"/>
+                <w:szCs w:val="20"/>
+              </w:rPr>
+            </w:pPr>
+            <w:r>
+              <w:rPr>
+                <w:rFonts w:ascii="Arial" w:eastAsia="Calibri" w:hAnsi="Arial" w:cs="Arial"/>
+                <w:sz w:val="20"/>
+                <w:szCs w:val="20"/>
+              </w:rPr>
+              <w:t xml:space="preserve">{%tr for row in </w:t>
+            </w:r>
+            <w:proofErr w:type="spellStart"/>
+            <w:r>
+              <w:rPr>
+                <w:rFonts w:ascii="Arial" w:eastAsia="Calibri" w:hAnsi="Arial" w:cs="Arial"/>
+                <w:sz w:val="20"/>
+                <w:szCs w:val="20"/>
+              </w:rPr>
+              <w:t>field.overflow_value</w:t>
+            </w:r>
+            <w:proofErr w:type="spellEnd"/>
+            <w:r>
+              <w:rPr>
+                <w:rFonts w:ascii="Arial" w:eastAsia="Calibri" w:hAnsi="Arial" w:cs="Arial"/>
+                <w:sz w:val="20"/>
+                <w:szCs w:val="20"/>
+              </w:rPr>
+              <w:t>() %}</w:t>
+            </w:r>
+          </w:p>
+        </w:tc>
+        <w:tc>
+          <w:tcPr>
+            <w:tcW w:w="1260" w:type="dxa"/>
+          </w:tcPr>
+          <w:p>
+            <w:pPr>
+              <w:widowControl w:val="0"/>
+              <w:rPr>
+                <w:rFonts w:ascii="Arial" w:eastAsia="Calibri" w:hAnsi="Arial" w:cs="Arial"/>
+                <w:sz w:val="20"/>
+                <w:szCs w:val="20"/>
+              </w:rPr>
+            </w:pPr>
+          </w:p>
+        </w:tc>
+        <w:tc>
+          <w:tcPr>
+            <w:tcW w:w="1260" w:type="dxa"/>
+          </w:tcPr>
+          <w:p>
+            <w:pPr>
+              <w:widowControl w:val="0"/>
+              <w:rPr>
+                <w:rFonts w:ascii="Arial" w:eastAsia="Calibri" w:hAnsi="Arial" w:cs="Arial"/>
+                <w:sz w:val="20"/>
+                <w:szCs w:val="20"/>
+              </w:rPr>
+            </w:pPr>
+          </w:p>
+        </w:tc>
+        <w:tc>
+          <w:tcPr>
+            <w:tcW w:w="1800" w:type="dxa"/>
+          </w:tcPr>
+          <w:p>
+            <w:pPr>
+              <w:widowControl w:val="0"/>
+              <w:rPr>
+                <w:rFonts w:ascii="Arial" w:eastAsia="Calibri" w:hAnsi="Arial" w:cs="Arial"/>
+                <w:sz w:val="20"/>
+                <w:szCs w:val="20"/>
+              </w:rPr>
+            </w:pPr>
+          </w:p>
+        </w:tc>
+        <w:tc>
+          <w:tcPr>
+            <w:tcW w:w="1890" w:type="dxa"/>
+          </w:tcPr>
+          <w:p>
+            <w:pPr>
+              <w:widowControl w:val="0"/>
+              <w:rPr>
+                <w:rFonts w:ascii="Arial" w:eastAsia="Calibri" w:hAnsi="Arial" w:cs="Arial"/>
+                <w:sz w:val="20"/>
+                <w:szCs w:val="20"/>
+              </w:rPr>
+            </w:pPr>
+          </w:p>
+        </w:tc>
+      </w:tr>
+      <w:tr>
+        <w:tc>
+          <w:tcPr>
+            <w:tcW w:w="1795" w:type="dxa"/>
+          </w:tcPr>
+          <w:p>
+            <w:pPr>
+              <w:rPr>
+                <w:rFonts w:ascii="Arial" w:hAnsi="Arial" w:cs="Arial"/>
+                <w:sz w:val="24"/>
+                <w:szCs w:val="24"/>
+              </w:rPr>
+            </w:pPr>
+            <w:r>
+              <w:rPr>
+                <w:rFonts w:ascii="Arial" w:eastAsia="Calibri" w:hAnsi="Arial" w:cs="Arial"/>
+                <w:sz w:val="24"/>
+                <w:szCs w:val="24"/>
+              </w:rPr>
+              <w:t>{{ row.name }}</w:t>
+            </w:r>
+          </w:p>
+        </w:tc>
+        <w:tc>
+          <w:tcPr>
+            <w:tcW w:w="1260" w:type="dxa"/>
+          </w:tcPr>
+          <w:p>
+            <w:pPr>
+              <w:widowControl w:val="0"/>
+              <w:rPr>
+                <w:rFonts w:ascii="Arial" w:eastAsia="Calibri" w:hAnsi="Arial" w:cs="Arial"/>
+                <w:sz w:val="20"/>
+                <w:szCs w:val="20"/>
+              </w:rPr>
+            </w:pPr>
+            <w:r>
+              <w:rPr>
+                <w:rFonts w:ascii="Arial" w:eastAsia="Calibri" w:hAnsi="Arial" w:cs="Arial"/>
+                <w:sz w:val="20"/>
+                <w:szCs w:val="20"/>
+              </w:rPr>
+              <w:t>{{</w:t>
+            </w:r>
+            <w:proofErr w:type="spellStart"/>
+            <w:r>
+              <w:rPr>
+                <w:rFonts w:ascii="Arial" w:eastAsia="Calibri" w:hAnsi="Arial" w:cs="Arial"/>
+                <w:sz w:val="20"/>
+                <w:szCs w:val="20"/>
+              </w:rPr>
+              <w:t>row.birthdate</w:t>
+            </w:r>
+            <w:proofErr w:type="spellEnd"/>
+            <w:r>
+              <w:rPr>
+                <w:rFonts w:ascii="Arial" w:eastAsia="Calibri" w:hAnsi="Arial" w:cs="Arial"/>
+                <w:sz w:val="20"/>
+                <w:szCs w:val="20"/>
+              </w:rPr>
+              <w:t>.</w:t>
+            </w:r>
+            <w:r>
+              <w:rPr>
+                <w:rFonts w:ascii="inherit" w:eastAsia="Times New Roman" w:hAnsi="inherit" w:cs="Courier New"/>
+                <w:color w:val="0C0D0E"/>
+                <w:sz w:val="20"/>
+                <w:szCs w:val="20"/>
+                <w:bdr w:val="none" w:sz="0" w:space="0" w:color="auto" w:frame="1"/>
+              </w:rPr>
+              <w:t xml:space="preserve"> </w:t>
+            </w:r>
+            <w:proofErr w:type="spellStart"/>
+            <w:r>
+              <w:rPr>
+                <w:rFonts w:ascii="Arial" w:eastAsia="Calibri" w:hAnsi="Arial" w:cs="Arial"/>
+                <w:sz w:val="20"/>
+                <w:szCs w:val="20"/>
+              </w:rPr>
+              <w:t>strftime</w:t>
+            </w:r>
+            <w:proofErr w:type="spellEnd"/>
+            <w:r>
+              <w:rPr>
+                <w:rFonts w:ascii="Arial" w:eastAsia="Calibri" w:hAnsi="Arial" w:cs="Arial"/>
+                <w:sz w:val="20"/>
+                <w:szCs w:val="20"/>
+              </w:rPr>
+              <w:t>('%m/%d/%Y')</w:t>
+            </w:r>
+          </w:p>
+          <w:p>
+            <w:pPr>
+              <w:widowControl w:val="0"/>
+              <w:rPr>
+                <w:rFonts w:ascii="Arial" w:hAnsi="Arial" w:cs="Arial"/>
+                <w:sz w:val="20"/>
+                <w:szCs w:val="20"/>
+              </w:rPr>
+            </w:pPr>
+            <w:r>
+              <w:rPr>
+                <w:rFonts w:ascii="Arial" w:eastAsia="Calibri" w:hAnsi="Arial" w:cs="Arial"/>
+                <w:sz w:val="20"/>
+                <w:szCs w:val="20"/>
+              </w:rPr>
+              <w:t>}}</w:t>
+            </w:r>
+          </w:p>
+        </w:tc>
+        <w:tc>
+          <w:tcPr>
+            <w:tcW w:w="1260" w:type="dxa"/>
+          </w:tcPr>
+          <w:p>
+            <w:pPr>
+              <w:widowControl w:val="0"/>
+              <w:rPr>
+                <w:rFonts w:ascii="Arial" w:hAnsi="Arial" w:cs="Arial"/>
+                <w:sz w:val="20"/>
+                <w:szCs w:val="20"/>
+              </w:rPr>
+            </w:pPr>
+            <w:r>
+              <w:rPr>
+                <w:rFonts w:ascii="Arial" w:eastAsia="Calibri" w:hAnsi="Arial" w:cs="Arial"/>
+                <w:sz w:val="20"/>
+                <w:szCs w:val="20"/>
+              </w:rPr>
+              <w:t xml:space="preserve">{{ </w:t>
+            </w:r>
+            <w:r>
+              <w:rPr>
+                <w:rFonts w:ascii="Arial" w:eastAsia="Calibri" w:hAnsi="Arial" w:cs="Arial"/>
+                <w:sz w:val="20"/>
+                <w:szCs w:val="20"/>
+              </w:rPr>
+              <w:t xml:space="preserve">“Yes” if </w:t>
+            </w:r>
+            <w:proofErr w:type="spellStart"/>
+            <w:r>
+              <w:rPr>
+                <w:rFonts w:ascii="Arial" w:eastAsia="Calibri" w:hAnsi="Arial" w:cs="Arial"/>
+                <w:sz w:val="20"/>
+                <w:szCs w:val="20"/>
+              </w:rPr>
+              <w:t>row.in_danger</w:t>
+            </w:r>
+            <w:proofErr w:type="spellEnd"/>
+            <w:r>
+              <w:rPr>
+                <w:rFonts w:ascii="Arial" w:eastAsia="Calibri" w:hAnsi="Arial" w:cs="Arial"/>
+                <w:sz w:val="20"/>
+                <w:szCs w:val="20"/>
+              </w:rPr>
+              <w:t xml:space="preserve"> </w:t>
+            </w:r>
+            <w:r>
+              <w:rPr>
+                <w:rFonts w:ascii="Arial" w:eastAsia="Calibri" w:hAnsi="Arial" w:cs="Arial"/>
+                <w:sz w:val="20"/>
+                <w:szCs w:val="20"/>
+              </w:rPr>
+              <w:t>else “No”</w:t>
+            </w:r>
+            <w:r>
+              <w:rPr>
+                <w:rFonts w:ascii="Arial" w:eastAsia="Calibri" w:hAnsi="Arial" w:cs="Arial"/>
+                <w:sz w:val="20"/>
+                <w:szCs w:val="20"/>
+              </w:rPr>
+              <w:t>}}</w:t>
+            </w:r>
+          </w:p>
+        </w:tc>
+        <w:tc>
+          <w:tcPr>
+            <w:tcW w:w="1800" w:type="dxa"/>
+          </w:tcPr>
+          <w:p>
+            <w:pPr>
+              <w:widowControl w:val="0"/>
+              <w:rPr>
+                <w:rFonts w:ascii="Arial" w:hAnsi="Arial" w:cs="Arial"/>
+                <w:sz w:val="20"/>
+                <w:szCs w:val="20"/>
+              </w:rPr>
+            </w:pPr>
+            <w:r>
+              <w:rPr>
+                <w:rFonts w:ascii="Arial" w:hAnsi="Arial" w:cs="Arial"/>
+                <w:sz w:val="20"/>
+                <w:szCs w:val="20"/>
+              </w:rPr>
+              <w:t>{{ row.relationship_user</w:t>
+            </w:r>
+            <w:r>
+              <w:rPr>
+                <w:rFonts w:ascii="Arial" w:hAnsi="Arial" w:cs="Arial"/>
+                <w:sz w:val="20"/>
+                <w:szCs w:val="20"/>
+              </w:rPr>
+              <w:t>s</w:t>
+            </w:r>
+            <w:r>
+              <w:rPr>
+                <w:rFonts w:ascii="Arial" w:hAnsi="Arial" w:cs="Arial"/>
+                <w:sz w:val="20"/>
+                <w:szCs w:val="20"/>
+              </w:rPr>
+              <w:t>1</w:t>
+            </w:r>
+            <w:r>
+              <w:rPr>
+                <w:rFonts w:ascii="Arial" w:hAnsi="Arial" w:cs="Arial"/>
+                <w:sz w:val="20"/>
+                <w:szCs w:val="20"/>
+              </w:rPr>
+              <w:t xml:space="preserve"> </w:t>
+            </w:r>
+            <w:r>
+              <w:rPr>
+                <w:rFonts w:ascii="Arial" w:hAnsi="Arial" w:cs="Arial"/>
+                <w:sz w:val="20"/>
+                <w:szCs w:val="20"/>
+              </w:rPr>
+              <w:t>| capitalize</w:t>
+            </w:r>
+            <w:r>
+              <w:rPr>
+                <w:rFonts w:ascii="Arial" w:hAnsi="Arial" w:cs="Arial"/>
+                <w:sz w:val="20"/>
+                <w:szCs w:val="20"/>
+              </w:rPr>
+              <w:t>}}</w:t>
+            </w:r>
+          </w:p>
+        </w:tc>
+        <w:tc>
+          <w:tcPr>
+            <w:tcW w:w="1890" w:type="dxa"/>
+          </w:tcPr>
+          <w:p>
+            <w:pPr>
+              <w:widowControl w:val="0"/>
+              <w:rPr>
+                <w:rFonts w:ascii="Arial" w:eastAsia="Calibri" w:hAnsi="Arial" w:cs="Arial"/>
+                <w:sz w:val="20"/>
+                <w:szCs w:val="20"/>
+              </w:rPr>
+            </w:pPr>
+            <w:r>
+              <w:rPr>
+                <w:rFonts w:ascii="Arial" w:hAnsi="Arial" w:cs="Arial"/>
+                <w:sz w:val="20"/>
+                <w:szCs w:val="20"/>
+              </w:rPr>
+              <w:t xml:space="preserve">{{ </w:t>
+            </w:r>
+            <w:proofErr w:type="spellStart"/>
+            <w:r>
+              <w:rPr>
+                <w:rFonts w:ascii="Arial" w:hAnsi="Arial" w:cs="Arial"/>
+                <w:sz w:val="20"/>
+                <w:szCs w:val="20"/>
+              </w:rPr>
+              <w:t>row.relationship_</w:t>
+            </w:r>
+            <w:r>
+              <w:rPr>
+                <w:rFonts w:ascii="Arial" w:hAnsi="Arial" w:cs="Arial"/>
+                <w:sz w:val="20"/>
+                <w:szCs w:val="20"/>
+              </w:rPr>
+              <w:t>OP</w:t>
+            </w:r>
+            <w:proofErr w:type="spellEnd"/>
+            <w:r>
+              <w:rPr>
+                <w:rFonts w:ascii="Arial" w:hAnsi="Arial" w:cs="Arial"/>
+                <w:sz w:val="20"/>
+                <w:szCs w:val="20"/>
+              </w:rPr>
+              <w:t xml:space="preserve"> </w:t>
+            </w:r>
+            <w:r>
+              <w:rPr>
+                <w:rFonts w:ascii="Arial" w:hAnsi="Arial" w:cs="Arial"/>
+                <w:sz w:val="20"/>
+                <w:szCs w:val="20"/>
+              </w:rPr>
+              <w:t>| capitalize</w:t>
+            </w:r>
+            <w:r>
+              <w:rPr>
+                <w:rFonts w:ascii="Arial" w:hAnsi="Arial" w:cs="Arial"/>
+                <w:sz w:val="20"/>
+                <w:szCs w:val="20"/>
+              </w:rPr>
+              <w:t>}}</w:t>
+            </w:r>
+          </w:p>
+        </w:tc>
+      </w:tr>
+      <w:tr>
+        <w:tc>
+          <w:tcPr>
+            <w:tcW w:w="1795" w:type="dxa"/>
+          </w:tcPr>
+          <w:p>
+            <w:pPr>
+              <w:rPr>
+                <w:rFonts w:ascii="Arial" w:hAnsi="Arial" w:cs="Arial"/>
+                <w:sz w:val="20"/>
+                <w:szCs w:val="20"/>
+              </w:rPr>
+            </w:pPr>
+            <w:r>
+              <w:rPr>
+                <w:rFonts w:ascii="Arial" w:eastAsia="Calibri" w:hAnsi="Arial" w:cs="Arial"/>
+                <w:sz w:val="20"/>
+                <w:szCs w:val="20"/>
+              </w:rPr>
+              <w:t xml:space="preserve">{%tr </w:t>
+            </w:r>
+            <w:proofErr w:type="spellStart"/>
+            <w:r>
+              <w:rPr>
+                <w:rFonts w:ascii="Arial" w:eastAsia="Calibri" w:hAnsi="Arial" w:cs="Arial"/>
+                <w:sz w:val="20"/>
+                <w:szCs w:val="20"/>
+              </w:rPr>
+              <w:t>endfor</w:t>
+            </w:r>
+            <w:proofErr w:type="spellEnd"/>
+            <w:r>
+              <w:rPr>
+                <w:rFonts w:ascii="Arial" w:eastAsia="Calibri" w:hAnsi="Arial" w:cs="Arial"/>
+                <w:sz w:val="20"/>
+                <w:szCs w:val="20"/>
+              </w:rPr>
+              <w:t xml:space="preserve"> %}</w:t>
+            </w:r>
+          </w:p>
+        </w:tc>
+        <w:tc>
+          <w:tcPr>
+            <w:tcW w:w="1260" w:type="dxa"/>
+          </w:tcPr>
+          <w:p>
+            <w:pPr>
+              <w:widowControl w:val="0"/>
+              <w:rPr>
+                <w:rFonts w:ascii="Arial" w:eastAsia="Calibri" w:hAnsi="Arial" w:cs="Arial"/>
+                <w:sz w:val="20"/>
+                <w:szCs w:val="20"/>
+              </w:rPr>
+            </w:pPr>
+          </w:p>
+        </w:tc>
+        <w:tc>
+          <w:tcPr>
+            <w:tcW w:w="1260" w:type="dxa"/>
+          </w:tcPr>
+          <w:p>
+            <w:pPr>
+              <w:widowControl w:val="0"/>
+              <w:rPr>
+                <w:rFonts w:ascii="Arial" w:eastAsia="Calibri" w:hAnsi="Arial" w:cs="Arial"/>
+                <w:sz w:val="20"/>
+                <w:szCs w:val="20"/>
+              </w:rPr>
+            </w:pPr>
+          </w:p>
+        </w:tc>
+        <w:tc>
+          <w:tcPr>
+            <w:tcW w:w="1800" w:type="dxa"/>
+          </w:tcPr>
+          <w:p>
+            <w:pPr>
+              <w:widowControl w:val="0"/>
+              <w:rPr>
+                <w:rFonts w:ascii="Arial" w:eastAsia="Calibri" w:hAnsi="Arial" w:cs="Arial"/>
+                <w:sz w:val="20"/>
+                <w:szCs w:val="20"/>
+              </w:rPr>
+            </w:pPr>
+          </w:p>
+        </w:tc>
+        <w:tc>
+          <w:tcPr>
+            <w:tcW w:w="1890" w:type="dxa"/>
+          </w:tcPr>
+          <w:p>
+            <w:pPr>
+              <w:widowControl w:val="0"/>
+              <w:rPr>
+                <w:rFonts w:ascii="Arial" w:eastAsia="Calibri" w:hAnsi="Arial" w:cs="Arial"/>
+                <w:sz w:val="20"/>
+                <w:szCs w:val="20"/>
+              </w:rPr>
+            </w:pPr>
+          </w:p>
+        </w:tc>
+      </w:tr>
+    </w:tbl>
+    <w:p>
+      <w:pPr>
+        <w:rPr>
+          <w:rFonts w:ascii="Arial" w:hAnsi="Arial" w:cs="Arial"/>
+          <w:sz w:val="24"/>
+          <w:szCs w:val="24"/>
+        </w:rPr>
+      </w:pPr>
+      <w:r>
+        <w:rPr>
+          <w:rFonts w:ascii="Arial" w:hAnsi="Arial" w:cs="Arial"/>
+          <w:sz w:val="24"/>
+          <w:szCs w:val="24"/>
+        </w:rPr>
+        <w:lastRenderedPageBreak/>
+        <w:t>{%p endif %}</w:t>
+      </w:r>
+    </w:p>
+    <w:p>
+      <w:pPr>
+        <w:rPr>
+          <w:rFonts w:ascii="Arial" w:hAnsi="Arial" w:cs="Arial"/>
+          <w:sz w:val="24"/>
+          <w:szCs w:val="24"/>
+        </w:rPr>
+      </w:pPr>
+    </w:p>
+    <w:p>
+      <w:pPr>
+        <w:rPr>
+          <w:rFonts w:ascii="Arial" w:hAnsi="Arial" w:cs="Arial"/>
+          <w:sz w:val="24"/>
+          <w:szCs w:val="24"/>
+        </w:rPr>
+      </w:pPr>
+      <w:r>
+        <w:rPr>
+          <w:rFonts w:ascii="Arial" w:hAnsi="Arial" w:cs="Arial"/>
+          <w:sz w:val="24"/>
+          <w:szCs w:val="24"/>
+        </w:rPr>
+        <w:t xml:space="preserve">{%p </w:t>
+      </w:r>
+      <w:proofErr w:type="spellStart"/>
+      <w:r>
+        <w:rPr>
+          <w:rFonts w:ascii="Arial" w:hAnsi="Arial" w:cs="Arial"/>
+          <w:sz w:val="24"/>
+          <w:szCs w:val="24"/>
+        </w:rPr>
+        <w:t>el</w:t>
+      </w:r>
+      <w:r>
+        <w:rPr>
+          <w:rFonts w:ascii="Arial" w:hAnsi="Arial" w:cs="Arial"/>
+          <w:sz w:val="24"/>
+          <w:szCs w:val="24"/>
+        </w:rPr>
+        <w:t>if</w:t>
+      </w:r>
+      <w:proofErr w:type="spellEnd"/>
+      <w:r>
+        <w:rPr>
+          <w:rFonts w:ascii="Arial" w:hAnsi="Arial" w:cs="Arial"/>
+          <w:sz w:val="24"/>
+          <w:szCs w:val="24"/>
+        </w:rPr>
+        <w:t xml:space="preserve"> </w:t>
+      </w:r>
+      <w:proofErr w:type="spellStart"/>
+      <w:r>
+        <w:rPr>
+          <w:rFonts w:ascii="Arial" w:hAnsi="Arial" w:cs="Arial"/>
+          <w:sz w:val="24"/>
+          <w:szCs w:val="24"/>
+        </w:rPr>
+        <w:t>field.is_object_list</w:t>
+      </w:r>
+      <w:proofErr w:type="spellEnd"/>
+      <w:r>
+        <w:rPr>
+          <w:rFonts w:ascii="Arial" w:hAnsi="Arial" w:cs="Arial"/>
+          <w:sz w:val="24"/>
+          <w:szCs w:val="24"/>
+        </w:rPr>
+        <w:t xml:space="preserve">() %} </w:t>
+      </w:r>
+    </w:p>
+    <w:p>
+      <w:pPr>
+        <w:pStyle w:val="Heading2"/>
+        <w:rPr>
+          <w:rFonts w:ascii="Arial" w:hAnsi="Arial" w:cs="Arial"/>
+          <w:sz w:val="24"/>
+          <w:szCs w:val="24"/>
+        </w:rPr>
+      </w:pPr>
+      <w:r>
+        <w:rPr>
+          <w:rFonts w:ascii="Arial" w:hAnsi="Arial" w:cs="Arial"/>
+          <w:sz w:val="24"/>
+          <w:szCs w:val="24"/>
+        </w:rPr>
+        <w:t xml:space="preserve">{{ </w:t>
+      </w:r>
+      <w:proofErr w:type="spellStart"/>
+      <w:r>
+        <w:rPr>
+          <w:rFonts w:ascii="Arial" w:hAnsi="Arial" w:cs="Arial"/>
+          <w:sz w:val="24"/>
+          <w:szCs w:val="24"/>
+        </w:rPr>
+        <w:t>field.</w:t>
       </w:r>
       <w:r>
         <w:rPr>
@@ -1197,6 +2310,7 @@
         </w:rPr>
         <w:t>label</w:t>
       </w:r>
+      <w:proofErr w:type="spellEnd"/>
       <w:r>
         <w:rPr>
           <w:rFonts w:ascii="Arial" w:hAnsi="Arial" w:cs="Arial"/>
@@ -1238,7 +2352,47 @@
                 <w:sz w:val="24"/>
                 <w:szCs w:val="24"/>
               </w:rPr>
-              <w:t>{%tc for column in field.columns() %}</w:t>
+              <w:t>{%</w:t>
+            </w:r>
+            <w:proofErr w:type="spellStart"/>
+            <w:r>
+              <w:rPr>
+                <w:rFonts w:ascii="Arial" w:hAnsi="Arial" w:cs="Arial"/>
+                <w:b/>
+                <w:sz w:val="24"/>
+                <w:szCs w:val="24"/>
+              </w:rPr>
+              <w:t>tc</w:t>
+            </w:r>
+            <w:proofErr w:type="spellEnd"/>
+            <w:r>
+              <w:rPr>
+                <w:rFonts w:ascii="Arial" w:hAnsi="Arial" w:cs="Arial"/>
+                <w:b/>
+                <w:sz w:val="24"/>
+                <w:szCs w:val="24"/>
+              </w:rPr>
+              <w:t xml:space="preserve"> for column in </w:t>
+            </w:r>
+            <w:proofErr w:type="spellStart"/>
+            <w:r>
+              <w:rPr>
+                <w:rFonts w:ascii="Arial" w:hAnsi="Arial" w:cs="Arial"/>
+                <w:b/>
+                <w:sz w:val="24"/>
+                <w:szCs w:val="24"/>
+              </w:rPr>
+              <w:t>field.columns</w:t>
+            </w:r>
+            <w:proofErr w:type="spellEnd"/>
+            <w:r>
+              <w:rPr>
+                <w:rFonts w:ascii="Arial" w:hAnsi="Arial" w:cs="Arial"/>
+                <w:b/>
+                <w:sz w:val="24"/>
+                <w:szCs w:val="24"/>
+              </w:rPr>
+              <w:t>() %}</w:t>
             </w:r>
           </w:p>
         </w:tc>
@@ -1304,7 +2458,47 @@
                 <w:sz w:val="24"/>
                 <w:szCs w:val="24"/>
               </w:rPr>
-              <w:t>{%tc endfor %}</w:t>
+              <w:t>{%</w:t>
+            </w:r>
+            <w:proofErr w:type="spellStart"/>
+            <w:r>
+              <w:rPr>
+                <w:rFonts w:ascii="Arial" w:hAnsi="Arial" w:cs="Arial"/>
+                <w:b/>
+                <w:sz w:val="24"/>
+                <w:szCs w:val="24"/>
+              </w:rPr>
+              <w:t>tc</w:t>
+            </w:r>
+            <w:proofErr w:type="spellEnd"/>
+            <w:r>
+              <w:rPr>
+                <w:rFonts w:ascii="Arial" w:hAnsi="Arial" w:cs="Arial"/>
+                <w:b/>
+                <w:sz w:val="24"/>
+                <w:szCs w:val="24"/>
+              </w:rPr>
+              <w:t xml:space="preserve"> </w:t>
+            </w:r>
+            <w:proofErr w:type="spellStart"/>
+            <w:r>
+              <w:rPr>
+                <w:rFonts w:ascii="Arial" w:hAnsi="Arial" w:cs="Arial"/>
+                <w:b/>
+                <w:sz w:val="24"/>
+                <w:szCs w:val="24"/>
+              </w:rPr>
+              <w:t>endfor</w:t>
+            </w:r>
+            <w:proofErr w:type="spellEnd"/>
+            <w:r>
+              <w:rPr>
+                <w:rFonts w:ascii="Arial" w:hAnsi="Arial" w:cs="Arial"/>
+                <w:b/>
+                <w:sz w:val="24"/>
+                <w:szCs w:val="24"/>
+              </w:rPr>
+              <w:t xml:space="preserve"> %}</w:t>
             </w:r>
           </w:p>
         </w:tc>
@@ -1328,7 +2522,25 @@
                 <w:sz w:val="24"/>
                 <w:szCs w:val="24"/>
               </w:rPr>
-              <w:t>{%tr for row in field.overflow_value() %}</w:t>
+              <w:t xml:space="preserve">{%tr for row in </w:t>
+            </w:r>
+            <w:proofErr w:type="spellStart"/>
+            <w:r>
+              <w:rPr>
+                <w:rFonts w:ascii="Arial" w:hAnsi="Arial" w:cs="Arial"/>
+                <w:sz w:val="24"/>
+                <w:szCs w:val="24"/>
+              </w:rPr>
+              <w:t>field.overflow_value</w:t>
+            </w:r>
+            <w:proofErr w:type="spellEnd"/>
+            <w:r>
+              <w:rPr>
+                <w:rFonts w:ascii="Arial" w:hAnsi="Arial" w:cs="Arial"/>
+                <w:sz w:val="24"/>
+                <w:szCs w:val="24"/>
+              </w:rPr>
+              <w:t>() %}</w:t>
             </w:r>
           </w:p>
         </w:tc>
@@ -1380,7 +2592,43 @@
                 <w:sz w:val="24"/>
                 <w:szCs w:val="24"/>
               </w:rPr>
-              <w:t>{%tc for column in field.columns() %}</w:t>
+              <w:t>{%</w:t>
+            </w:r>
+            <w:proofErr w:type="spellStart"/>
+            <w:r>
+              <w:rPr>
+                <w:rFonts w:ascii="Arial" w:hAnsi="Arial" w:cs="Arial"/>
+                <w:sz w:val="24"/>
+                <w:szCs w:val="24"/>
+              </w:rPr>
+              <w:t>tc</w:t>
+            </w:r>
+            <w:proofErr w:type="spellEnd"/>
+            <w:r>
+              <w:rPr>
+                <w:rFonts w:ascii="Arial" w:hAnsi="Arial" w:cs="Arial"/>
+                <w:sz w:val="24"/>
+                <w:szCs w:val="24"/>
+              </w:rPr>
+              <w:t xml:space="preserve"> for column in </w:t>
+            </w:r>
+            <w:proofErr w:type="spellStart"/>
+            <w:r>
+              <w:rPr>
+                <w:rFonts w:ascii="Arial" w:hAnsi="Arial" w:cs="Arial"/>
+                <w:sz w:val="24"/>
+                <w:szCs w:val="24"/>
+              </w:rPr>
+              <w:t>field.columns</w:t>
+            </w:r>
+            <w:proofErr w:type="spellEnd"/>
+            <w:r>
+              <w:rPr>
+                <w:rFonts w:ascii="Arial" w:hAnsi="Arial" w:cs="Arial"/>
+                <w:sz w:val="24"/>
+                <w:szCs w:val="24"/>
+              </w:rPr>
+              <w:t>() %}</w:t>
             </w:r>
           </w:p>
         </w:tc>
@@ -1402,7 +2650,25 @@
                 <w:sz w:val="24"/>
                 <w:szCs w:val="24"/>
               </w:rPr>
-              <w:t>{{ safeattr(row, key(column)) }}</w:t>
+              <w:t xml:space="preserve">{{ </w:t>
+            </w:r>
+            <w:proofErr w:type="spellStart"/>
+            <w:r>
+              <w:rPr>
+                <w:rFonts w:ascii="Arial" w:hAnsi="Arial" w:cs="Arial"/>
+                <w:sz w:val="24"/>
+                <w:szCs w:val="24"/>
+              </w:rPr>
+              <w:t>safeattr</w:t>
+            </w:r>
+            <w:proofErr w:type="spellEnd"/>
+            <w:r>
+              <w:rPr>
+                <w:rFonts w:ascii="Arial" w:hAnsi="Arial" w:cs="Arial"/>
+                <w:sz w:val="24"/>
+                <w:szCs w:val="24"/>
+              </w:rPr>
+              <w:t>(row, key(column)) }}</w:t>
             </w:r>
           </w:p>
         </w:tc>
@@ -1424,7 +2690,43 @@
                 <w:sz w:val="24"/>
                 <w:szCs w:val="24"/>
               </w:rPr>
-              <w:t>{%tc endfor %}</w:t>
+              <w:t>{%</w:t>
+            </w:r>
+            <w:proofErr w:type="spellStart"/>
+            <w:r>
+              <w:rPr>
+                <w:rFonts w:ascii="Arial" w:hAnsi="Arial" w:cs="Arial"/>
+                <w:sz w:val="24"/>
+                <w:szCs w:val="24"/>
+              </w:rPr>
+              <w:t>tc</w:t>
+            </w:r>
+            <w:proofErr w:type="spellEnd"/>
+            <w:r>
+              <w:rPr>
+                <w:rFonts w:ascii="Arial" w:hAnsi="Arial" w:cs="Arial"/>
+                <w:sz w:val="24"/>
+                <w:szCs w:val="24"/>
+              </w:rPr>
+              <w:t xml:space="preserve"> </w:t>
+            </w:r>
+            <w:proofErr w:type="spellStart"/>
+            <w:r>
+              <w:rPr>
+                <w:rFonts w:ascii="Arial" w:hAnsi="Arial" w:cs="Arial"/>
+                <w:sz w:val="24"/>
+                <w:szCs w:val="24"/>
+              </w:rPr>
+              <w:t>endfor</w:t>
+            </w:r>
+            <w:proofErr w:type="spellEnd"/>
+            <w:r>
+              <w:rPr>
+                <w:rFonts w:ascii="Arial" w:hAnsi="Arial" w:cs="Arial"/>
+                <w:sz w:val="24"/>
+                <w:szCs w:val="24"/>
+              </w:rPr>
+              <w:t xml:space="preserve"> %}</w:t>
             </w:r>
           </w:p>
         </w:tc>
@@ -1448,7 +2750,25 @@
                 <w:sz w:val="24"/>
                 <w:szCs w:val="24"/>
               </w:rPr>
-              <w:t>{%tr endfor %}</w:t>
+              <w:t xml:space="preserve">{%tr </w:t>
+            </w:r>
+            <w:proofErr w:type="spellStart"/>
+            <w:r>
+              <w:rPr>
+                <w:rFonts w:ascii="Arial" w:hAnsi="Arial" w:cs="Arial"/>
+                <w:sz w:val="24"/>
+                <w:szCs w:val="24"/>
+              </w:rPr>
+              <w:t>endfor</w:t>
+            </w:r>
+            <w:proofErr w:type="spellEnd"/>
+            <w:r>
+              <w:rPr>
+                <w:rFonts w:ascii="Arial" w:hAnsi="Arial" w:cs="Arial"/>
+                <w:sz w:val="24"/>
+                <w:szCs w:val="24"/>
+              </w:rPr>
+              <w:t xml:space="preserve"> %}</w:t>
             </w:r>
           </w:p>
         </w:tc>
@@ -1505,8 +2825,43 @@
           <w:sz w:val="24"/>
           <w:szCs w:val="24"/>
         </w:rPr>
-        <w:lastRenderedPageBreak/>
-        <w:t>{%p elif field.is_list() %}</w:t>
+        <w:t xml:space="preserve">{%p </w:t>
+      </w:r>
+      <w:proofErr w:type="spellStart"/>
+      <w:r>
+        <w:rPr>
+          <w:rFonts w:ascii="Arial" w:hAnsi="Arial" w:cs="Arial"/>
+          <w:sz w:val="24"/>
+          <w:szCs w:val="24"/>
+        </w:rPr>
+        <w:t>elif</w:t>
+      </w:r>
+      <w:proofErr w:type="spellEnd"/>
+      <w:r>
+        <w:rPr>
+          <w:rFonts w:ascii="Arial" w:hAnsi="Arial" w:cs="Arial"/>
+          <w:sz w:val="24"/>
+          <w:szCs w:val="24"/>
+        </w:rPr>
+        <w:t xml:space="preserve"> </w:t>
+      </w:r>
+      <w:proofErr w:type="spellStart"/>
+      <w:r>
+        <w:rPr>
+          <w:rFonts w:ascii="Arial" w:hAnsi="Arial" w:cs="Arial"/>
+          <w:sz w:val="24"/>
+          <w:szCs w:val="24"/>
+        </w:rPr>
+        <w:t>field.is_list</w:t>
+      </w:r>
+      <w:proofErr w:type="spellEnd"/>
+      <w:r>
+        <w:rPr>
+          <w:rFonts w:ascii="Arial" w:hAnsi="Arial" w:cs="Arial"/>
+          <w:sz w:val="24"/>
+          <w:szCs w:val="24"/>
+        </w:rPr>
+        <w:t>() %}</w:t>
       </w:r>
     </w:p>
     <w:p>
@@ -1533,7 +2888,16 @@
           <w:sz w:val="24"/>
           <w:szCs w:val="24"/>
         </w:rPr>
-        <w:t>{{ field.</w:t>
+        <w:t xml:space="preserve">{{ </w:t>
+      </w:r>
+      <w:proofErr w:type="spellStart"/>
+      <w:r>
+        <w:rPr>
+          <w:rFonts w:ascii="Arial" w:hAnsi="Arial" w:cs="Arial"/>
+          <w:sz w:val="24"/>
+          <w:szCs w:val="24"/>
+        </w:rPr>
+        <w:t>field.</w:t>
       </w:r>
       <w:r>
         <w:rPr>
@@ -1543,6 +2907,7 @@
         </w:rPr>
         <w:t>label</w:t>
       </w:r>
+      <w:proofErr w:type="spellEnd"/>
       <w:r>
         <w:rPr>
           <w:rFonts w:ascii="Arial" w:hAnsi="Arial" w:cs="Arial"/>
@@ -1571,7 +2936,25 @@
           <w:sz w:val="24"/>
           <w:szCs w:val="24"/>
         </w:rPr>
-        <w:t>{%p for item in field.overflow_value() %}</w:t>
+        <w:t xml:space="preserve">{%p for item in </w:t>
+      </w:r>
+      <w:proofErr w:type="spellStart"/>
+      <w:r>
+        <w:rPr>
+          <w:rFonts w:ascii="Arial" w:hAnsi="Arial" w:cs="Arial"/>
+          <w:sz w:val="24"/>
+          <w:szCs w:val="24"/>
+        </w:rPr>
+        <w:t>field.overflow_value</w:t>
+      </w:r>
+      <w:proofErr w:type="spellEnd"/>
+      <w:r>
+        <w:rPr>
+          <w:rFonts w:ascii="Arial" w:hAnsi="Arial" w:cs="Arial"/>
+          <w:sz w:val="24"/>
+          <w:szCs w:val="24"/>
+        </w:rPr>
+        <w:t>() %}</w:t>
       </w:r>
     </w:p>
     <w:p>
@@ -1615,8 +2998,18 @@
           <w:sz w:val="24"/>
           <w:szCs w:val="24"/>
         </w:rPr>
-        <w:t>{%p endfor</w:t>
-      </w:r>
+        <w:t xml:space="preserve">{%p </w:t>
+      </w:r>
+      <w:proofErr w:type="spellStart"/>
+      <w:r>
+        <w:rPr>
+          <w:rFonts w:ascii="Arial" w:hAnsi="Arial" w:cs="Arial"/>
+          <w:sz w:val="24"/>
+          <w:szCs w:val="24"/>
+        </w:rPr>
+        <w:t>endfor</w:t>
+      </w:r>
+      <w:proofErr w:type="spellEnd"/>
       <w:r>
         <w:rPr>
           <w:rFonts w:ascii="Arial" w:hAnsi="Arial" w:cs="Arial"/>
@@ -1683,8 +3076,9 @@
           <w:sz w:val="24"/>
           <w:szCs w:val="24"/>
         </w:rPr>
-        <w:t>{{ field.</w:t>
-      </w:r>
+        <w:t xml:space="preserve">{{ </w:t>
+      </w:r>
+      <w:proofErr w:type="spellStart"/>
       <w:r>
         <w:rPr>
           <w:rFonts w:ascii="Arial" w:hAnsi="Arial" w:cs="Arial"/>
@@ -1692,8 +3086,18 @@
           <w:sz w:val="24"/>
           <w:szCs w:val="24"/>
         </w:rPr>
+        <w:t>field.</w:t>
+      </w:r>
+      <w:r>
+        <w:rPr>
+          <w:rFonts w:ascii="Arial" w:hAnsi="Arial" w:cs="Arial"/>
+          <w:b/>
+          <w:sz w:val="24"/>
+          <w:szCs w:val="24"/>
+        </w:rPr>
         <w:t>label</w:t>
       </w:r>
+      <w:proofErr w:type="spellEnd"/>
       <w:r>
         <w:rPr>
           <w:rFonts w:ascii="Arial" w:hAnsi="Arial" w:cs="Arial"/>
@@ -1709,23 +3113,60 @@
           <w:sz w:val="24"/>
           <w:szCs w:val="24"/>
         </w:rPr>
-        <w:t>: {{ field.overflow_value(</w:t>
-      </w:r>
-      <w:r>
-        <w:rPr>
-          <w:rFonts w:ascii="Arial" w:hAnsi="Arial" w:cs="Arial"/>
-          <w:sz w:val="24"/>
-          <w:szCs w:val="24"/>
-        </w:rPr>
-        <w:t>overflow_message=</w:t>
-      </w:r>
-      <w:r>
-        <w:rPr>
-          <w:rFonts w:ascii="Arial" w:hAnsi="Arial" w:cs="Arial"/>
-          <w:sz w:val="24"/>
-          <w:szCs w:val="24"/>
-        </w:rPr>
-        <w:t xml:space="preserve"> RFAaffidavit</w:t>
+        <w:t xml:space="preserve">: {{ </w:t>
+      </w:r>
+      <w:proofErr w:type="spellStart"/>
+      <w:r>
+        <w:rPr>
+          <w:rFonts w:ascii="Arial" w:hAnsi="Arial" w:cs="Arial"/>
+          <w:sz w:val="24"/>
+          <w:szCs w:val="24"/>
+        </w:rPr>
+        <w:t>field.overflow_value</w:t>
+      </w:r>
+      <w:proofErr w:type="spellEnd"/>
+      <w:r>
+        <w:rPr>
+          <w:rFonts w:ascii="Arial" w:hAnsi="Arial" w:cs="Arial"/>
+          <w:sz w:val="24"/>
+          <w:szCs w:val="24"/>
+        </w:rPr>
+        <w:t>(</w:t>
+      </w:r>
+      <w:proofErr w:type="spellStart"/>
+      <w:r>
+        <w:rPr>
+          <w:rFonts w:ascii="Arial" w:hAnsi="Arial" w:cs="Arial"/>
+          <w:sz w:val="24"/>
+          <w:szCs w:val="24"/>
+        </w:rPr>
+        <w:t>overflow_message</w:t>
+      </w:r>
+      <w:proofErr w:type="spellEnd"/>
+      <w:r>
+        <w:rPr>
+          <w:rFonts w:ascii="Arial" w:hAnsi="Arial" w:cs="Arial"/>
+          <w:sz w:val="24"/>
+          <w:szCs w:val="24"/>
+        </w:rPr>
+        <w:t>=</w:t>
+      </w:r>
+      <w:r>
+        <w:rPr>
+          <w:rFonts w:ascii="Arial" w:hAnsi="Arial" w:cs="Arial"/>
+          <w:sz w:val="24"/>
+          <w:szCs w:val="24"/>
+        </w:rPr>
+        <w:t xml:space="preserve"> </w:t>
+      </w:r>
+      <w:proofErr w:type="spellStart"/>
+      <w:r>
+        <w:rPr>
+          <w:rFonts w:ascii="Arial" w:hAnsi="Arial" w:cs="Arial"/>
+          <w:sz w:val="24"/>
+          <w:szCs w:val="24"/>
+        </w:rPr>
+        <w:t>RFAaffidavit</w:t>
       </w:r>
       <w:r>
         <w:rPr>
@@ -1735,6 +3176,7 @@
         </w:rPr>
         <w:t>.default_overflow_message</w:t>
       </w:r>
+      <w:proofErr w:type="spellEnd"/>
       <w:r>
         <w:rPr>
           <w:rFonts w:ascii="Arial" w:hAnsi="Arial" w:cs="Arial"/>
@@ -1775,7 +3217,25 @@
           <w:sz w:val="24"/>
           <w:szCs w:val="24"/>
         </w:rPr>
-        <w:t>{%p endfor %}</w:t>
+        <w:t xml:space="preserve">{%p </w:t>
+      </w:r>
+      <w:proofErr w:type="spellStart"/>
+      <w:r>
+        <w:rPr>
+          <w:rFonts w:ascii="Arial" w:hAnsi="Arial" w:cs="Arial"/>
+          <w:sz w:val="24"/>
+          <w:szCs w:val="24"/>
+        </w:rPr>
+        <w:t>endfor</w:t>
+      </w:r>
+      <w:proofErr w:type="spellEnd"/>
+      <w:r>
+        <w:rPr>
+          <w:rFonts w:ascii="Arial" w:hAnsi="Arial" w:cs="Arial"/>
+          <w:sz w:val="24"/>
+          <w:szCs w:val="24"/>
+        </w:rPr>
+        <w:t xml:space="preserve"> %}</w:t>
       </w:r>
     </w:p>
     <w:p>
@@ -1820,6 +3280,7 @@
         </w:rPr>
         <w:t xml:space="preserve">{%p if </w:t>
       </w:r>
+      <w:proofErr w:type="spellStart"/>
       <w:r>
         <w:rPr>
           <w:rFonts w:ascii="Arial" w:hAnsi="Arial" w:cs="Arial"/>
@@ -1850,7 +3311,16 @@
           <w:sz w:val="24"/>
           <w:szCs w:val="24"/>
         </w:rPr>
-        <w:t>.enabled %}</w:t>
+        <w:t>.enabled</w:t>
+      </w:r>
+      <w:proofErr w:type="spellEnd"/>
+      <w:r>
+        <w:rPr>
+          <w:rFonts w:ascii="Arial" w:hAnsi="Arial" w:cs="Arial"/>
+          <w:sz w:val="24"/>
+          <w:szCs w:val="24"/>
+        </w:rPr>
+        <w:t xml:space="preserve"> %}</w:t>
       </w:r>
     </w:p>
     <w:p>
@@ -1869,6 +3339,7 @@
         </w:rPr>
         <w:t xml:space="preserve">{%p for field in </w:t>
       </w:r>
+      <w:proofErr w:type="spellStart"/>
       <w:r>
         <w:rPr>
           <w:rFonts w:ascii="Arial" w:hAnsi="Arial" w:cs="Arial"/>
@@ -1899,7 +3370,16 @@
           <w:sz w:val="24"/>
           <w:szCs w:val="24"/>
         </w:rPr>
-        <w:t>.overflow()</w:t>
+        <w:t>.overflow</w:t>
+      </w:r>
+      <w:proofErr w:type="spellEnd"/>
+      <w:r>
+        <w:rPr>
+          <w:rFonts w:ascii="Arial" w:hAnsi="Arial" w:cs="Arial"/>
+          <w:sz w:val="24"/>
+          <w:szCs w:val="24"/>
+        </w:rPr>
+        <w:t>()</w:t>
       </w:r>
       <w:r>
         <w:rPr>
@@ -1932,11 +3412,104 @@
           <w:sz w:val="24"/>
           <w:szCs w:val="24"/>
         </w:rPr>
-        <w:t>{%p if field.field_name == "children" %}</w:t>
+        <w:t xml:space="preserve">{%p if </w:t>
+      </w:r>
+      <w:proofErr w:type="spellStart"/>
+      <w:r>
+        <w:rPr>
+          <w:rFonts w:ascii="Arial" w:hAnsi="Arial" w:cs="Arial"/>
+          <w:sz w:val="24"/>
+          <w:szCs w:val="24"/>
+        </w:rPr>
+        <w:t>field.field_name</w:t>
+      </w:r>
+      <w:proofErr w:type="spellEnd"/>
+      <w:r>
+        <w:rPr>
+          <w:rFonts w:ascii="Arial" w:hAnsi="Arial" w:cs="Arial"/>
+          <w:sz w:val="24"/>
+          <w:szCs w:val="24"/>
+        </w:rPr>
+        <w:t xml:space="preserve"> == "children" %}</w:t>
       </w:r>
     </w:p>
     <w:p>
       <w:pPr>
+        <w:rPr>
+          <w:rFonts w:ascii="Arial" w:hAnsi="Arial" w:cs="Arial"/>
+          <w:sz w:val="24"/>
+          <w:szCs w:val="24"/>
+        </w:rPr>
+      </w:pPr>
+      <w:r>
+        <w:rPr>
+          <w:rFonts w:ascii="Arial" w:hAnsi="Arial" w:cs="Arial"/>
+          <w:sz w:val="24"/>
+          <w:szCs w:val="24"/>
+        </w:rPr>
+        <w:t>{%p</w:t>
+      </w:r>
+      <w:r>
+        <w:rPr>
+          <w:rFonts w:ascii="Arial" w:hAnsi="Arial" w:cs="Arial"/>
+          <w:sz w:val="24"/>
+          <w:szCs w:val="24"/>
+        </w:rPr>
+        <w:t xml:space="preserve"> </w:t>
+      </w:r>
+      <w:r>
+        <w:rPr>
+          <w:rFonts w:ascii="Arial" w:hAnsi="Arial" w:cs="Arial"/>
+          <w:sz w:val="24"/>
+          <w:szCs w:val="24"/>
+        </w:rPr>
+        <w:t xml:space="preserve">if </w:t>
+      </w:r>
+      <w:r>
+        <w:rPr>
+          <w:rFonts w:ascii="Arial" w:hAnsi="Arial" w:cs="Arial"/>
+          <w:sz w:val="24"/>
+          <w:szCs w:val="24"/>
+        </w:rPr>
+        <w:t xml:space="preserve">children | length &gt; 3 and </w:t>
+      </w:r>
+      <w:proofErr w:type="spellStart"/>
+      <w:r>
+        <w:rPr>
+          <w:rFonts w:ascii="Arial" w:hAnsi="Arial" w:cs="Arial"/>
+          <w:sz w:val="24"/>
+          <w:szCs w:val="24"/>
+        </w:rPr>
+        <w:t>custody_wanted_true_</w:t>
+      </w:r>
+      <w:r>
+        <w:rPr>
+          <w:rFonts w:ascii="Arial" w:hAnsi="Arial" w:cs="Arial"/>
+          <w:sz w:val="24"/>
+          <w:szCs w:val="24"/>
+        </w:rPr>
+        <w:t>overflow</w:t>
+      </w:r>
+      <w:proofErr w:type="spellEnd"/>
+      <w:r>
+        <w:rPr>
+          <w:rFonts w:ascii="Arial" w:hAnsi="Arial" w:cs="Arial"/>
+          <w:sz w:val="24"/>
+          <w:szCs w:val="24"/>
+        </w:rPr>
+        <w:t xml:space="preserve"> </w:t>
+      </w:r>
+      <w:r>
+        <w:rPr>
+          <w:rFonts w:ascii="Arial" w:hAnsi="Arial" w:cs="Arial"/>
+          <w:sz w:val="24"/>
+          <w:szCs w:val="24"/>
+        </w:rPr>
+        <w:t>%}</w:t>
+      </w:r>
+    </w:p>
+    <w:p>
+      <w:pPr>
         <w:pStyle w:val="Heading2"/>
         <w:rPr>
           <w:rFonts w:ascii="Arial" w:hAnsi="Arial" w:cs="Arial"/>
@@ -1950,7 +3523,8 @@
           <w:sz w:val="24"/>
           <w:szCs w:val="24"/>
         </w:rPr>
-        <w:t>Additional children</w:t>
+        <w:lastRenderedPageBreak/>
+        <w:t>Additional children and custody</w:t>
       </w:r>
     </w:p>
     <w:tbl>
@@ -2115,43 +3689,16 @@
                 <w:sz w:val="20"/>
                 <w:szCs w:val="20"/>
               </w:rPr>
-              <w:t>Plaintiff</w:t>
-            </w:r>
-            <w:r>
-              <w:rPr>
-                <w:rFonts w:ascii="Arial" w:eastAsia="Calibri" w:hAnsi="Arial" w:cs="Arial"/>
-                <w:b/>
-                <w:sz w:val="20"/>
-                <w:szCs w:val="20"/>
-              </w:rPr>
-              <w:t xml:space="preserve"> </w:t>
-            </w:r>
-            <w:r>
-              <w:rPr>
-                <w:rFonts w:ascii="Arial" w:eastAsia="Calibri" w:hAnsi="Arial" w:cs="Arial"/>
-                <w:b/>
-                <w:sz w:val="20"/>
-                <w:szCs w:val="20"/>
-              </w:rPr>
-              <w:t>/</w:t>
-            </w:r>
-            <w:r>
-              <w:rPr>
-                <w:rFonts w:ascii="Arial" w:eastAsia="Calibri" w:hAnsi="Arial" w:cs="Arial"/>
-                <w:b/>
-                <w:sz w:val="20"/>
-                <w:szCs w:val="20"/>
-              </w:rPr>
-              <w:t xml:space="preserve"> </w:t>
-            </w:r>
-            <w:r>
-              <w:rPr>
-                <w:rFonts w:ascii="Arial" w:eastAsia="Calibri" w:hAnsi="Arial" w:cs="Arial"/>
-                <w:b/>
-                <w:sz w:val="20"/>
-                <w:szCs w:val="20"/>
-              </w:rPr>
-              <w:t>petitioner wants custody?</w:t>
+              <w:t>P</w:t>
+            </w:r>
+            <w:r>
+              <w:rPr>
+                <w:rFonts w:ascii="Arial" w:eastAsia="Calibri" w:hAnsi="Arial" w:cs="Arial"/>
+                <w:b/>
+                <w:sz w:val="20"/>
+                <w:szCs w:val="20"/>
+              </w:rPr>
+              <w:t>etitioner wants custody?</w:t>
             </w:r>
           </w:p>
         </w:tc>
@@ -2175,7 +3722,25 @@
                 <w:sz w:val="20"/>
                 <w:szCs w:val="20"/>
               </w:rPr>
-              <w:t>{%tr for row in field.overflow_value() %}</w:t>
+              <w:t xml:space="preserve">{%tr for row in </w:t>
+            </w:r>
+            <w:proofErr w:type="spellStart"/>
+            <w:r>
+              <w:rPr>
+                <w:rFonts w:ascii="Arial" w:eastAsia="Calibri" w:hAnsi="Arial" w:cs="Arial"/>
+                <w:sz w:val="20"/>
+                <w:szCs w:val="20"/>
+              </w:rPr>
+              <w:t>field.overflow_value</w:t>
+            </w:r>
+            <w:proofErr w:type="spellEnd"/>
+            <w:r>
+              <w:rPr>
+                <w:rFonts w:ascii="Arial" w:eastAsia="Calibri" w:hAnsi="Arial" w:cs="Arial"/>
+                <w:sz w:val="20"/>
+                <w:szCs w:val="20"/>
+              </w:rPr>
+              <w:t>() %}</w:t>
             </w:r>
           </w:p>
         </w:tc>
@@ -2297,7 +3862,25 @@
                 <w:sz w:val="20"/>
                 <w:szCs w:val="20"/>
               </w:rPr>
-              <w:t>{{row.birthdate.</w:t>
+              <w:t>{{</w:t>
+            </w:r>
+            <w:proofErr w:type="spellStart"/>
+            <w:r>
+              <w:rPr>
+                <w:rFonts w:ascii="Arial" w:eastAsia="Calibri" w:hAnsi="Arial" w:cs="Arial"/>
+                <w:sz w:val="20"/>
+                <w:szCs w:val="20"/>
+              </w:rPr>
+              <w:t>row.birthdate</w:t>
+            </w:r>
+            <w:proofErr w:type="spellEnd"/>
+            <w:r>
+              <w:rPr>
+                <w:rFonts w:ascii="Arial" w:eastAsia="Calibri" w:hAnsi="Arial" w:cs="Arial"/>
+                <w:sz w:val="20"/>
+                <w:szCs w:val="20"/>
+              </w:rPr>
+              <w:t>.</w:t>
             </w:r>
             <w:r>
               <w:rPr>
@@ -2309,13 +3892,23 @@
               </w:rPr>
               <w:t xml:space="preserve"> </w:t>
             </w:r>
-            <w:r>
-              <w:rPr>
-                <w:rFonts w:ascii="Arial" w:eastAsia="Calibri" w:hAnsi="Arial" w:cs="Arial"/>
-                <w:sz w:val="20"/>
-                <w:szCs w:val="20"/>
-              </w:rPr>
-              <w:t>strftime('%m/%d/%Y')</w:t>
+            <w:proofErr w:type="spellStart"/>
+            <w:r>
+              <w:rPr>
+                <w:rFonts w:ascii="Arial" w:eastAsia="Calibri" w:hAnsi="Arial" w:cs="Arial"/>
+                <w:sz w:val="20"/>
+                <w:szCs w:val="20"/>
+              </w:rPr>
+              <w:t>strftime</w:t>
+            </w:r>
+            <w:proofErr w:type="spellEnd"/>
+            <w:r>
+              <w:rPr>
+                <w:rFonts w:ascii="Arial" w:eastAsia="Calibri" w:hAnsi="Arial" w:cs="Arial"/>
+                <w:sz w:val="20"/>
+                <w:szCs w:val="20"/>
+              </w:rPr>
+              <w:t>('%m/%d/%Y')</w:t>
             </w:r>
           </w:p>
           <w:p>
@@ -2366,13 +3959,23 @@
               </w:rPr>
               <w:t xml:space="preserve">“Yes” if </w:t>
             </w:r>
-            <w:r>
-              <w:rPr>
-                <w:rFonts w:ascii="Arial" w:eastAsia="Calibri" w:hAnsi="Arial" w:cs="Arial"/>
-                <w:sz w:val="20"/>
-                <w:szCs w:val="20"/>
-              </w:rPr>
-              <w:t xml:space="preserve">row.in_danger </w:t>
+            <w:proofErr w:type="spellStart"/>
+            <w:r>
+              <w:rPr>
+                <w:rFonts w:ascii="Arial" w:eastAsia="Calibri" w:hAnsi="Arial" w:cs="Arial"/>
+                <w:sz w:val="20"/>
+                <w:szCs w:val="20"/>
+              </w:rPr>
+              <w:t>row.in_danger</w:t>
+            </w:r>
+            <w:proofErr w:type="spellEnd"/>
+            <w:r>
+              <w:rPr>
+                <w:rFonts w:ascii="Arial" w:eastAsia="Calibri" w:hAnsi="Arial" w:cs="Arial"/>
+                <w:sz w:val="20"/>
+                <w:szCs w:val="20"/>
+              </w:rPr>
+              <w:t xml:space="preserve"> </w:t>
             </w:r>
             <w:r>
               <w:rPr>
@@ -2474,15 +4077,33 @@
                 <w:sz w:val="20"/>
                 <w:szCs w:val="20"/>
               </w:rPr>
-              <w:t>{{ row.relationship_</w:t>
-            </w:r>
-            <w:r>
-              <w:rPr>
-                <w:rFonts w:ascii="Arial" w:hAnsi="Arial" w:cs="Arial"/>
-                <w:sz w:val="20"/>
-                <w:szCs w:val="20"/>
-              </w:rPr>
-              <w:t xml:space="preserve">OP </w:t>
+              <w:t xml:space="preserve">{{ </w:t>
+            </w:r>
+            <w:proofErr w:type="spellStart"/>
+            <w:r>
+              <w:rPr>
+                <w:rFonts w:ascii="Arial" w:hAnsi="Arial" w:cs="Arial"/>
+                <w:sz w:val="20"/>
+                <w:szCs w:val="20"/>
+              </w:rPr>
+              <w:t>row.relationship_</w:t>
+            </w:r>
+            <w:r>
+              <w:rPr>
+                <w:rFonts w:ascii="Arial" w:hAnsi="Arial" w:cs="Arial"/>
+                <w:sz w:val="20"/>
+                <w:szCs w:val="20"/>
+              </w:rPr>
+              <w:t>OP</w:t>
+            </w:r>
+            <w:proofErr w:type="spellEnd"/>
+            <w:r>
+              <w:rPr>
+                <w:rFonts w:ascii="Arial" w:hAnsi="Arial" w:cs="Arial"/>
+                <w:sz w:val="20"/>
+                <w:szCs w:val="20"/>
+              </w:rPr>
+              <w:t xml:space="preserve"> </w:t>
             </w:r>
             <w:r>
               <w:rPr>
@@ -2531,6 +4152,7 @@
               </w:rPr>
               <w:t xml:space="preserve">“Yes” if </w:t>
             </w:r>
+            <w:proofErr w:type="spellStart"/>
             <w:r>
               <w:rPr>
                 <w:rFonts w:ascii="Arial" w:hAnsi="Arial" w:cs="Arial"/>
@@ -2539,6 +4161,7 @@
               </w:rPr>
               <w:t>row.custody_wanted</w:t>
             </w:r>
+            <w:proofErr w:type="spellEnd"/>
             <w:r>
               <w:rPr>
                 <w:rFonts w:ascii="Arial" w:eastAsia="Calibri" w:hAnsi="Arial" w:cs="Arial"/>
@@ -2577,7 +4200,25 @@
                 <w:sz w:val="20"/>
                 <w:szCs w:val="20"/>
               </w:rPr>
-              <w:t>{%tr endfor %}</w:t>
+              <w:t xml:space="preserve">{%tr </w:t>
+            </w:r>
+            <w:proofErr w:type="spellStart"/>
+            <w:r>
+              <w:rPr>
+                <w:rFonts w:ascii="Arial" w:eastAsia="Calibri" w:hAnsi="Arial" w:cs="Arial"/>
+                <w:sz w:val="20"/>
+                <w:szCs w:val="20"/>
+              </w:rPr>
+              <w:t>endfor</w:t>
+            </w:r>
+            <w:proofErr w:type="spellEnd"/>
+            <w:r>
+              <w:rPr>
+                <w:rFonts w:ascii="Arial" w:eastAsia="Calibri" w:hAnsi="Arial" w:cs="Arial"/>
+                <w:sz w:val="20"/>
+                <w:szCs w:val="20"/>
+              </w:rPr>
+              <w:t xml:space="preserve"> %}</w:t>
             </w:r>
           </w:p>
         </w:tc>
@@ -2683,21 +4324,31 @@
         </w:rPr>
         <w:t xml:space="preserve">{%p </w:t>
       </w:r>
-      <w:r>
-        <w:rPr>
-          <w:rFonts w:ascii="Arial" w:hAnsi="Arial" w:cs="Arial"/>
-          <w:sz w:val="24"/>
-          <w:szCs w:val="24"/>
-        </w:rPr>
-        <w:t>el</w:t>
-      </w:r>
-      <w:r>
-        <w:rPr>
-          <w:rFonts w:ascii="Arial" w:hAnsi="Arial" w:cs="Arial"/>
-          <w:sz w:val="24"/>
-          <w:szCs w:val="24"/>
-        </w:rPr>
-        <w:t xml:space="preserve">if field.is_object_list() %} </w:t>
+      <w:proofErr w:type="spellStart"/>
+      <w:r>
+        <w:rPr>
+          <w:rFonts w:ascii="Arial" w:hAnsi="Arial" w:cs="Arial"/>
+          <w:sz w:val="24"/>
+          <w:szCs w:val="24"/>
+        </w:rPr>
+        <w:t>elif</w:t>
+      </w:r>
+      <w:proofErr w:type="spellEnd"/>
+      <w:r>
+        <w:rPr>
+          <w:rFonts w:ascii="Arial" w:hAnsi="Arial" w:cs="Arial"/>
+          <w:sz w:val="24"/>
+          <w:szCs w:val="24"/>
+        </w:rPr>
+        <w:t xml:space="preserve"> children | length &gt; 4 </w:t>
+      </w:r>
+      <w:r>
+        <w:rPr>
+          <w:rFonts w:ascii="Arial" w:hAnsi="Arial" w:cs="Arial"/>
+          <w:sz w:val="24"/>
+          <w:szCs w:val="24"/>
+        </w:rPr>
+        <w:t>%}</w:t>
       </w:r>
     </w:p>
     <w:p>
@@ -2715,8 +4366,780 @@
           <w:sz w:val="24"/>
           <w:szCs w:val="24"/>
         </w:rPr>
-        <w:lastRenderedPageBreak/>
-        <w:t>{{ field.label }}</w:t>
+        <w:t>Additional children</w:t>
+      </w:r>
+    </w:p>
+    <w:tbl>
+      <w:tblPr>
+        <w:tblStyle w:val="TableGrid"/>
+        <w:tblW w:w="8005" w:type="dxa"/>
+        <w:tblLayout w:type="fixed"/>
+        <w:tblLook w:val="04A0" w:firstRow="1" w:lastRow="0" w:firstColumn="1" w:lastColumn="0" w:noHBand="0" w:noVBand="1"/>
+      </w:tblPr>
+      <w:tblGrid>
+        <w:gridCol w:w="1795"/>
+        <w:gridCol w:w="1260"/>
+        <w:gridCol w:w="1260"/>
+        <w:gridCol w:w="1800"/>
+        <w:gridCol w:w="1890"/>
+      </w:tblGrid>
+      <w:tr>
+        <w:tc>
+          <w:tcPr>
+            <w:tcW w:w="1795" w:type="dxa"/>
+          </w:tcPr>
+          <w:p>
+            <w:pPr>
+              <w:widowControl w:val="0"/>
+              <w:rPr>
+                <w:rFonts w:ascii="Arial" w:hAnsi="Arial" w:cs="Arial"/>
+                <w:b/>
+                <w:sz w:val="20"/>
+                <w:szCs w:val="20"/>
+              </w:rPr>
+            </w:pPr>
+            <w:r>
+              <w:rPr>
+                <w:rFonts w:ascii="Arial" w:eastAsia="Calibri" w:hAnsi="Arial" w:cs="Arial"/>
+                <w:b/>
+                <w:sz w:val="20"/>
+                <w:szCs w:val="20"/>
+              </w:rPr>
+              <w:t>Name</w:t>
+            </w:r>
+          </w:p>
+        </w:tc>
+        <w:tc>
+          <w:tcPr>
+            <w:tcW w:w="1260" w:type="dxa"/>
+          </w:tcPr>
+          <w:p>
+            <w:pPr>
+              <w:widowControl w:val="0"/>
+              <w:rPr>
+                <w:rFonts w:ascii="Arial" w:eastAsia="Calibri" w:hAnsi="Arial" w:cs="Arial"/>
+                <w:b/>
+                <w:sz w:val="20"/>
+                <w:szCs w:val="20"/>
+              </w:rPr>
+            </w:pPr>
+            <w:r>
+              <w:rPr>
+                <w:rFonts w:ascii="Arial" w:eastAsia="Calibri" w:hAnsi="Arial" w:cs="Arial"/>
+                <w:b/>
+                <w:sz w:val="20"/>
+                <w:szCs w:val="20"/>
+              </w:rPr>
+              <w:t>Born</w:t>
+            </w:r>
+          </w:p>
+        </w:tc>
+        <w:tc>
+          <w:tcPr>
+            <w:tcW w:w="1260" w:type="dxa"/>
+          </w:tcPr>
+          <w:p>
+            <w:pPr>
+              <w:widowControl w:val="0"/>
+              <w:rPr>
+                <w:rFonts w:ascii="Arial" w:eastAsia="Calibri" w:hAnsi="Arial" w:cs="Arial"/>
+                <w:b/>
+                <w:sz w:val="20"/>
+                <w:szCs w:val="20"/>
+              </w:rPr>
+            </w:pPr>
+            <w:r>
+              <w:rPr>
+                <w:rFonts w:ascii="Arial" w:eastAsia="Calibri" w:hAnsi="Arial" w:cs="Arial"/>
+                <w:b/>
+                <w:sz w:val="20"/>
+                <w:szCs w:val="20"/>
+              </w:rPr>
+              <w:t>In danger?</w:t>
+            </w:r>
+          </w:p>
+        </w:tc>
+        <w:tc>
+          <w:tcPr>
+            <w:tcW w:w="1800" w:type="dxa"/>
+          </w:tcPr>
+          <w:p>
+            <w:pPr>
+              <w:widowControl w:val="0"/>
+              <w:rPr>
+                <w:rFonts w:ascii="Arial" w:eastAsia="Calibri" w:hAnsi="Arial" w:cs="Arial"/>
+                <w:b/>
+                <w:sz w:val="20"/>
+                <w:szCs w:val="20"/>
+              </w:rPr>
+            </w:pPr>
+            <w:r>
+              <w:rPr>
+                <w:rFonts w:ascii="Arial" w:eastAsia="Calibri" w:hAnsi="Arial" w:cs="Arial"/>
+                <w:b/>
+                <w:sz w:val="20"/>
+                <w:szCs w:val="20"/>
+              </w:rPr>
+              <w:t>Relationship to petitioner</w:t>
+            </w:r>
+          </w:p>
+        </w:tc>
+        <w:tc>
+          <w:tcPr>
+            <w:tcW w:w="1890" w:type="dxa"/>
+          </w:tcPr>
+          <w:p>
+            <w:pPr>
+              <w:widowControl w:val="0"/>
+              <w:rPr>
+                <w:rFonts w:ascii="Arial" w:eastAsia="Calibri" w:hAnsi="Arial" w:cs="Arial"/>
+                <w:b/>
+                <w:sz w:val="20"/>
+                <w:szCs w:val="20"/>
+              </w:rPr>
+            </w:pPr>
+            <w:r>
+              <w:rPr>
+                <w:rFonts w:ascii="Arial" w:eastAsia="Calibri" w:hAnsi="Arial" w:cs="Arial"/>
+                <w:b/>
+                <w:sz w:val="20"/>
+                <w:szCs w:val="20"/>
+              </w:rPr>
+              <w:t>Relationship to defendant</w:t>
+            </w:r>
+          </w:p>
+        </w:tc>
+      </w:tr>
+      <w:tr>
+        <w:tc>
+          <w:tcPr>
+            <w:tcW w:w="1795" w:type="dxa"/>
+          </w:tcPr>
+          <w:p>
+            <w:pPr>
+              <w:rPr>
+                <w:rFonts w:ascii="Arial" w:hAnsi="Arial" w:cs="Arial"/>
+                <w:sz w:val="20"/>
+                <w:szCs w:val="20"/>
+              </w:rPr>
+            </w:pPr>
+            <w:r>
+              <w:rPr>
+                <w:rFonts w:ascii="Arial" w:eastAsia="Calibri" w:hAnsi="Arial" w:cs="Arial"/>
+                <w:sz w:val="20"/>
+                <w:szCs w:val="20"/>
+              </w:rPr>
+              <w:t xml:space="preserve">{%tr for row in </w:t>
+            </w:r>
+            <w:proofErr w:type="spellStart"/>
+            <w:r>
+              <w:rPr>
+                <w:rFonts w:ascii="Arial" w:eastAsia="Calibri" w:hAnsi="Arial" w:cs="Arial"/>
+                <w:sz w:val="20"/>
+                <w:szCs w:val="20"/>
+              </w:rPr>
+              <w:t>field.overflow_value</w:t>
+            </w:r>
+            <w:proofErr w:type="spellEnd"/>
+            <w:r>
+              <w:rPr>
+                <w:rFonts w:ascii="Arial" w:eastAsia="Calibri" w:hAnsi="Arial" w:cs="Arial"/>
+                <w:sz w:val="20"/>
+                <w:szCs w:val="20"/>
+              </w:rPr>
+              <w:t>() %}</w:t>
+            </w:r>
+          </w:p>
+        </w:tc>
+        <w:tc>
+          <w:tcPr>
+            <w:tcW w:w="1260" w:type="dxa"/>
+          </w:tcPr>
+          <w:p>
+            <w:pPr>
+              <w:widowControl w:val="0"/>
+              <w:rPr>
+                <w:rFonts w:ascii="Arial" w:eastAsia="Calibri" w:hAnsi="Arial" w:cs="Arial"/>
+                <w:sz w:val="20"/>
+                <w:szCs w:val="20"/>
+              </w:rPr>
+            </w:pPr>
+          </w:p>
+        </w:tc>
+        <w:tc>
+          <w:tcPr>
+            <w:tcW w:w="1260" w:type="dxa"/>
+          </w:tcPr>
+          <w:p>
+            <w:pPr>
+              <w:widowControl w:val="0"/>
+              <w:rPr>
+                <w:rFonts w:ascii="Arial" w:eastAsia="Calibri" w:hAnsi="Arial" w:cs="Arial"/>
+                <w:sz w:val="20"/>
+                <w:szCs w:val="20"/>
+              </w:rPr>
+            </w:pPr>
+          </w:p>
+        </w:tc>
+        <w:tc>
+          <w:tcPr>
+            <w:tcW w:w="1800" w:type="dxa"/>
+          </w:tcPr>
+          <w:p>
+            <w:pPr>
+              <w:widowControl w:val="0"/>
+              <w:rPr>
+                <w:rFonts w:ascii="Arial" w:eastAsia="Calibri" w:hAnsi="Arial" w:cs="Arial"/>
+                <w:sz w:val="20"/>
+                <w:szCs w:val="20"/>
+              </w:rPr>
+            </w:pPr>
+          </w:p>
+        </w:tc>
+        <w:tc>
+          <w:tcPr>
+            <w:tcW w:w="1890" w:type="dxa"/>
+          </w:tcPr>
+          <w:p>
+            <w:pPr>
+              <w:widowControl w:val="0"/>
+              <w:rPr>
+                <w:rFonts w:ascii="Arial" w:eastAsia="Calibri" w:hAnsi="Arial" w:cs="Arial"/>
+                <w:sz w:val="20"/>
+                <w:szCs w:val="20"/>
+              </w:rPr>
+            </w:pPr>
+          </w:p>
+        </w:tc>
+      </w:tr>
+      <w:tr>
+        <w:tc>
+          <w:tcPr>
+            <w:tcW w:w="1795" w:type="dxa"/>
+          </w:tcPr>
+          <w:p>
+            <w:pPr>
+              <w:rPr>
+                <w:rFonts w:ascii="Arial" w:hAnsi="Arial" w:cs="Arial"/>
+                <w:sz w:val="24"/>
+                <w:szCs w:val="24"/>
+              </w:rPr>
+            </w:pPr>
+            <w:r>
+              <w:rPr>
+                <w:rFonts w:ascii="Arial" w:eastAsia="Calibri" w:hAnsi="Arial" w:cs="Arial"/>
+                <w:sz w:val="24"/>
+                <w:szCs w:val="24"/>
+              </w:rPr>
+              <w:t>{{ row.name }}</w:t>
+            </w:r>
+          </w:p>
+        </w:tc>
+        <w:tc>
+          <w:tcPr>
+            <w:tcW w:w="1260" w:type="dxa"/>
+          </w:tcPr>
+          <w:p>
+            <w:pPr>
+              <w:widowControl w:val="0"/>
+              <w:rPr>
+                <w:rFonts w:ascii="Arial" w:eastAsia="Calibri" w:hAnsi="Arial" w:cs="Arial"/>
+                <w:sz w:val="20"/>
+                <w:szCs w:val="20"/>
+              </w:rPr>
+            </w:pPr>
+            <w:r>
+              <w:rPr>
+                <w:rFonts w:ascii="Arial" w:eastAsia="Calibri" w:hAnsi="Arial" w:cs="Arial"/>
+                <w:sz w:val="20"/>
+                <w:szCs w:val="20"/>
+              </w:rPr>
+              <w:t>{{</w:t>
+            </w:r>
+            <w:proofErr w:type="spellStart"/>
+            <w:r>
+              <w:rPr>
+                <w:rFonts w:ascii="Arial" w:eastAsia="Calibri" w:hAnsi="Arial" w:cs="Arial"/>
+                <w:sz w:val="20"/>
+                <w:szCs w:val="20"/>
+              </w:rPr>
+              <w:t>row.birthdate</w:t>
+            </w:r>
+            <w:proofErr w:type="spellEnd"/>
+            <w:r>
+              <w:rPr>
+                <w:rFonts w:ascii="Arial" w:eastAsia="Calibri" w:hAnsi="Arial" w:cs="Arial"/>
+                <w:sz w:val="20"/>
+                <w:szCs w:val="20"/>
+              </w:rPr>
+              <w:t>.</w:t>
+            </w:r>
+            <w:r>
+              <w:rPr>
+                <w:rFonts w:ascii="inherit" w:eastAsia="Times New Roman" w:hAnsi="inherit" w:cs="Courier New"/>
+                <w:color w:val="0C0D0E"/>
+                <w:sz w:val="20"/>
+                <w:szCs w:val="20"/>
+                <w:bdr w:val="none" w:sz="0" w:space="0" w:color="auto" w:frame="1"/>
+              </w:rPr>
+              <w:t xml:space="preserve"> </w:t>
+            </w:r>
+            <w:proofErr w:type="spellStart"/>
+            <w:r>
+              <w:rPr>
+                <w:rFonts w:ascii="Arial" w:eastAsia="Calibri" w:hAnsi="Arial" w:cs="Arial"/>
+                <w:sz w:val="20"/>
+                <w:szCs w:val="20"/>
+              </w:rPr>
+              <w:t>strftime</w:t>
+            </w:r>
+            <w:proofErr w:type="spellEnd"/>
+            <w:r>
+              <w:rPr>
+                <w:rFonts w:ascii="Arial" w:eastAsia="Calibri" w:hAnsi="Arial" w:cs="Arial"/>
+                <w:sz w:val="20"/>
+                <w:szCs w:val="20"/>
+              </w:rPr>
+              <w:t>('%m/%d/%Y')</w:t>
+            </w:r>
+          </w:p>
+          <w:p>
+            <w:pPr>
+              <w:widowControl w:val="0"/>
+              <w:rPr>
+                <w:rFonts w:ascii="Arial" w:hAnsi="Arial" w:cs="Arial"/>
+                <w:sz w:val="20"/>
+                <w:szCs w:val="20"/>
+              </w:rPr>
+            </w:pPr>
+            <w:r>
+              <w:rPr>
+                <w:rFonts w:ascii="Arial" w:eastAsia="Calibri" w:hAnsi="Arial" w:cs="Arial"/>
+                <w:sz w:val="20"/>
+                <w:szCs w:val="20"/>
+              </w:rPr>
+              <w:t>}}</w:t>
+            </w:r>
+          </w:p>
+        </w:tc>
+        <w:tc>
+          <w:tcPr>
+            <w:tcW w:w="1260" w:type="dxa"/>
+          </w:tcPr>
+          <w:p>
+            <w:pPr>
+              <w:widowControl w:val="0"/>
+              <w:rPr>
+                <w:rFonts w:ascii="Arial" w:hAnsi="Arial" w:cs="Arial"/>
+                <w:sz w:val="20"/>
+                <w:szCs w:val="20"/>
+              </w:rPr>
+            </w:pPr>
+            <w:r>
+              <w:rPr>
+                <w:rFonts w:ascii="Arial" w:eastAsia="Calibri" w:hAnsi="Arial" w:cs="Arial"/>
+                <w:sz w:val="20"/>
+                <w:szCs w:val="20"/>
+              </w:rPr>
+              <w:t xml:space="preserve">{{ </w:t>
+            </w:r>
+            <w:r>
+              <w:rPr>
+                <w:rFonts w:ascii="Arial" w:eastAsia="Calibri" w:hAnsi="Arial" w:cs="Arial"/>
+                <w:sz w:val="20"/>
+                <w:szCs w:val="20"/>
+              </w:rPr>
+              <w:t xml:space="preserve">“Yes” if </w:t>
+            </w:r>
+            <w:proofErr w:type="spellStart"/>
+            <w:r>
+              <w:rPr>
+                <w:rFonts w:ascii="Arial" w:eastAsia="Calibri" w:hAnsi="Arial" w:cs="Arial"/>
+                <w:sz w:val="20"/>
+                <w:szCs w:val="20"/>
+              </w:rPr>
+              <w:t>row.in_danger</w:t>
+            </w:r>
+            <w:proofErr w:type="spellEnd"/>
+            <w:r>
+              <w:rPr>
+                <w:rFonts w:ascii="Arial" w:eastAsia="Calibri" w:hAnsi="Arial" w:cs="Arial"/>
+                <w:sz w:val="20"/>
+                <w:szCs w:val="20"/>
+              </w:rPr>
+              <w:t xml:space="preserve"> </w:t>
+            </w:r>
+            <w:r>
+              <w:rPr>
+                <w:rFonts w:ascii="Arial" w:eastAsia="Calibri" w:hAnsi="Arial" w:cs="Arial"/>
+                <w:sz w:val="20"/>
+                <w:szCs w:val="20"/>
+              </w:rPr>
+              <w:t>else “No”</w:t>
+            </w:r>
+            <w:r>
+              <w:rPr>
+                <w:rFonts w:ascii="Arial" w:eastAsia="Calibri" w:hAnsi="Arial" w:cs="Arial"/>
+                <w:sz w:val="20"/>
+                <w:szCs w:val="20"/>
+              </w:rPr>
+              <w:t>}}</w:t>
+            </w:r>
+          </w:p>
+        </w:tc>
+        <w:tc>
+          <w:tcPr>
+            <w:tcW w:w="1800" w:type="dxa"/>
+          </w:tcPr>
+          <w:p>
+            <w:pPr>
+              <w:widowControl w:val="0"/>
+              <w:rPr>
+                <w:rFonts w:ascii="Arial" w:hAnsi="Arial" w:cs="Arial"/>
+                <w:sz w:val="20"/>
+                <w:szCs w:val="20"/>
+              </w:rPr>
+            </w:pPr>
+            <w:r>
+              <w:rPr>
+                <w:rFonts w:ascii="Arial" w:hAnsi="Arial" w:cs="Arial"/>
+                <w:sz w:val="20"/>
+                <w:szCs w:val="20"/>
+              </w:rPr>
+              <w:t>{{ row.relationship_user</w:t>
+            </w:r>
+            <w:r>
+              <w:rPr>
+                <w:rFonts w:ascii="Arial" w:hAnsi="Arial" w:cs="Arial"/>
+                <w:sz w:val="20"/>
+                <w:szCs w:val="20"/>
+              </w:rPr>
+              <w:t>s</w:t>
+            </w:r>
+            <w:r>
+              <w:rPr>
+                <w:rFonts w:ascii="Arial" w:hAnsi="Arial" w:cs="Arial"/>
+                <w:sz w:val="20"/>
+                <w:szCs w:val="20"/>
+              </w:rPr>
+              <w:t>1</w:t>
+            </w:r>
+            <w:r>
+              <w:rPr>
+                <w:rFonts w:ascii="Arial" w:hAnsi="Arial" w:cs="Arial"/>
+                <w:sz w:val="20"/>
+                <w:szCs w:val="20"/>
+              </w:rPr>
+              <w:t xml:space="preserve"> </w:t>
+            </w:r>
+            <w:r>
+              <w:rPr>
+                <w:rFonts w:ascii="Arial" w:hAnsi="Arial" w:cs="Arial"/>
+                <w:sz w:val="20"/>
+                <w:szCs w:val="20"/>
+              </w:rPr>
+              <w:t>| capitalize</w:t>
+            </w:r>
+            <w:r>
+              <w:rPr>
+                <w:rFonts w:ascii="Arial" w:hAnsi="Arial" w:cs="Arial"/>
+                <w:sz w:val="20"/>
+                <w:szCs w:val="20"/>
+              </w:rPr>
+              <w:t>}}</w:t>
+            </w:r>
+          </w:p>
+        </w:tc>
+        <w:tc>
+          <w:tcPr>
+            <w:tcW w:w="1890" w:type="dxa"/>
+          </w:tcPr>
+          <w:p>
+            <w:pPr>
+              <w:widowControl w:val="0"/>
+              <w:rPr>
+                <w:rFonts w:ascii="Arial" w:eastAsia="Calibri" w:hAnsi="Arial" w:cs="Arial"/>
+                <w:sz w:val="20"/>
+                <w:szCs w:val="20"/>
+              </w:rPr>
+            </w:pPr>
+            <w:r>
+              <w:rPr>
+                <w:rFonts w:ascii="Arial" w:hAnsi="Arial" w:cs="Arial"/>
+                <w:sz w:val="20"/>
+                <w:szCs w:val="20"/>
+              </w:rPr>
+              <w:t xml:space="preserve">{{ </w:t>
+            </w:r>
+            <w:proofErr w:type="spellStart"/>
+            <w:r>
+              <w:rPr>
+                <w:rFonts w:ascii="Arial" w:hAnsi="Arial" w:cs="Arial"/>
+                <w:sz w:val="20"/>
+                <w:szCs w:val="20"/>
+              </w:rPr>
+              <w:t>row.relationship_</w:t>
+            </w:r>
+            <w:r>
+              <w:rPr>
+                <w:rFonts w:ascii="Arial" w:hAnsi="Arial" w:cs="Arial"/>
+                <w:sz w:val="20"/>
+                <w:szCs w:val="20"/>
+              </w:rPr>
+              <w:t>OP</w:t>
+            </w:r>
+            <w:proofErr w:type="spellEnd"/>
+            <w:r>
+              <w:rPr>
+                <w:rFonts w:ascii="Arial" w:hAnsi="Arial" w:cs="Arial"/>
+                <w:sz w:val="20"/>
+                <w:szCs w:val="20"/>
+              </w:rPr>
+              <w:t xml:space="preserve"> </w:t>
+            </w:r>
+            <w:r>
+              <w:rPr>
+                <w:rFonts w:ascii="Arial" w:hAnsi="Arial" w:cs="Arial"/>
+                <w:sz w:val="20"/>
+                <w:szCs w:val="20"/>
+              </w:rPr>
+              <w:t>| capitalize</w:t>
+            </w:r>
+            <w:r>
+              <w:rPr>
+                <w:rFonts w:ascii="Arial" w:hAnsi="Arial" w:cs="Arial"/>
+                <w:sz w:val="20"/>
+                <w:szCs w:val="20"/>
+              </w:rPr>
+              <w:t>}}</w:t>
+            </w:r>
+          </w:p>
+        </w:tc>
+      </w:tr>
+      <w:tr>
+        <w:tc>
+          <w:tcPr>
+            <w:tcW w:w="1795" w:type="dxa"/>
+          </w:tcPr>
+          <w:p>
+            <w:pPr>
+              <w:rPr>
+                <w:rFonts w:ascii="Arial" w:hAnsi="Arial" w:cs="Arial"/>
+                <w:sz w:val="20"/>
+                <w:szCs w:val="20"/>
+              </w:rPr>
+            </w:pPr>
+            <w:r>
+              <w:rPr>
+                <w:rFonts w:ascii="Arial" w:eastAsia="Calibri" w:hAnsi="Arial" w:cs="Arial"/>
+                <w:sz w:val="20"/>
+                <w:szCs w:val="20"/>
+              </w:rPr>
+              <w:t xml:space="preserve">{%tr </w:t>
+            </w:r>
+            <w:proofErr w:type="spellStart"/>
+            <w:r>
+              <w:rPr>
+                <w:rFonts w:ascii="Arial" w:eastAsia="Calibri" w:hAnsi="Arial" w:cs="Arial"/>
+                <w:sz w:val="20"/>
+                <w:szCs w:val="20"/>
+              </w:rPr>
+              <w:t>endfor</w:t>
+            </w:r>
+            <w:proofErr w:type="spellEnd"/>
+            <w:r>
+              <w:rPr>
+                <w:rFonts w:ascii="Arial" w:eastAsia="Calibri" w:hAnsi="Arial" w:cs="Arial"/>
+                <w:sz w:val="20"/>
+                <w:szCs w:val="20"/>
+              </w:rPr>
+              <w:t xml:space="preserve"> %}</w:t>
+            </w:r>
+          </w:p>
+        </w:tc>
+        <w:tc>
+          <w:tcPr>
+            <w:tcW w:w="1260" w:type="dxa"/>
+          </w:tcPr>
+          <w:p>
+            <w:pPr>
+              <w:widowControl w:val="0"/>
+              <w:rPr>
+                <w:rFonts w:ascii="Arial" w:eastAsia="Calibri" w:hAnsi="Arial" w:cs="Arial"/>
+                <w:sz w:val="20"/>
+                <w:szCs w:val="20"/>
+              </w:rPr>
+            </w:pPr>
+          </w:p>
+        </w:tc>
+        <w:tc>
+          <w:tcPr>
+            <w:tcW w:w="1260" w:type="dxa"/>
+          </w:tcPr>
+          <w:p>
+            <w:pPr>
+              <w:widowControl w:val="0"/>
+              <w:rPr>
+                <w:rFonts w:ascii="Arial" w:eastAsia="Calibri" w:hAnsi="Arial" w:cs="Arial"/>
+                <w:sz w:val="20"/>
+                <w:szCs w:val="20"/>
+              </w:rPr>
+            </w:pPr>
+          </w:p>
+        </w:tc>
+        <w:tc>
+          <w:tcPr>
+            <w:tcW w:w="1800" w:type="dxa"/>
+          </w:tcPr>
+          <w:p>
+            <w:pPr>
+              <w:widowControl w:val="0"/>
+              <w:rPr>
+                <w:rFonts w:ascii="Arial" w:eastAsia="Calibri" w:hAnsi="Arial" w:cs="Arial"/>
+                <w:sz w:val="20"/>
+                <w:szCs w:val="20"/>
+              </w:rPr>
+            </w:pPr>
+          </w:p>
+        </w:tc>
+        <w:tc>
+          <w:tcPr>
+            <w:tcW w:w="1890" w:type="dxa"/>
+          </w:tcPr>
+          <w:p>
+            <w:pPr>
+              <w:widowControl w:val="0"/>
+              <w:rPr>
+                <w:rFonts w:ascii="Arial" w:eastAsia="Calibri" w:hAnsi="Arial" w:cs="Arial"/>
+                <w:sz w:val="20"/>
+                <w:szCs w:val="20"/>
+              </w:rPr>
+            </w:pPr>
+          </w:p>
+        </w:tc>
+      </w:tr>
+    </w:tbl>
+    <w:p>
+      <w:pPr>
+        <w:rPr>
+          <w:rFonts w:ascii="Arial" w:hAnsi="Arial" w:cs="Arial"/>
+          <w:sz w:val="24"/>
+          <w:szCs w:val="24"/>
+        </w:rPr>
+      </w:pPr>
+      <w:r>
+        <w:rPr>
+          <w:rFonts w:ascii="Arial" w:hAnsi="Arial" w:cs="Arial"/>
+          <w:sz w:val="24"/>
+          <w:szCs w:val="24"/>
+        </w:rPr>
+        <w:t>{%p endif %}</w:t>
+      </w:r>
+    </w:p>
+    <w:p>
+      <w:pPr>
+        <w:rPr>
+          <w:rFonts w:ascii="Arial" w:hAnsi="Arial" w:cs="Arial"/>
+          <w:sz w:val="24"/>
+          <w:szCs w:val="24"/>
+        </w:rPr>
+      </w:pPr>
+    </w:p>
+    <w:p>
+      <w:pPr>
+        <w:rPr>
+          <w:rFonts w:ascii="Arial" w:hAnsi="Arial" w:cs="Arial"/>
+          <w:sz w:val="24"/>
+          <w:szCs w:val="24"/>
+        </w:rPr>
+      </w:pPr>
+      <w:r>
+        <w:rPr>
+          <w:rFonts w:ascii="Arial" w:hAnsi="Arial" w:cs="Arial"/>
+          <w:sz w:val="24"/>
+          <w:szCs w:val="24"/>
+        </w:rPr>
+        <w:t xml:space="preserve">{%p </w:t>
+      </w:r>
+      <w:proofErr w:type="spellStart"/>
+      <w:r>
+        <w:rPr>
+          <w:rFonts w:ascii="Arial" w:hAnsi="Arial" w:cs="Arial"/>
+          <w:sz w:val="24"/>
+          <w:szCs w:val="24"/>
+        </w:rPr>
+        <w:t>el</w:t>
+      </w:r>
+      <w:r>
+        <w:rPr>
+          <w:rFonts w:ascii="Arial" w:hAnsi="Arial" w:cs="Arial"/>
+          <w:sz w:val="24"/>
+          <w:szCs w:val="24"/>
+        </w:rPr>
+        <w:t>if</w:t>
+      </w:r>
+      <w:proofErr w:type="spellEnd"/>
+      <w:r>
+        <w:rPr>
+          <w:rFonts w:ascii="Arial" w:hAnsi="Arial" w:cs="Arial"/>
+          <w:sz w:val="24"/>
+          <w:szCs w:val="24"/>
+        </w:rPr>
+        <w:t xml:space="preserve"> </w:t>
+      </w:r>
+      <w:proofErr w:type="spellStart"/>
+      <w:r>
+        <w:rPr>
+          <w:rFonts w:ascii="Arial" w:hAnsi="Arial" w:cs="Arial"/>
+          <w:sz w:val="24"/>
+          <w:szCs w:val="24"/>
+        </w:rPr>
+        <w:t>field.is_object_list</w:t>
+      </w:r>
+      <w:proofErr w:type="spellEnd"/>
+      <w:r>
+        <w:rPr>
+          <w:rFonts w:ascii="Arial" w:hAnsi="Arial" w:cs="Arial"/>
+          <w:sz w:val="24"/>
+          <w:szCs w:val="24"/>
+        </w:rPr>
+        <w:t xml:space="preserve">() %} </w:t>
+      </w:r>
+    </w:p>
+    <w:p>
+      <w:pPr>
+        <w:pStyle w:val="Heading2"/>
+        <w:rPr>
+          <w:rFonts w:ascii="Arial" w:hAnsi="Arial" w:cs="Arial"/>
+          <w:sz w:val="24"/>
+          <w:szCs w:val="24"/>
+        </w:rPr>
+      </w:pPr>
+      <w:r>
+        <w:rPr>
+          <w:rFonts w:ascii="Arial" w:hAnsi="Arial" w:cs="Arial"/>
+          <w:sz w:val="24"/>
+          <w:szCs w:val="24"/>
+        </w:rPr>
+        <w:t xml:space="preserve">{{ </w:t>
+      </w:r>
+      <w:proofErr w:type="spellStart"/>
+      <w:r>
+        <w:rPr>
+          <w:rFonts w:ascii="Arial" w:hAnsi="Arial" w:cs="Arial"/>
+          <w:sz w:val="24"/>
+          <w:szCs w:val="24"/>
+        </w:rPr>
+        <w:t>field.label</w:t>
+      </w:r>
+      <w:proofErr w:type="spellEnd"/>
+      <w:r>
+        <w:rPr>
+          <w:rFonts w:ascii="Arial" w:hAnsi="Arial" w:cs="Arial"/>
+          <w:sz w:val="24"/>
+          <w:szCs w:val="24"/>
+        </w:rPr>
+        <w:t xml:space="preserve"> }}</w:t>
       </w:r>
     </w:p>
     <w:tbl>
@@ -2751,7 +5174,47 @@
                 <w:sz w:val="24"/>
                 <w:szCs w:val="24"/>
               </w:rPr>
-              <w:t>{%tc for column in field.columns() %}</w:t>
+              <w:t>{%</w:t>
+            </w:r>
+            <w:proofErr w:type="spellStart"/>
+            <w:r>
+              <w:rPr>
+                <w:rFonts w:ascii="Arial" w:hAnsi="Arial" w:cs="Arial"/>
+                <w:b/>
+                <w:sz w:val="24"/>
+                <w:szCs w:val="24"/>
+              </w:rPr>
+              <w:t>tc</w:t>
+            </w:r>
+            <w:proofErr w:type="spellEnd"/>
+            <w:r>
+              <w:rPr>
+                <w:rFonts w:ascii="Arial" w:hAnsi="Arial" w:cs="Arial"/>
+                <w:b/>
+                <w:sz w:val="24"/>
+                <w:szCs w:val="24"/>
+              </w:rPr>
+              <w:t xml:space="preserve"> for column in </w:t>
+            </w:r>
+            <w:proofErr w:type="spellStart"/>
+            <w:r>
+              <w:rPr>
+                <w:rFonts w:ascii="Arial" w:hAnsi="Arial" w:cs="Arial"/>
+                <w:b/>
+                <w:sz w:val="24"/>
+                <w:szCs w:val="24"/>
+              </w:rPr>
+              <w:t>field.columns</w:t>
+            </w:r>
+            <w:proofErr w:type="spellEnd"/>
+            <w:r>
+              <w:rPr>
+                <w:rFonts w:ascii="Arial" w:hAnsi="Arial" w:cs="Arial"/>
+                <w:b/>
+                <w:sz w:val="24"/>
+                <w:szCs w:val="24"/>
+              </w:rPr>
+              <w:t>() %}</w:t>
             </w:r>
           </w:p>
         </w:tc>
@@ -2799,7 +5262,47 @@
                 <w:sz w:val="24"/>
                 <w:szCs w:val="24"/>
               </w:rPr>
-              <w:t>{%tc endfor %}</w:t>
+              <w:t>{%</w:t>
+            </w:r>
+            <w:proofErr w:type="spellStart"/>
+            <w:r>
+              <w:rPr>
+                <w:rFonts w:ascii="Arial" w:hAnsi="Arial" w:cs="Arial"/>
+                <w:b/>
+                <w:sz w:val="24"/>
+                <w:szCs w:val="24"/>
+              </w:rPr>
+              <w:t>tc</w:t>
+            </w:r>
+            <w:proofErr w:type="spellEnd"/>
+            <w:r>
+              <w:rPr>
+                <w:rFonts w:ascii="Arial" w:hAnsi="Arial" w:cs="Arial"/>
+                <w:b/>
+                <w:sz w:val="24"/>
+                <w:szCs w:val="24"/>
+              </w:rPr>
+              <w:t xml:space="preserve"> </w:t>
+            </w:r>
+            <w:proofErr w:type="spellStart"/>
+            <w:r>
+              <w:rPr>
+                <w:rFonts w:ascii="Arial" w:hAnsi="Arial" w:cs="Arial"/>
+                <w:b/>
+                <w:sz w:val="24"/>
+                <w:szCs w:val="24"/>
+              </w:rPr>
+              <w:t>endfor</w:t>
+            </w:r>
+            <w:proofErr w:type="spellEnd"/>
+            <w:r>
+              <w:rPr>
+                <w:rFonts w:ascii="Arial" w:hAnsi="Arial" w:cs="Arial"/>
+                <w:b/>
+                <w:sz w:val="24"/>
+                <w:szCs w:val="24"/>
+              </w:rPr>
+              <w:t xml:space="preserve"> %}</w:t>
             </w:r>
           </w:p>
         </w:tc>
@@ -2823,7 +5326,25 @@
                 <w:sz w:val="24"/>
                 <w:szCs w:val="24"/>
               </w:rPr>
-              <w:t>{%tr for row in field.overflow_value() %}</w:t>
+              <w:t xml:space="preserve">{%tr for row in </w:t>
+            </w:r>
+            <w:proofErr w:type="spellStart"/>
+            <w:r>
+              <w:rPr>
+                <w:rFonts w:ascii="Arial" w:hAnsi="Arial" w:cs="Arial"/>
+                <w:sz w:val="24"/>
+                <w:szCs w:val="24"/>
+              </w:rPr>
+              <w:t>field.overflow_value</w:t>
+            </w:r>
+            <w:proofErr w:type="spellEnd"/>
+            <w:r>
+              <w:rPr>
+                <w:rFonts w:ascii="Arial" w:hAnsi="Arial" w:cs="Arial"/>
+                <w:sz w:val="24"/>
+                <w:szCs w:val="24"/>
+              </w:rPr>
+              <w:t>() %}</w:t>
             </w:r>
           </w:p>
         </w:tc>
@@ -2875,7 +5396,43 @@
                 <w:sz w:val="24"/>
                 <w:szCs w:val="24"/>
               </w:rPr>
-              <w:t>{%tc for column in field.columns() %}</w:t>
+              <w:t>{%</w:t>
+            </w:r>
+            <w:proofErr w:type="spellStart"/>
+            <w:r>
+              <w:rPr>
+                <w:rFonts w:ascii="Arial" w:hAnsi="Arial" w:cs="Arial"/>
+                <w:sz w:val="24"/>
+                <w:szCs w:val="24"/>
+              </w:rPr>
+              <w:t>tc</w:t>
+            </w:r>
+            <w:proofErr w:type="spellEnd"/>
+            <w:r>
+              <w:rPr>
+                <w:rFonts w:ascii="Arial" w:hAnsi="Arial" w:cs="Arial"/>
+                <w:sz w:val="24"/>
+                <w:szCs w:val="24"/>
+              </w:rPr>
+              <w:t xml:space="preserve"> for column in </w:t>
+            </w:r>
+            <w:proofErr w:type="spellStart"/>
+            <w:r>
+              <w:rPr>
+                <w:rFonts w:ascii="Arial" w:hAnsi="Arial" w:cs="Arial"/>
+                <w:sz w:val="24"/>
+                <w:szCs w:val="24"/>
+              </w:rPr>
+              <w:t>field.columns</w:t>
+            </w:r>
+            <w:proofErr w:type="spellEnd"/>
+            <w:r>
+              <w:rPr>
+                <w:rFonts w:ascii="Arial" w:hAnsi="Arial" w:cs="Arial"/>
+                <w:sz w:val="24"/>
+                <w:szCs w:val="24"/>
+              </w:rPr>
+              <w:t>() %}</w:t>
             </w:r>
           </w:p>
         </w:tc>
@@ -2897,7 +5454,25 @@
                 <w:sz w:val="24"/>
                 <w:szCs w:val="24"/>
               </w:rPr>
-              <w:t>{{ safeattr(row, key(column)) }}</w:t>
+              <w:t xml:space="preserve">{{ </w:t>
+            </w:r>
+            <w:proofErr w:type="spellStart"/>
+            <w:r>
+              <w:rPr>
+                <w:rFonts w:ascii="Arial" w:hAnsi="Arial" w:cs="Arial"/>
+                <w:sz w:val="24"/>
+                <w:szCs w:val="24"/>
+              </w:rPr>
+              <w:t>safeattr</w:t>
+            </w:r>
+            <w:proofErr w:type="spellEnd"/>
+            <w:r>
+              <w:rPr>
+                <w:rFonts w:ascii="Arial" w:hAnsi="Arial" w:cs="Arial"/>
+                <w:sz w:val="24"/>
+                <w:szCs w:val="24"/>
+              </w:rPr>
+              <w:t>(row, key(column)) }}</w:t>
             </w:r>
           </w:p>
         </w:tc>
@@ -2919,7 +5494,43 @@
                 <w:sz w:val="24"/>
                 <w:szCs w:val="24"/>
               </w:rPr>
-              <w:t>{%tc endfor %}</w:t>
+              <w:t>{%</w:t>
+            </w:r>
+            <w:proofErr w:type="spellStart"/>
+            <w:r>
+              <w:rPr>
+                <w:rFonts w:ascii="Arial" w:hAnsi="Arial" w:cs="Arial"/>
+                <w:sz w:val="24"/>
+                <w:szCs w:val="24"/>
+              </w:rPr>
+              <w:t>tc</w:t>
+            </w:r>
+            <w:proofErr w:type="spellEnd"/>
+            <w:r>
+              <w:rPr>
+                <w:rFonts w:ascii="Arial" w:hAnsi="Arial" w:cs="Arial"/>
+                <w:sz w:val="24"/>
+                <w:szCs w:val="24"/>
+              </w:rPr>
+              <w:t xml:space="preserve"> </w:t>
+            </w:r>
+            <w:proofErr w:type="spellStart"/>
+            <w:r>
+              <w:rPr>
+                <w:rFonts w:ascii="Arial" w:hAnsi="Arial" w:cs="Arial"/>
+                <w:sz w:val="24"/>
+                <w:szCs w:val="24"/>
+              </w:rPr>
+              <w:t>endfor</w:t>
+            </w:r>
+            <w:proofErr w:type="spellEnd"/>
+            <w:r>
+              <w:rPr>
+                <w:rFonts w:ascii="Arial" w:hAnsi="Arial" w:cs="Arial"/>
+                <w:sz w:val="24"/>
+                <w:szCs w:val="24"/>
+              </w:rPr>
+              <w:t xml:space="preserve"> %}</w:t>
             </w:r>
           </w:p>
         </w:tc>
@@ -2943,7 +5554,25 @@
                 <w:sz w:val="24"/>
                 <w:szCs w:val="24"/>
               </w:rPr>
-              <w:t>{%tr endfor %}</w:t>
+              <w:t xml:space="preserve">{%tr </w:t>
+            </w:r>
+            <w:proofErr w:type="spellStart"/>
+            <w:r>
+              <w:rPr>
+                <w:rFonts w:ascii="Arial" w:hAnsi="Arial" w:cs="Arial"/>
+                <w:sz w:val="24"/>
+                <w:szCs w:val="24"/>
+              </w:rPr>
+              <w:t>endfor</w:t>
+            </w:r>
+            <w:proofErr w:type="spellEnd"/>
+            <w:r>
+              <w:rPr>
+                <w:rFonts w:ascii="Arial" w:hAnsi="Arial" w:cs="Arial"/>
+                <w:sz w:val="24"/>
+                <w:szCs w:val="24"/>
+              </w:rPr>
+              <w:t xml:space="preserve"> %}</w:t>
             </w:r>
           </w:p>
         </w:tc>
@@ -3000,7 +5629,43 @@
           <w:sz w:val="24"/>
           <w:szCs w:val="24"/>
         </w:rPr>
-        <w:t>{%p elif field.is_list() %}</w:t>
+        <w:t xml:space="preserve">{%p </w:t>
+      </w:r>
+      <w:proofErr w:type="spellStart"/>
+      <w:r>
+        <w:rPr>
+          <w:rFonts w:ascii="Arial" w:hAnsi="Arial" w:cs="Arial"/>
+          <w:sz w:val="24"/>
+          <w:szCs w:val="24"/>
+        </w:rPr>
+        <w:t>elif</w:t>
+      </w:r>
+      <w:proofErr w:type="spellEnd"/>
+      <w:r>
+        <w:rPr>
+          <w:rFonts w:ascii="Arial" w:hAnsi="Arial" w:cs="Arial"/>
+          <w:sz w:val="24"/>
+          <w:szCs w:val="24"/>
+        </w:rPr>
+        <w:t xml:space="preserve"> </w:t>
+      </w:r>
+      <w:proofErr w:type="spellStart"/>
+      <w:r>
+        <w:rPr>
+          <w:rFonts w:ascii="Arial" w:hAnsi="Arial" w:cs="Arial"/>
+          <w:sz w:val="24"/>
+          <w:szCs w:val="24"/>
+        </w:rPr>
+        <w:t>field.is_list</w:t>
+      </w:r>
+      <w:proofErr w:type="spellEnd"/>
+      <w:r>
+        <w:rPr>
+          <w:rFonts w:ascii="Arial" w:hAnsi="Arial" w:cs="Arial"/>
+          <w:sz w:val="24"/>
+          <w:szCs w:val="24"/>
+        </w:rPr>
+        <w:t>() %}</w:t>
       </w:r>
     </w:p>
     <w:p>
@@ -3027,7 +5692,26 @@
           <w:sz w:val="24"/>
           <w:szCs w:val="24"/>
         </w:rPr>
-        <w:t>{{ field.label }}</w:t>
+        <w:lastRenderedPageBreak/>
+        <w:t xml:space="preserve">{{ </w:t>
+      </w:r>
+      <w:proofErr w:type="spellStart"/>
+      <w:r>
+        <w:rPr>
+          <w:rFonts w:ascii="Arial" w:hAnsi="Arial" w:cs="Arial"/>
+          <w:sz w:val="24"/>
+          <w:szCs w:val="24"/>
+        </w:rPr>
+        <w:t>field.label</w:t>
+      </w:r>
+      <w:proofErr w:type="spellEnd"/>
+      <w:r>
+        <w:rPr>
+          <w:rFonts w:ascii="Arial" w:hAnsi="Arial" w:cs="Arial"/>
+          <w:sz w:val="24"/>
+          <w:szCs w:val="24"/>
+        </w:rPr>
+        <w:t xml:space="preserve"> }}</w:t>
       </w:r>
     </w:p>
     <w:p>
@@ -3049,7 +5733,25 @@
           <w:sz w:val="24"/>
           <w:szCs w:val="24"/>
         </w:rPr>
-        <w:t>{%p for item in field.overflow_value() %}</w:t>
+        <w:t xml:space="preserve">{%p for item in </w:t>
+      </w:r>
+      <w:proofErr w:type="spellStart"/>
+      <w:r>
+        <w:rPr>
+          <w:rFonts w:ascii="Arial" w:hAnsi="Arial" w:cs="Arial"/>
+          <w:sz w:val="24"/>
+          <w:szCs w:val="24"/>
+        </w:rPr>
+        <w:t>field.overflow_value</w:t>
+      </w:r>
+      <w:proofErr w:type="spellEnd"/>
+      <w:r>
+        <w:rPr>
+          <w:rFonts w:ascii="Arial" w:hAnsi="Arial" w:cs="Arial"/>
+          <w:sz w:val="24"/>
+          <w:szCs w:val="24"/>
+        </w:rPr>
+        <w:t>() %}</w:t>
       </w:r>
     </w:p>
     <w:p>
@@ -3093,7 +5795,25 @@
           <w:sz w:val="24"/>
           <w:szCs w:val="24"/>
         </w:rPr>
-        <w:t>{%p endfor %}</w:t>
+        <w:t xml:space="preserve">{%p </w:t>
+      </w:r>
+      <w:proofErr w:type="spellStart"/>
+      <w:r>
+        <w:rPr>
+          <w:rFonts w:ascii="Arial" w:hAnsi="Arial" w:cs="Arial"/>
+          <w:sz w:val="24"/>
+          <w:szCs w:val="24"/>
+        </w:rPr>
+        <w:t>endfor</w:t>
+      </w:r>
+      <w:proofErr w:type="spellEnd"/>
+      <w:r>
+        <w:rPr>
+          <w:rFonts w:ascii="Arial" w:hAnsi="Arial" w:cs="Arial"/>
+          <w:sz w:val="24"/>
+          <w:szCs w:val="24"/>
+        </w:rPr>
+        <w:t xml:space="preserve"> %}</w:t>
       </w:r>
     </w:p>
     <w:p>
@@ -3137,15 +5857,89 @@
           <w:sz w:val="24"/>
           <w:szCs w:val="24"/>
         </w:rPr>
-        <w:t>{{ field.label }}</w:t>
-      </w:r>
-      <w:r>
-        <w:rPr>
-          <w:rFonts w:ascii="Arial" w:hAnsi="Arial" w:cs="Arial"/>
-          <w:sz w:val="24"/>
-          <w:szCs w:val="24"/>
-        </w:rPr>
-        <w:t>: {{ field.overflow_value(overflow_message= RFAaffidavit.default_overflow_message) }}</w:t>
+        <w:t xml:space="preserve">{{ </w:t>
+      </w:r>
+      <w:proofErr w:type="spellStart"/>
+      <w:r>
+        <w:rPr>
+          <w:rFonts w:ascii="Arial" w:hAnsi="Arial" w:cs="Arial"/>
+          <w:b/>
+          <w:sz w:val="24"/>
+          <w:szCs w:val="24"/>
+        </w:rPr>
+        <w:t>field.label</w:t>
+      </w:r>
+      <w:proofErr w:type="spellEnd"/>
+      <w:r>
+        <w:rPr>
+          <w:rFonts w:ascii="Arial" w:hAnsi="Arial" w:cs="Arial"/>
+          <w:b/>
+          <w:sz w:val="24"/>
+          <w:szCs w:val="24"/>
+        </w:rPr>
+        <w:t xml:space="preserve"> }}</w:t>
+      </w:r>
+      <w:r>
+        <w:rPr>
+          <w:rFonts w:ascii="Arial" w:hAnsi="Arial" w:cs="Arial"/>
+          <w:sz w:val="24"/>
+          <w:szCs w:val="24"/>
+        </w:rPr>
+        <w:t xml:space="preserve">: {{ </w:t>
+      </w:r>
+      <w:proofErr w:type="spellStart"/>
+      <w:r>
+        <w:rPr>
+          <w:rFonts w:ascii="Arial" w:hAnsi="Arial" w:cs="Arial"/>
+          <w:sz w:val="24"/>
+          <w:szCs w:val="24"/>
+        </w:rPr>
+        <w:t>field.overflow_value</w:t>
+      </w:r>
+      <w:proofErr w:type="spellEnd"/>
+      <w:r>
+        <w:rPr>
+          <w:rFonts w:ascii="Arial" w:hAnsi="Arial" w:cs="Arial"/>
+          <w:sz w:val="24"/>
+          <w:szCs w:val="24"/>
+        </w:rPr>
+        <w:t>(</w:t>
+      </w:r>
+      <w:proofErr w:type="spellStart"/>
+      <w:r>
+        <w:rPr>
+          <w:rFonts w:ascii="Arial" w:hAnsi="Arial" w:cs="Arial"/>
+          <w:sz w:val="24"/>
+          <w:szCs w:val="24"/>
+        </w:rPr>
+        <w:t>overflow_message</w:t>
+      </w:r>
+      <w:proofErr w:type="spellEnd"/>
+      <w:r>
+        <w:rPr>
+          <w:rFonts w:ascii="Arial" w:hAnsi="Arial" w:cs="Arial"/>
+          <w:sz w:val="24"/>
+          <w:szCs w:val="24"/>
+        </w:rPr>
+        <w:t xml:space="preserve">= </w:t>
+      </w:r>
+      <w:proofErr w:type="spellStart"/>
+      <w:r>
+        <w:rPr>
+          <w:rFonts w:ascii="Arial" w:hAnsi="Arial" w:cs="Arial"/>
+          <w:sz w:val="24"/>
+          <w:szCs w:val="24"/>
+        </w:rPr>
+        <w:t>RFAaffidavit.default_overflow_message</w:t>
+      </w:r>
+      <w:proofErr w:type="spellEnd"/>
+      <w:r>
+        <w:rPr>
+          <w:rFonts w:ascii="Arial" w:hAnsi="Arial" w:cs="Arial"/>
+          <w:sz w:val="24"/>
+          <w:szCs w:val="24"/>
+        </w:rPr>
+        <w:t>) }}</w:t>
       </w:r>
     </w:p>
     <w:p>
@@ -3179,7 +5973,25 @@
           <w:sz w:val="24"/>
           <w:szCs w:val="24"/>
         </w:rPr>
-        <w:t>{%p endfor %}</w:t>
+        <w:t xml:space="preserve">{%p </w:t>
+      </w:r>
+      <w:proofErr w:type="spellStart"/>
+      <w:r>
+        <w:rPr>
+          <w:rFonts w:ascii="Arial" w:hAnsi="Arial" w:cs="Arial"/>
+          <w:sz w:val="24"/>
+          <w:szCs w:val="24"/>
+        </w:rPr>
+        <w:t>endfor</w:t>
+      </w:r>
+      <w:proofErr w:type="spellEnd"/>
+      <w:r>
+        <w:rPr>
+          <w:rFonts w:ascii="Arial" w:hAnsi="Arial" w:cs="Arial"/>
+          <w:sz w:val="24"/>
+          <w:szCs w:val="24"/>
+        </w:rPr>
+        <w:t xml:space="preserve"> %}</w:t>
       </w:r>
     </w:p>
     <w:p>
@@ -3219,14 +6031,15 @@
 </file>
 
 <file path=word/numbering.xml><?xml version="1.0" encoding="utf-8"?>
-<w:numbering xmlns:wpc="http://schemas.microsoft.com/office/word/2010/wordprocessingCanvas" xmlns:cx="http://schemas.microsoft.com/office/drawing/2014/chartex" xmlns:cx1="http://schemas.microsoft.com/office/drawing/2015/9/8/chartex" xmlns:cx2="http://schemas.microsoft.com/office/drawing/2015/10/21/chartex" xmlns:cx3="http://schemas.microsoft.com/office/drawing/2016/5/9/chartex" xmlns:cx4="http://schemas.microsoft.com/office/drawing/2016/5/10/chartex" xmlns:cx5="http://schemas.microsoft.com/office/drawing/2016/5/11/chartex" xmlns:cx6="http://schemas.microsoft.com/office/drawing/2016/5/12/chartex" xmlns:cx7="http://schemas.microsoft.com/office/drawing/2016/5/13/chartex" xmlns:cx8="http://schemas.microsoft.com/office/drawing/2016/5/14/chartex" xmlns:mc="http://schemas.openxmlformats.org/markup-compatibility/2006" xmlns:aink="http://schemas.microsoft.com/office/drawing/2016/ink" xmlns:am3d="http://schemas.microsoft.com/office/drawing/2017/model3d" xmlns:o="urn:schemas-microsoft-com:office:office" xmlns:oel="http://schemas.microsoft.com/office/2019/extlst" xmlns:r="http://schemas.openxmlformats.org/officeDocument/2006/relationships" xmlns:m="http://schemas.openxmlformats.org/officeDocument/2006/math" xmlns:v="urn:schemas-microsoft-com:vml" xmlns:wp14="http://schemas.microsoft.com/office/word/2010/wordprocessingDrawing" xmlns:wp="http://schemas.openxmlformats.org/drawingml/2006/wordprocessingDrawing" xmlns:w10="urn:schemas-microsoft-com:office:word" xmlns:w="http://schemas.openxmlformats.org/wordprocessingml/2006/main" xmlns:w14="http://schemas.microsoft.com/office/word/2010/wordml" xmlns:w15="http://schemas.microsoft.com/office/word/2012/wordml" xmlns:w16cex="http://schemas.microsoft.com/office/word/2018/wordml/cex" xmlns:w16cid="http://schemas.microsoft.com/office/word/2016/wordml/cid" xmlns:w16="http://schemas.microsoft.com/office/word/2018/wordml" xmlns:w16du="http://schemas.microsoft.com/office/word/2023/wordml/word16du" xmlns:w16sdtdh="http://schemas.microsoft.com/office/word/2020/wordml/sdtdatahash" xmlns:w16sdtfl="http://schemas.microsoft.com/office/word/2024/wordml/sdtformatlock" xmlns:w16se="http://schemas.microsoft.com/office/word/2015/wordml/symex" xmlns:wpg="http://schemas.microsoft.com/office/word/2010/wordprocessingGroup" xmlns:wpi="http://schemas.microsoft.com/office/word/2010/wordprocessingInk" xmlns:wne="http://schemas.microsoft.com/office/word/2006/wordml" xmlns:wps="http://schemas.microsoft.com/office/word/2010/wordprocessingShape" mc:Ignorable="w14 w15 w16se w16cid w16 w16cex w16sdtdh w16sdtfl w16du wp14">
+<w:numbering xmlns:wpc="http://schemas.microsoft.com/office/word/2010/wordprocessingCanvas" xmlns:cx="http://schemas.microsoft.com/office/drawing/2014/chartex" xmlns:cx1="http://schemas.microsoft.com/office/drawing/2015/9/8/chartex" xmlns:cx2="http://schemas.microsoft.com/office/drawing/2015/10/21/chartex" xmlns:cx3="http://schemas.microsoft.com/office/drawing/2016/5/9/chartex" xmlns:cx4="http://schemas.microsoft.com/office/drawing/2016/5/10/chartex" xmlns:cx5="http://schemas.microsoft.com/office/drawing/2016/5/11/chartex" xmlns:cx6="http://schemas.microsoft.com/office/drawing/2016/5/12/chartex" xmlns:cx7="http://schemas.microsoft.com/office/drawing/2016/5/13/chartex" xmlns:cx8="http://schemas.microsoft.com/office/drawing/2016/5/14/chartex" xmlns:mc="http://schemas.openxmlformats.org/markup-compatibility/2006" xmlns:aink="http://schemas.microsoft.com/office/drawing/2016/ink" xmlns:am3d="http://schemas.microsoft.com/office/drawing/2017/model3d" xmlns:o="urn:schemas-microsoft-com:office:office" xmlns:oel="http://schemas.microsoft.com/office/2019/extlst" xmlns:r="http://schemas.openxmlformats.org/officeDocument/2006/relationships" xmlns:m="http://schemas.openxmlformats.org/officeDocument/2006/math" xmlns:v="urn:schemas-microsoft-com:vml" xmlns:wp14="http://schemas.microsoft.com/office/word/2010/wordprocessingDrawing" xmlns:wp="http://schemas.openxmlformats.org/drawingml/2006/wordprocessingDrawing" xmlns:w10="urn:schemas-microsoft-com:office:word" xmlns:w="http://schemas.openxmlformats.org/wordprocessingml/2006/main" xmlns:w14="http://schemas.microsoft.com/office/word/2010/wordml" xmlns:w15="http://schemas.microsoft.com/office/word/2012/wordml" xmlns:w16cei="http://schemas.microsoft.com/office/word/2026/wordml/cei" xmlns:w16cex="http://schemas.microsoft.com/office/word/2018/wordml/cex" xmlns:w16cid="http://schemas.microsoft.com/office/word/2016/wordml/cid" xmlns:w16="http://schemas.microsoft.com/office/word/2018/wordml" xmlns:w16du="http://schemas.microsoft.com/office/word/2023/wordml/word16du" xmlns:w16sdtdh="http://schemas.microsoft.com/office/word/2020/wordml/sdtdatahash" xmlns:w16sdtfl="http://schemas.microsoft.com/office/word/2024/wordml/sdtformatlock" xmlns:w16se="http://schemas.microsoft.com/office/word/2015/wordml/symex" xmlns:wpg="http://schemas.microsoft.com/office/word/2010/wordprocessingGroup" xmlns:wpi="http://schemas.microsoft.com/office/word/2010/wordprocessingInk" xmlns:wne="http://schemas.microsoft.com/office/word/2006/wordml" xmlns:wps="http://schemas.microsoft.com/office/word/2010/wordprocessingShape" mc:Ignorable="w14 w15 w16se w16cid w16 w16cex w16sdtdh w16sdtfl w16du wp14">
   <w:abstractNum w:abstractNumId="0" w15:restartNumberingAfterBreak="0">
     <w:nsid w:val="0D5A6C12"/>
     <w:multiLevelType w:val="multilevel"/>
-    <w:tmpl w:val="7BD4E736"/>
+    <w:tmpl w:val="510CC516"/>
     <w:lvl w:ilvl="0">
       <w:start w:val="1"/>
       <w:numFmt w:val="none"/>
+      <w:pStyle w:val="Heading1"/>
       <w:suff w:val="nothing"/>
       <w:lvlText w:val=""/>
       <w:lvlJc w:val="left"/>
@@ -3434,7 +6247,6 @@
     <w:lvl w:ilvl="0">
       <w:start w:val="1"/>
       <w:numFmt w:val="none"/>
-      <w:pStyle w:val="Heading1"/>
       <w:suff w:val="nothing"/>
       <w:lvlText w:val=""/>
       <w:lvlJc w:val="left"/>
@@ -3942,22 +6754,23 @@
     <w:next w:val="BodyText"/>
     <w:link w:val="Heading1Char"/>
     <w:qFormat/>
-    <w:rsid w:val="002B3CC8"/>
+    <w:rsid w:val="00EA7030"/>
     <w:pPr>
       <w:keepNext/>
       <w:numPr>
-        <w:numId w:val="1"/>
+        <w:numId w:val="2"/>
       </w:numPr>
       <w:spacing w:before="240" w:after="120" w:line="240" w:lineRule="auto"/>
+      <w:jc w:val="center"/>
       <w:outlineLvl w:val="0"/>
     </w:pPr>
     <w:rPr>
-      <w:rFonts w:ascii="Liberation Sans" w:eastAsia="Microsoft YaHei" w:hAnsi="Liberation Sans" w:cs="Lucida Sans"/>
+      <w:rFonts w:ascii="Arial" w:eastAsia="Microsoft YaHei" w:hAnsi="Arial" w:cs="Arial"/>
       <w:b/>
       <w:bCs/>
       <w:kern w:val="2"/>
-      <w:sz w:val="36"/>
-      <w:szCs w:val="36"/>
+      <w:sz w:val="32"/>
+      <w:szCs w:val="32"/>
       <w:lang w:eastAsia="zh-CN" w:bidi="hi-IN"/>
     </w:rPr>
   </w:style>
@@ -4018,14 +6831,14 @@
     <w:name w:val="Heading 1 Char"/>
     <w:basedOn w:val="DefaultParagraphFont"/>
     <w:link w:val="Heading1"/>
-    <w:rsid w:val="002B3CC8"/>
+    <w:rsid w:val="00EA7030"/>
     <w:rPr>
-      <w:rFonts w:ascii="Liberation Sans" w:eastAsia="Microsoft YaHei" w:hAnsi="Liberation Sans" w:cs="Lucida Sans"/>
+      <w:rFonts w:ascii="Arial" w:eastAsia="Microsoft YaHei" w:hAnsi="Arial" w:cs="Arial"/>
       <w:b/>
       <w:bCs/>
       <w:kern w:val="2"/>
-      <w:sz w:val="36"/>
-      <w:szCs w:val="36"/>
+      <w:sz w:val="32"/>
+      <w:szCs w:val="32"/>
       <w:lang w:eastAsia="zh-CN" w:bidi="hi-IN"/>
     </w:rPr>
   </w:style>

</xml_diff>